<commit_message>
docs: insert both backend Data Input and frontend Evidence screenshots directly inside the CD5 table cells
</commit_message>
<xml_diff>
--- a/Draft CD5.docx
+++ b/Draft CD5.docx
@@ -17664,8 +17664,51 @@
             <w:tcW w:w="5617" w:type="dxa"/>
           </w:tcPr>
           <w:p>
-            <w:r>
-              <w:t>Payload: { username: "...", passwords: "...", email: "...", role: "admin|doctor|patient" }</w:t>
+            <w:pPr>
+              <w:pStyle w:val="DaftarParagraf"/>
+              <w:spacing w:line="360" w:lineRule="auto" w:before="80" w:after="80"/>
+              <w:ind w:left="0"/>
+              <w:jc w:val="center"/>
+              <w:rPr>
+                <w:color w:val="000000"/>
+                <w:szCs w:val="24"/>
+                <w:lang w:val="en-ID"/>
+              </w:rPr>
+            </w:pPr>
+            <w:r/>
+            <w:r>
+              <w:drawing>
+                <wp:inline xmlns:a="http://schemas.openxmlformats.org/drawingml/2006/main" xmlns:pic="http://schemas.openxmlformats.org/drawingml/2006/picture">
+                  <wp:extent cx="4389120" cy="2217420"/>
+                  <wp:docPr id="2011434102" name="Picture 2011434102"/>
+                  <wp:cNvGraphicFramePr>
+                    <a:graphicFrameLocks noChangeAspect="1"/>
+                  </wp:cNvGraphicFramePr>
+                  <a:graphic>
+                    <a:graphicData uri="http://schemas.openxmlformats.org/drawingml/2006/picture">
+                      <pic:pic>
+                        <pic:nvPicPr>
+                          <pic:cNvPr id="0" name="backend_fr01_1781609802322.png"/>
+                          <pic:cNvPicPr/>
+                        </pic:nvPicPr>
+                        <pic:blipFill>
+                          <a:blip r:embed="rId20"/>
+                          <a:stretch>
+                            <a:fillRect/>
+                          </a:stretch>
+                        </pic:blipFill>
+                        <pic:spPr>
+                          <a:xfrm>
+                            <a:off x="0" y="0"/>
+                            <a:ext cx="4389120" cy="2217420"/>
+                          </a:xfrm>
+                          <a:prstGeom prst="rect"/>
+                        </pic:spPr>
+                      </pic:pic>
+                    </a:graphicData>
+                  </a:graphic>
+                </wp:inline>
+              </w:drawing>
             </w:r>
           </w:p>
         </w:tc>
@@ -17756,66 +17799,56 @@
             <w:tcW w:w="5617" w:type="dxa"/>
           </w:tcPr>
           <w:p>
-            <w:r>
-              <w:t>Gambar 5.1 Evidence Pengujian Pendaftaran Akun, Login, &amp; Hak Akses</w:t>
+            <w:pPr>
+              <w:pStyle w:val="DaftarParagraf"/>
+              <w:spacing w:line="360" w:lineRule="auto" w:before="80" w:after="80"/>
+              <w:ind w:left="0"/>
+              <w:jc w:val="center"/>
+              <w:rPr>
+                <w:color w:val="000000"/>
+                <w:szCs w:val="24"/>
+                <w:lang w:val="en-ID"/>
+              </w:rPr>
+            </w:pPr>
+            <w:r/>
+            <w:r>
+              <w:drawing>
+                <wp:inline xmlns:a="http://schemas.openxmlformats.org/drawingml/2006/main" xmlns:pic="http://schemas.openxmlformats.org/drawingml/2006/picture">
+                  <wp:extent cx="4389120" cy="2265426"/>
+                  <wp:docPr id="2011434103" name="Picture 2011434103"/>
+                  <wp:cNvGraphicFramePr>
+                    <a:graphicFrameLocks noChangeAspect="1"/>
+                  </wp:cNvGraphicFramePr>
+                  <a:graphic>
+                    <a:graphicData uri="http://schemas.openxmlformats.org/drawingml/2006/picture">
+                      <pic:pic>
+                        <pic:nvPicPr>
+                          <pic:cNvPr id="0" name="01_login_staf_sukses_1781491070641.png"/>
+                          <pic:cNvPicPr/>
+                        </pic:nvPicPr>
+                        <pic:blipFill>
+                          <a:blip r:embed="rId21"/>
+                          <a:stretch>
+                            <a:fillRect/>
+                          </a:stretch>
+                        </pic:blipFill>
+                        <pic:spPr>
+                          <a:xfrm>
+                            <a:off x="0" y="0"/>
+                            <a:ext cx="4389120" cy="2265426"/>
+                          </a:xfrm>
+                          <a:prstGeom prst="rect"/>
+                        </pic:spPr>
+                      </pic:pic>
+                    </a:graphicData>
+                  </a:graphic>
+                </wp:inline>
+              </w:drawing>
             </w:r>
           </w:p>
         </w:tc>
       </w:tr>
     </w:tbl>
-    <w:p>
-      <w:pPr>
-        <w:spacing w:before="240" w:after="80"/>
-        <w:jc w:val="center"/>
-      </w:pPr>
-      <w:r>
-        <w:drawing>
-          <wp:inline xmlns:a="http://schemas.openxmlformats.org/drawingml/2006/main" xmlns:pic="http://schemas.openxmlformats.org/drawingml/2006/picture">
-            <wp:extent cx="5303520" cy="2737390"/>
-            <wp:docPr id="2011434102" name="Picture 2011434102"/>
-            <wp:cNvGraphicFramePr>
-              <a:graphicFrameLocks noChangeAspect="1"/>
-            </wp:cNvGraphicFramePr>
-            <a:graphic>
-              <a:graphicData uri="http://schemas.openxmlformats.org/drawingml/2006/picture">
-                <pic:pic>
-                  <pic:nvPicPr>
-                    <pic:cNvPr id="0" name="01_login_staf_sukses_1781491070641.png"/>
-                    <pic:cNvPicPr/>
-                  </pic:nvPicPr>
-                  <pic:blipFill>
-                    <a:blip r:embed="rId20"/>
-                    <a:stretch>
-                      <a:fillRect/>
-                    </a:stretch>
-                  </pic:blipFill>
-                  <pic:spPr>
-                    <a:xfrm>
-                      <a:off x="0" y="0"/>
-                      <a:ext cx="5303520" cy="2737390"/>
-                    </a:xfrm>
-                    <a:prstGeom prst="rect"/>
-                  </pic:spPr>
-                </pic:pic>
-              </a:graphicData>
-            </a:graphic>
-          </wp:inline>
-        </w:drawing>
-      </w:r>
-    </w:p>
-    <w:p>
-      <w:pPr>
-        <w:spacing w:before="120" w:after="240"/>
-        <w:jc w:val="center"/>
-      </w:pPr>
-      <w:r>
-        <w:rPr>
-          <w:b/>
-          <w:sz w:val="22"/>
-        </w:rPr>
-        <w:t>Gambar 5.1 Evidence Pengujian Pendaftaran Akun, Login, &amp; Hak Akses</w:t>
-      </w:r>
-    </w:p>
     <w:p>
       <w:pPr>
         <w:pStyle w:val="DaftarParagraf"/>
@@ -18079,8 +18112,51 @@
             <w:tcW w:w="5617" w:type="dxa"/>
           </w:tcPr>
           <w:p>
-            <w:r>
-              <w:t>Payload: { id_klinik: int, tanggal_kunjungan: date, id_jadwal: int, keluhan_utama: text, kuesioner: array[10], file_citra: binary }</w:t>
+            <w:pPr>
+              <w:pStyle w:val="DaftarParagraf"/>
+              <w:spacing w:line="360" w:lineRule="auto" w:before="80" w:after="80"/>
+              <w:ind w:left="0"/>
+              <w:jc w:val="center"/>
+              <w:rPr>
+                <w:color w:val="000000"/>
+                <w:szCs w:val="24"/>
+                <w:lang w:val="en-ID"/>
+              </w:rPr>
+            </w:pPr>
+            <w:r/>
+            <w:r>
+              <w:drawing>
+                <wp:inline xmlns:a="http://schemas.openxmlformats.org/drawingml/2006/main" xmlns:pic="http://schemas.openxmlformats.org/drawingml/2006/picture">
+                  <wp:extent cx="4389120" cy="2217420"/>
+                  <wp:docPr id="2011434104" name="Picture 2011434104"/>
+                  <wp:cNvGraphicFramePr>
+                    <a:graphicFrameLocks noChangeAspect="1"/>
+                  </wp:cNvGraphicFramePr>
+                  <a:graphic>
+                    <a:graphicData uri="http://schemas.openxmlformats.org/drawingml/2006/picture">
+                      <pic:pic>
+                        <pic:nvPicPr>
+                          <pic:cNvPr id="0" name="backend_fr02_1781609812101.png"/>
+                          <pic:cNvPicPr/>
+                        </pic:nvPicPr>
+                        <pic:blipFill>
+                          <a:blip r:embed="rId22"/>
+                          <a:stretch>
+                            <a:fillRect/>
+                          </a:stretch>
+                        </pic:blipFill>
+                        <pic:spPr>
+                          <a:xfrm>
+                            <a:off x="0" y="0"/>
+                            <a:ext cx="4389120" cy="2217420"/>
+                          </a:xfrm>
+                          <a:prstGeom prst="rect"/>
+                        </pic:spPr>
+                      </pic:pic>
+                    </a:graphicData>
+                  </a:graphic>
+                </wp:inline>
+              </w:drawing>
             </w:r>
           </w:p>
         </w:tc>
@@ -18171,66 +18247,56 @@
             <w:tcW w:w="5617" w:type="dxa"/>
           </w:tcPr>
           <w:p>
-            <w:r>
-              <w:t>Gambar 5.2 Evidence Pengujian Appointment Online, Tingkat Urgensi, &amp; AI</w:t>
+            <w:pPr>
+              <w:pStyle w:val="DaftarParagraf"/>
+              <w:spacing w:line="360" w:lineRule="auto" w:before="80" w:after="80"/>
+              <w:ind w:left="0"/>
+              <w:jc w:val="center"/>
+              <w:rPr>
+                <w:color w:val="000000"/>
+                <w:szCs w:val="24"/>
+                <w:lang w:val="en-ID"/>
+              </w:rPr>
+            </w:pPr>
+            <w:r/>
+            <w:r>
+              <w:drawing>
+                <wp:inline xmlns:a="http://schemas.openxmlformats.org/drawingml/2006/main" xmlns:pic="http://schemas.openxmlformats.org/drawingml/2006/picture">
+                  <wp:extent cx="4389120" cy="2265426"/>
+                  <wp:docPr id="2011434105" name="Picture 2011434105"/>
+                  <wp:cNvGraphicFramePr>
+                    <a:graphicFrameLocks noChangeAspect="1"/>
+                  </wp:cNvGraphicFramePr>
+                  <a:graphic>
+                    <a:graphicData uri="http://schemas.openxmlformats.org/drawingml/2006/picture">
+                      <pic:pic>
+                        <pic:nvPicPr>
+                          <pic:cNvPr id="0" name="39_analisis_triage_ai_1781474398266.png"/>
+                          <pic:cNvPicPr/>
+                        </pic:nvPicPr>
+                        <pic:blipFill>
+                          <a:blip r:embed="rId23"/>
+                          <a:stretch>
+                            <a:fillRect/>
+                          </a:stretch>
+                        </pic:blipFill>
+                        <pic:spPr>
+                          <a:xfrm>
+                            <a:off x="0" y="0"/>
+                            <a:ext cx="4389120" cy="2265426"/>
+                          </a:xfrm>
+                          <a:prstGeom prst="rect"/>
+                        </pic:spPr>
+                      </pic:pic>
+                    </a:graphicData>
+                  </a:graphic>
+                </wp:inline>
+              </w:drawing>
             </w:r>
           </w:p>
         </w:tc>
       </w:tr>
     </w:tbl>
-    <w:p>
-      <w:pPr>
-        <w:spacing w:before="240" w:after="80"/>
-        <w:jc w:val="center"/>
-      </w:pPr>
-      <w:r>
-        <w:drawing>
-          <wp:inline xmlns:a="http://schemas.openxmlformats.org/drawingml/2006/main" xmlns:pic="http://schemas.openxmlformats.org/drawingml/2006/picture">
-            <wp:extent cx="5303520" cy="2737390"/>
-            <wp:docPr id="2011434103" name="Picture 2011434103"/>
-            <wp:cNvGraphicFramePr>
-              <a:graphicFrameLocks noChangeAspect="1"/>
-            </wp:cNvGraphicFramePr>
-            <a:graphic>
-              <a:graphicData uri="http://schemas.openxmlformats.org/drawingml/2006/picture">
-                <pic:pic>
-                  <pic:nvPicPr>
-                    <pic:cNvPr id="0" name="39_analisis_triage_ai_1781474398266.png"/>
-                    <pic:cNvPicPr/>
-                  </pic:nvPicPr>
-                  <pic:blipFill>
-                    <a:blip r:embed="rId21"/>
-                    <a:stretch>
-                      <a:fillRect/>
-                    </a:stretch>
-                  </pic:blipFill>
-                  <pic:spPr>
-                    <a:xfrm>
-                      <a:off x="0" y="0"/>
-                      <a:ext cx="5303520" cy="2737390"/>
-                    </a:xfrm>
-                    <a:prstGeom prst="rect"/>
-                  </pic:spPr>
-                </pic:pic>
-              </a:graphicData>
-            </a:graphic>
-          </wp:inline>
-        </w:drawing>
-      </w:r>
-    </w:p>
-    <w:p>
-      <w:pPr>
-        <w:spacing w:before="120" w:after="240"/>
-        <w:jc w:val="center"/>
-      </w:pPr>
-      <w:r>
-        <w:rPr>
-          <w:b/>
-          <w:sz w:val="22"/>
-        </w:rPr>
-        <w:t>Gambar 5.2 Evidence Pengujian Appointment Online, Tingkat Urgensi, &amp; AI</w:t>
-      </w:r>
-    </w:p>
     <w:p>
       <w:pPr>
         <w:pStyle w:val="DaftarParagraf"/>
@@ -18306,6 +18372,87 @@
       <w:pPr>
         <w:pStyle w:val="DaftarParagraf"/>
         <w:spacing w:line="360" w:lineRule="auto"/>
+        <w:ind w:left="851" w:right="661" w:firstLine="447"/>
+        <w:jc w:val="center"/>
+        <w:rPr>
+          <w:i/>
+          <w:iCs/>
+          <w:color w:val="000000"/>
+          <w:sz w:val="20"/>
+          <w:lang w:val="en-ID"/>
+        </w:rPr>
+      </w:pPr>
+      <w:r>
+        <w:rPr>
+          <w:i/>
+          <w:iCs/>
+          <w:color w:val="000000"/>
+          <w:sz w:val="20"/>
+          <w:lang w:val="en-ID"/>
+        </w:rPr>
+        <w:t xml:space="preserve">Gambar 5.1 Evidence </w:t>
+      </w:r>
+      <w:proofErr w:type="spellStart"/>
+      <w:r>
+        <w:rPr>
+          <w:i/>
+          <w:iCs/>
+          <w:color w:val="000000"/>
+          <w:sz w:val="20"/>
+          <w:lang w:val="en-ID"/>
+        </w:rPr>
+        <w:t>Pengujian</w:t>
+      </w:r>
+      <w:proofErr w:type="spellEnd"/>
+      <w:r>
+        <w:rPr>
+          <w:i/>
+          <w:iCs/>
+          <w:color w:val="000000"/>
+          <w:sz w:val="20"/>
+          <w:lang w:val="en-ID"/>
+        </w:rPr>
+        <w:t xml:space="preserve"> </w:t>
+      </w:r>
+      <w:proofErr w:type="spellStart"/>
+      <w:r>
+        <w:rPr>
+          <w:i/>
+          <w:iCs/>
+          <w:color w:val="000000"/>
+          <w:sz w:val="20"/>
+          <w:lang w:val="en-ID"/>
+        </w:rPr>
+        <w:t>Lihat</w:t>
+      </w:r>
+      <w:proofErr w:type="spellEnd"/>
+      <w:r>
+        <w:rPr>
+          <w:i/>
+          <w:iCs/>
+          <w:color w:val="000000"/>
+          <w:sz w:val="20"/>
+          <w:lang w:val="en-ID"/>
+        </w:rPr>
+        <w:t xml:space="preserve"> </w:t>
+      </w:r>
+      <w:proofErr w:type="spellStart"/>
+      <w:r>
+        <w:rPr>
+          <w:i/>
+          <w:iCs/>
+          <w:color w:val="000000"/>
+          <w:sz w:val="20"/>
+          <w:lang w:val="en-ID"/>
+        </w:rPr>
+        <w:t>Antrean</w:t>
+      </w:r>
+      <w:proofErr w:type="spellEnd"/>
+    </w:p>
+    <w:p>
+      <w:pPr>
+        <w:pStyle w:val="DaftarParagraf"/>
+        <w:spacing w:line="360" w:lineRule="auto"/>
         <w:ind w:left="993" w:firstLine="447"/>
         <w:jc w:val="center"/>
         <w:rPr>
@@ -18590,8 +18737,51 @@
             <w:tcW w:w="5617" w:type="dxa"/>
           </w:tcPr>
           <w:p>
-            <w:r>
-              <w:t>Query Params: { id_klinik: int, tanggal: date }</w:t>
+            <w:pPr>
+              <w:pStyle w:val="DaftarParagraf"/>
+              <w:spacing w:line="360" w:lineRule="auto" w:before="80" w:after="80"/>
+              <w:ind w:left="0"/>
+              <w:jc w:val="center"/>
+              <w:rPr>
+                <w:color w:val="000000"/>
+                <w:szCs w:val="24"/>
+                <w:lang w:val="en-ID"/>
+              </w:rPr>
+            </w:pPr>
+            <w:r/>
+            <w:r>
+              <w:drawing>
+                <wp:inline xmlns:a="http://schemas.openxmlformats.org/drawingml/2006/main" xmlns:pic="http://schemas.openxmlformats.org/drawingml/2006/picture">
+                  <wp:extent cx="4389120" cy="2217420"/>
+                  <wp:docPr id="2011434106" name="Picture 2011434106"/>
+                  <wp:cNvGraphicFramePr>
+                    <a:graphicFrameLocks noChangeAspect="1"/>
+                  </wp:cNvGraphicFramePr>
+                  <a:graphic>
+                    <a:graphicData uri="http://schemas.openxmlformats.org/drawingml/2006/picture">
+                      <pic:pic>
+                        <pic:nvPicPr>
+                          <pic:cNvPr id="0" name="backend_fr03_1781609829204.png"/>
+                          <pic:cNvPicPr/>
+                        </pic:nvPicPr>
+                        <pic:blipFill>
+                          <a:blip r:embed="rId24"/>
+                          <a:stretch>
+                            <a:fillRect/>
+                          </a:stretch>
+                        </pic:blipFill>
+                        <pic:spPr>
+                          <a:xfrm>
+                            <a:off x="0" y="0"/>
+                            <a:ext cx="4389120" cy="2217420"/>
+                          </a:xfrm>
+                          <a:prstGeom prst="rect"/>
+                        </pic:spPr>
+                      </pic:pic>
+                    </a:graphicData>
+                  </a:graphic>
+                </wp:inline>
+              </w:drawing>
             </w:r>
           </w:p>
         </w:tc>
@@ -18682,66 +18872,56 @@
             <w:tcW w:w="5617" w:type="dxa"/>
           </w:tcPr>
           <w:p>
-            <w:r>
-              <w:t>Gambar 5.3 Evidence Pengujian Pemantauan Antrean Pasien</w:t>
+            <w:pPr>
+              <w:pStyle w:val="DaftarParagraf"/>
+              <w:spacing w:line="360" w:lineRule="auto" w:before="80" w:after="80"/>
+              <w:ind w:left="0"/>
+              <w:jc w:val="center"/>
+              <w:rPr>
+                <w:color w:val="000000"/>
+                <w:szCs w:val="24"/>
+                <w:lang w:val="en-ID"/>
+              </w:rPr>
+            </w:pPr>
+            <w:r/>
+            <w:r>
+              <w:drawing>
+                <wp:inline xmlns:a="http://schemas.openxmlformats.org/drawingml/2006/main" xmlns:pic="http://schemas.openxmlformats.org/drawingml/2006/picture">
+                  <wp:extent cx="4389120" cy="2265426"/>
+                  <wp:docPr id="2011434107" name="Picture 2011434107"/>
+                  <wp:cNvGraphicFramePr>
+                    <a:graphicFrameLocks noChangeAspect="1"/>
+                  </wp:cNvGraphicFramePr>
+                  <a:graphic>
+                    <a:graphicData uri="http://schemas.openxmlformats.org/drawingml/2006/picture">
+                      <pic:pic>
+                        <pic:nvPicPr>
+                          <pic:cNvPr id="0" name="40_urutan_antrian_dinamis_1781474527553.png"/>
+                          <pic:cNvPicPr/>
+                        </pic:nvPicPr>
+                        <pic:blipFill>
+                          <a:blip r:embed="rId25"/>
+                          <a:stretch>
+                            <a:fillRect/>
+                          </a:stretch>
+                        </pic:blipFill>
+                        <pic:spPr>
+                          <a:xfrm>
+                            <a:off x="0" y="0"/>
+                            <a:ext cx="4389120" cy="2265426"/>
+                          </a:xfrm>
+                          <a:prstGeom prst="rect"/>
+                        </pic:spPr>
+                      </pic:pic>
+                    </a:graphicData>
+                  </a:graphic>
+                </wp:inline>
+              </w:drawing>
             </w:r>
           </w:p>
         </w:tc>
       </w:tr>
     </w:tbl>
-    <w:p>
-      <w:pPr>
-        <w:spacing w:before="240" w:after="80"/>
-        <w:jc w:val="center"/>
-      </w:pPr>
-      <w:r>
-        <w:drawing>
-          <wp:inline xmlns:a="http://schemas.openxmlformats.org/drawingml/2006/main" xmlns:pic="http://schemas.openxmlformats.org/drawingml/2006/picture">
-            <wp:extent cx="5303520" cy="2737390"/>
-            <wp:docPr id="2011434104" name="Picture 2011434104"/>
-            <wp:cNvGraphicFramePr>
-              <a:graphicFrameLocks noChangeAspect="1"/>
-            </wp:cNvGraphicFramePr>
-            <a:graphic>
-              <a:graphicData uri="http://schemas.openxmlformats.org/drawingml/2006/picture">
-                <pic:pic>
-                  <pic:nvPicPr>
-                    <pic:cNvPr id="0" name="40_urutan_antrian_dinamis_1781474527553.png"/>
-                    <pic:cNvPicPr/>
-                  </pic:nvPicPr>
-                  <pic:blipFill>
-                    <a:blip r:embed="rId22"/>
-                    <a:stretch>
-                      <a:fillRect/>
-                    </a:stretch>
-                  </pic:blipFill>
-                  <pic:spPr>
-                    <a:xfrm>
-                      <a:off x="0" y="0"/>
-                      <a:ext cx="5303520" cy="2737390"/>
-                    </a:xfrm>
-                    <a:prstGeom prst="rect"/>
-                  </pic:spPr>
-                </pic:pic>
-              </a:graphicData>
-            </a:graphic>
-          </wp:inline>
-        </w:drawing>
-      </w:r>
-    </w:p>
-    <w:p>
-      <w:pPr>
-        <w:spacing w:before="120" w:after="240"/>
-        <w:jc w:val="center"/>
-      </w:pPr>
-      <w:r>
-        <w:rPr>
-          <w:b/>
-          <w:sz w:val="22"/>
-        </w:rPr>
-        <w:t>Gambar 5.3 Evidence Pengujian Pemantauan Antrean Pasien</w:t>
-      </w:r>
-    </w:p>
     <w:p>
       <w:pPr>
         <w:spacing w:line="360" w:lineRule="auto"/>
@@ -19034,8 +19214,51 @@
             <w:tcW w:w="5617" w:type="dxa"/>
           </w:tcPr>
           <w:p>
-            <w:r>
-              <w:t>Path Params: { id_appointment: int }</w:t>
+            <w:pPr>
+              <w:pStyle w:val="DaftarParagraf"/>
+              <w:spacing w:line="360" w:lineRule="auto" w:before="80" w:after="80"/>
+              <w:ind w:left="0"/>
+              <w:jc w:val="center"/>
+              <w:rPr>
+                <w:color w:val="000000"/>
+                <w:szCs w:val="24"/>
+                <w:lang w:val="en-ID"/>
+              </w:rPr>
+            </w:pPr>
+            <w:r/>
+            <w:r>
+              <w:drawing>
+                <wp:inline xmlns:a="http://schemas.openxmlformats.org/drawingml/2006/main" xmlns:pic="http://schemas.openxmlformats.org/drawingml/2006/picture">
+                  <wp:extent cx="4389120" cy="2217420"/>
+                  <wp:docPr id="2011434108" name="Picture 2011434108"/>
+                  <wp:cNvGraphicFramePr>
+                    <a:graphicFrameLocks noChangeAspect="1"/>
+                  </wp:cNvGraphicFramePr>
+                  <a:graphic>
+                    <a:graphicData uri="http://schemas.openxmlformats.org/drawingml/2006/picture">
+                      <pic:pic>
+                        <pic:nvPicPr>
+                          <pic:cNvPr id="0" name="backend_fr04_1781609835927.png"/>
+                          <pic:cNvPicPr/>
+                        </pic:nvPicPr>
+                        <pic:blipFill>
+                          <a:blip r:embed="rId26"/>
+                          <a:stretch>
+                            <a:fillRect/>
+                          </a:stretch>
+                        </pic:blipFill>
+                        <pic:spPr>
+                          <a:xfrm>
+                            <a:off x="0" y="0"/>
+                            <a:ext cx="4389120" cy="2217420"/>
+                          </a:xfrm>
+                          <a:prstGeom prst="rect"/>
+                        </pic:spPr>
+                      </pic:pic>
+                    </a:graphicData>
+                  </a:graphic>
+                </wp:inline>
+              </w:drawing>
             </w:r>
           </w:p>
         </w:tc>
@@ -19126,66 +19349,56 @@
             <w:tcW w:w="5617" w:type="dxa"/>
           </w:tcPr>
           <w:p>
-            <w:r>
-              <w:t>Gambar 5.4 Evidence Pengujian Detail Pasien oleh Dokter</w:t>
+            <w:pPr>
+              <w:pStyle w:val="DaftarParagraf"/>
+              <w:spacing w:line="360" w:lineRule="auto" w:before="80" w:after="80"/>
+              <w:ind w:left="0"/>
+              <w:jc w:val="center"/>
+              <w:rPr>
+                <w:color w:val="000000"/>
+                <w:szCs w:val="24"/>
+                <w:lang w:val="en-ID"/>
+              </w:rPr>
+            </w:pPr>
+            <w:r/>
+            <w:r>
+              <w:drawing>
+                <wp:inline xmlns:a="http://schemas.openxmlformats.org/drawingml/2006/main" xmlns:pic="http://schemas.openxmlformats.org/drawingml/2006/picture">
+                  <wp:extent cx="4389120" cy="2265426"/>
+                  <wp:docPr id="2011434109" name="Picture 2011434109"/>
+                  <wp:cNvGraphicFramePr>
+                    <a:graphicFrameLocks noChangeAspect="1"/>
+                  </wp:cNvGraphicFramePr>
+                  <a:graphic>
+                    <a:graphicData uri="http://schemas.openxmlformats.org/drawingml/2006/picture">
+                      <pic:pic>
+                        <pic:nvPicPr>
+                          <pic:cNvPr id="0" name="08_triage_dokter_view_1781491110747.png"/>
+                          <pic:cNvPicPr/>
+                        </pic:nvPicPr>
+                        <pic:blipFill>
+                          <a:blip r:embed="rId27"/>
+                          <a:stretch>
+                            <a:fillRect/>
+                          </a:stretch>
+                        </pic:blipFill>
+                        <pic:spPr>
+                          <a:xfrm>
+                            <a:off x="0" y="0"/>
+                            <a:ext cx="4389120" cy="2265426"/>
+                          </a:xfrm>
+                          <a:prstGeom prst="rect"/>
+                        </pic:spPr>
+                      </pic:pic>
+                    </a:graphicData>
+                  </a:graphic>
+                </wp:inline>
+              </w:drawing>
             </w:r>
           </w:p>
         </w:tc>
       </w:tr>
     </w:tbl>
-    <w:p>
-      <w:pPr>
-        <w:spacing w:before="240" w:after="80"/>
-        <w:jc w:val="center"/>
-      </w:pPr>
-      <w:r>
-        <w:drawing>
-          <wp:inline xmlns:a="http://schemas.openxmlformats.org/drawingml/2006/main" xmlns:pic="http://schemas.openxmlformats.org/drawingml/2006/picture">
-            <wp:extent cx="5303520" cy="2737390"/>
-            <wp:docPr id="2011434105" name="Picture 2011434105"/>
-            <wp:cNvGraphicFramePr>
-              <a:graphicFrameLocks noChangeAspect="1"/>
-            </wp:cNvGraphicFramePr>
-            <a:graphic>
-              <a:graphicData uri="http://schemas.openxmlformats.org/drawingml/2006/picture">
-                <pic:pic>
-                  <pic:nvPicPr>
-                    <pic:cNvPr id="0" name="08_triage_dokter_view_1781491110747.png"/>
-                    <pic:cNvPicPr/>
-                  </pic:nvPicPr>
-                  <pic:blipFill>
-                    <a:blip r:embed="rId23"/>
-                    <a:stretch>
-                      <a:fillRect/>
-                    </a:stretch>
-                  </pic:blipFill>
-                  <pic:spPr>
-                    <a:xfrm>
-                      <a:off x="0" y="0"/>
-                      <a:ext cx="5303520" cy="2737390"/>
-                    </a:xfrm>
-                    <a:prstGeom prst="rect"/>
-                  </pic:spPr>
-                </pic:pic>
-              </a:graphicData>
-            </a:graphic>
-          </wp:inline>
-        </w:drawing>
-      </w:r>
-    </w:p>
-    <w:p>
-      <w:pPr>
-        <w:spacing w:before="120" w:after="240"/>
-        <w:jc w:val="center"/>
-      </w:pPr>
-      <w:r>
-        <w:rPr>
-          <w:b/>
-          <w:sz w:val="22"/>
-        </w:rPr>
-        <w:t>Gambar 5.4 Evidence Pengujian Detail Pasien oleh Dokter</w:t>
-      </w:r>
-    </w:p>
     <w:p>
       <w:pPr>
         <w:spacing w:line="360" w:lineRule="auto"/>
@@ -19478,8 +19691,51 @@
             <w:tcW w:w="5617" w:type="dxa"/>
           </w:tcPr>
           <w:p>
-            <w:r>
-              <w:t>Payload: { id_appointment: int, keluhan: text, diagnosis: string(ICD-10), tindakan: string, resep: array[{id_obat, dosis, qty}], odontogram: array[{gigi, kondisi}] }</w:t>
+            <w:pPr>
+              <w:pStyle w:val="DaftarParagraf"/>
+              <w:spacing w:line="360" w:lineRule="auto" w:before="80" w:after="80"/>
+              <w:ind w:left="0"/>
+              <w:jc w:val="center"/>
+              <w:rPr>
+                <w:color w:val="000000"/>
+                <w:szCs w:val="24"/>
+                <w:lang w:val="en-ID"/>
+              </w:rPr>
+            </w:pPr>
+            <w:r/>
+            <w:r>
+              <w:drawing>
+                <wp:inline xmlns:a="http://schemas.openxmlformats.org/drawingml/2006/main" xmlns:pic="http://schemas.openxmlformats.org/drawingml/2006/picture">
+                  <wp:extent cx="4389120" cy="2217420"/>
+                  <wp:docPr id="2011434110" name="Picture 2011434110"/>
+                  <wp:cNvGraphicFramePr>
+                    <a:graphicFrameLocks noChangeAspect="1"/>
+                  </wp:cNvGraphicFramePr>
+                  <a:graphic>
+                    <a:graphicData uri="http://schemas.openxmlformats.org/drawingml/2006/picture">
+                      <pic:pic>
+                        <pic:nvPicPr>
+                          <pic:cNvPr id="0" name="backend_fr05_1781609842192.png"/>
+                          <pic:cNvPicPr/>
+                        </pic:nvPicPr>
+                        <pic:blipFill>
+                          <a:blip r:embed="rId28"/>
+                          <a:stretch>
+                            <a:fillRect/>
+                          </a:stretch>
+                        </pic:blipFill>
+                        <pic:spPr>
+                          <a:xfrm>
+                            <a:off x="0" y="0"/>
+                            <a:ext cx="4389120" cy="2217420"/>
+                          </a:xfrm>
+                          <a:prstGeom prst="rect"/>
+                        </pic:spPr>
+                      </pic:pic>
+                    </a:graphicData>
+                  </a:graphic>
+                </wp:inline>
+              </w:drawing>
             </w:r>
           </w:p>
         </w:tc>
@@ -19570,66 +19826,56 @@
             <w:tcW w:w="5617" w:type="dxa"/>
           </w:tcPr>
           <w:p>
-            <w:r>
-              <w:t>Gambar 5.5 Evidence Pengujian Rekam Medis &amp; Unduh PDF</w:t>
+            <w:pPr>
+              <w:pStyle w:val="DaftarParagraf"/>
+              <w:spacing w:line="360" w:lineRule="auto" w:before="80" w:after="80"/>
+              <w:ind w:left="0"/>
+              <w:jc w:val="center"/>
+              <w:rPr>
+                <w:color w:val="000000"/>
+                <w:szCs w:val="24"/>
+                <w:lang w:val="en-ID"/>
+              </w:rPr>
+            </w:pPr>
+            <w:r/>
+            <w:r>
+              <w:drawing>
+                <wp:inline xmlns:a="http://schemas.openxmlformats.org/drawingml/2006/main" xmlns:pic="http://schemas.openxmlformats.org/drawingml/2006/picture">
+                  <wp:extent cx="4389120" cy="2265426"/>
+                  <wp:docPr id="2011434111" name="Picture 2011434111"/>
+                  <wp:cNvGraphicFramePr>
+                    <a:graphicFrameLocks noChangeAspect="1"/>
+                  </wp:cNvGraphicFramePr>
+                  <a:graphic>
+                    <a:graphicData uri="http://schemas.openxmlformats.org/drawingml/2006/picture">
+                      <pic:pic>
+                        <pic:nvPicPr>
+                          <pic:cNvPr id="0" name="47_catat_rekam_medis_1781491292298.png"/>
+                          <pic:cNvPicPr/>
+                        </pic:nvPicPr>
+                        <pic:blipFill>
+                          <a:blip r:embed="rId29"/>
+                          <a:stretch>
+                            <a:fillRect/>
+                          </a:stretch>
+                        </pic:blipFill>
+                        <pic:spPr>
+                          <a:xfrm>
+                            <a:off x="0" y="0"/>
+                            <a:ext cx="4389120" cy="2265426"/>
+                          </a:xfrm>
+                          <a:prstGeom prst="rect"/>
+                        </pic:spPr>
+                      </pic:pic>
+                    </a:graphicData>
+                  </a:graphic>
+                </wp:inline>
+              </w:drawing>
             </w:r>
           </w:p>
         </w:tc>
       </w:tr>
     </w:tbl>
-    <w:p>
-      <w:pPr>
-        <w:spacing w:before="240" w:after="80"/>
-        <w:jc w:val="center"/>
-      </w:pPr>
-      <w:r>
-        <w:drawing>
-          <wp:inline xmlns:a="http://schemas.openxmlformats.org/drawingml/2006/main" xmlns:pic="http://schemas.openxmlformats.org/drawingml/2006/picture">
-            <wp:extent cx="5303520" cy="2737390"/>
-            <wp:docPr id="2011434106" name="Picture 2011434106"/>
-            <wp:cNvGraphicFramePr>
-              <a:graphicFrameLocks noChangeAspect="1"/>
-            </wp:cNvGraphicFramePr>
-            <a:graphic>
-              <a:graphicData uri="http://schemas.openxmlformats.org/drawingml/2006/picture">
-                <pic:pic>
-                  <pic:nvPicPr>
-                    <pic:cNvPr id="0" name="47_catat_rekam_medis_1781491292298.png"/>
-                    <pic:cNvPicPr/>
-                  </pic:nvPicPr>
-                  <pic:blipFill>
-                    <a:blip r:embed="rId24"/>
-                    <a:stretch>
-                      <a:fillRect/>
-                    </a:stretch>
-                  </pic:blipFill>
-                  <pic:spPr>
-                    <a:xfrm>
-                      <a:off x="0" y="0"/>
-                      <a:ext cx="5303520" cy="2737390"/>
-                    </a:xfrm>
-                    <a:prstGeom prst="rect"/>
-                  </pic:spPr>
-                </pic:pic>
-              </a:graphicData>
-            </a:graphic>
-          </wp:inline>
-        </w:drawing>
-      </w:r>
-    </w:p>
-    <w:p>
-      <w:pPr>
-        <w:spacing w:before="120" w:after="240"/>
-        <w:jc w:val="center"/>
-      </w:pPr>
-      <w:r>
-        <w:rPr>
-          <w:b/>
-          <w:sz w:val="22"/>
-        </w:rPr>
-        <w:t>Gambar 5.5 Evidence Pengujian Rekam Medis &amp; Unduh PDF</w:t>
-      </w:r>
-    </w:p>
     <w:p>
       <w:pPr>
         <w:spacing w:line="360" w:lineRule="auto"/>
@@ -19909,8 +20155,51 @@
             <w:tcW w:w="5617" w:type="dxa"/>
           </w:tcPr>
           <w:p>
-            <w:r>
-              <w:t>Payload: { id_pembayaran: int, nominal_bayar: decimal, diskon: decimal, status_pembayaran: string }</w:t>
+            <w:pPr>
+              <w:pStyle w:val="DaftarParagraf"/>
+              <w:spacing w:line="360" w:lineRule="auto" w:before="80" w:after="80"/>
+              <w:ind w:left="0"/>
+              <w:jc w:val="center"/>
+              <w:rPr>
+                <w:color w:val="000000"/>
+                <w:szCs w:val="24"/>
+                <w:lang w:val="en-ID"/>
+              </w:rPr>
+            </w:pPr>
+            <w:r/>
+            <w:r>
+              <w:drawing>
+                <wp:inline xmlns:a="http://schemas.openxmlformats.org/drawingml/2006/main" xmlns:pic="http://schemas.openxmlformats.org/drawingml/2006/picture">
+                  <wp:extent cx="4389120" cy="2217420"/>
+                  <wp:docPr id="2011434112" name="Picture 2011434112"/>
+                  <wp:cNvGraphicFramePr>
+                    <a:graphicFrameLocks noChangeAspect="1"/>
+                  </wp:cNvGraphicFramePr>
+                  <a:graphic>
+                    <a:graphicData uri="http://schemas.openxmlformats.org/drawingml/2006/picture">
+                      <pic:pic>
+                        <pic:nvPicPr>
+                          <pic:cNvPr id="0" name="backend_fr06_1781609850630.png"/>
+                          <pic:cNvPicPr/>
+                        </pic:nvPicPr>
+                        <pic:blipFill>
+                          <a:blip r:embed="rId30"/>
+                          <a:stretch>
+                            <a:fillRect/>
+                          </a:stretch>
+                        </pic:blipFill>
+                        <pic:spPr>
+                          <a:xfrm>
+                            <a:off x="0" y="0"/>
+                            <a:ext cx="4389120" cy="2217420"/>
+                          </a:xfrm>
+                          <a:prstGeom prst="rect"/>
+                        </pic:spPr>
+                      </pic:pic>
+                    </a:graphicData>
+                  </a:graphic>
+                </wp:inline>
+              </w:drawing>
             </w:r>
           </w:p>
         </w:tc>
@@ -20001,66 +20290,56 @@
             <w:tcW w:w="5617" w:type="dxa"/>
           </w:tcPr>
           <w:p>
-            <w:r>
-              <w:t>Gambar 5.6 Evidence Pengujian Pembayaran &amp; Kasir</w:t>
+            <w:pPr>
+              <w:pStyle w:val="DaftarParagraf"/>
+              <w:spacing w:line="360" w:lineRule="auto" w:before="80" w:after="80"/>
+              <w:ind w:left="0"/>
+              <w:jc w:val="center"/>
+              <w:rPr>
+                <w:color w:val="000000"/>
+                <w:szCs w:val="24"/>
+                <w:lang w:val="en-ID"/>
+              </w:rPr>
+            </w:pPr>
+            <w:r/>
+            <w:r>
+              <w:drawing>
+                <wp:inline xmlns:a="http://schemas.openxmlformats.org/drawingml/2006/main" xmlns:pic="http://schemas.openxmlformats.org/drawingml/2006/picture">
+                  <wp:extent cx="4389120" cy="2265426"/>
+                  <wp:docPr id="2011434113" name="Picture 2011434113"/>
+                  <wp:cNvGraphicFramePr>
+                    <a:graphicFrameLocks noChangeAspect="1"/>
+                  </wp:cNvGraphicFramePr>
+                  <a:graphic>
+                    <a:graphicData uri="http://schemas.openxmlformats.org/drawingml/2006/picture">
+                      <pic:pic>
+                        <pic:nvPicPr>
+                          <pic:cNvPr id="0" name="36_pembayaran_diskon_1781491534469.png"/>
+                          <pic:cNvPicPr/>
+                        </pic:nvPicPr>
+                        <pic:blipFill>
+                          <a:blip r:embed="rId31"/>
+                          <a:stretch>
+                            <a:fillRect/>
+                          </a:stretch>
+                        </pic:blipFill>
+                        <pic:spPr>
+                          <a:xfrm>
+                            <a:off x="0" y="0"/>
+                            <a:ext cx="4389120" cy="2265426"/>
+                          </a:xfrm>
+                          <a:prstGeom prst="rect"/>
+                        </pic:spPr>
+                      </pic:pic>
+                    </a:graphicData>
+                  </a:graphic>
+                </wp:inline>
+              </w:drawing>
             </w:r>
           </w:p>
         </w:tc>
       </w:tr>
     </w:tbl>
-    <w:p>
-      <w:pPr>
-        <w:spacing w:before="240" w:after="80"/>
-        <w:jc w:val="center"/>
-      </w:pPr>
-      <w:r>
-        <w:drawing>
-          <wp:inline xmlns:a="http://schemas.openxmlformats.org/drawingml/2006/main" xmlns:pic="http://schemas.openxmlformats.org/drawingml/2006/picture">
-            <wp:extent cx="5303520" cy="2737390"/>
-            <wp:docPr id="2011434107" name="Picture 2011434107"/>
-            <wp:cNvGraphicFramePr>
-              <a:graphicFrameLocks noChangeAspect="1"/>
-            </wp:cNvGraphicFramePr>
-            <a:graphic>
-              <a:graphicData uri="http://schemas.openxmlformats.org/drawingml/2006/picture">
-                <pic:pic>
-                  <pic:nvPicPr>
-                    <pic:cNvPr id="0" name="36_pembayaran_diskon_1781491534469.png"/>
-                    <pic:cNvPicPr/>
-                  </pic:nvPicPr>
-                  <pic:blipFill>
-                    <a:blip r:embed="rId25"/>
-                    <a:stretch>
-                      <a:fillRect/>
-                    </a:stretch>
-                  </pic:blipFill>
-                  <pic:spPr>
-                    <a:xfrm>
-                      <a:off x="0" y="0"/>
-                      <a:ext cx="5303520" cy="2737390"/>
-                    </a:xfrm>
-                    <a:prstGeom prst="rect"/>
-                  </pic:spPr>
-                </pic:pic>
-              </a:graphicData>
-            </a:graphic>
-          </wp:inline>
-        </w:drawing>
-      </w:r>
-    </w:p>
-    <w:p>
-      <w:pPr>
-        <w:spacing w:before="120" w:after="240"/>
-        <w:jc w:val="center"/>
-      </w:pPr>
-      <w:r>
-        <w:rPr>
-          <w:b/>
-          <w:sz w:val="22"/>
-        </w:rPr>
-        <w:t>Gambar 5.6 Evidence Pengujian Pembayaran &amp; Kasir</w:t>
-      </w:r>
-    </w:p>
     <w:p>
       <w:pPr>
         <w:spacing w:line="360" w:lineRule="auto"/>
@@ -20322,8 +20601,51 @@
             <w:tcW w:w="5617" w:type="dxa"/>
           </w:tcPr>
           <w:p>
-            <w:r>
-              <w:t>Payload: { nama_obat: string, harga: decimal, kode_icd10: string, nama_tindakan: string }</w:t>
+            <w:pPr>
+              <w:pStyle w:val="DaftarParagraf"/>
+              <w:spacing w:line="360" w:lineRule="auto" w:before="80" w:after="80"/>
+              <w:ind w:left="0"/>
+              <w:jc w:val="center"/>
+              <w:rPr>
+                <w:color w:val="000000"/>
+                <w:szCs w:val="24"/>
+                <w:lang w:val="en-ID"/>
+              </w:rPr>
+            </w:pPr>
+            <w:r/>
+            <w:r>
+              <w:drawing>
+                <wp:inline xmlns:a="http://schemas.openxmlformats.org/drawingml/2006/main" xmlns:pic="http://schemas.openxmlformats.org/drawingml/2006/picture">
+                  <wp:extent cx="4389120" cy="2217420"/>
+                  <wp:docPr id="2011434114" name="Picture 2011434114"/>
+                  <wp:cNvGraphicFramePr>
+                    <a:graphicFrameLocks noChangeAspect="1"/>
+                  </wp:cNvGraphicFramePr>
+                  <a:graphic>
+                    <a:graphicData uri="http://schemas.openxmlformats.org/drawingml/2006/picture">
+                      <pic:pic>
+                        <pic:nvPicPr>
+                          <pic:cNvPr id="0" name="backend_fr07_1781609859466.png"/>
+                          <pic:cNvPicPr/>
+                        </pic:nvPicPr>
+                        <pic:blipFill>
+                          <a:blip r:embed="rId32"/>
+                          <a:stretch>
+                            <a:fillRect/>
+                          </a:stretch>
+                        </pic:blipFill>
+                        <pic:spPr>
+                          <a:xfrm>
+                            <a:off x="0" y="0"/>
+                            <a:ext cx="4389120" cy="2217420"/>
+                          </a:xfrm>
+                          <a:prstGeom prst="rect"/>
+                        </pic:spPr>
+                      </pic:pic>
+                    </a:graphicData>
+                  </a:graphic>
+                </wp:inline>
+              </w:drawing>
             </w:r>
           </w:p>
         </w:tc>
@@ -20414,66 +20736,56 @@
             <w:tcW w:w="5617" w:type="dxa"/>
           </w:tcPr>
           <w:p>
-            <w:r>
-              <w:t>Gambar 5.7 Evidence Pengujian Data Master</w:t>
+            <w:pPr>
+              <w:pStyle w:val="DaftarParagraf"/>
+              <w:spacing w:line="360" w:lineRule="auto" w:before="80" w:after="80"/>
+              <w:ind w:left="0"/>
+              <w:jc w:val="center"/>
+              <w:rPr>
+                <w:color w:val="000000"/>
+                <w:szCs w:val="24"/>
+                <w:lang w:val="en-ID"/>
+              </w:rPr>
+            </w:pPr>
+            <w:r/>
+            <w:r>
+              <w:drawing>
+                <wp:inline xmlns:a="http://schemas.openxmlformats.org/drawingml/2006/main" xmlns:pic="http://schemas.openxmlformats.org/drawingml/2006/picture">
+                  <wp:extent cx="4389120" cy="2265426"/>
+                  <wp:docPr id="2011434115" name="Picture 2011434115"/>
+                  <wp:cNvGraphicFramePr>
+                    <a:graphicFrameLocks noChangeAspect="1"/>
+                  </wp:cNvGraphicFramePr>
+                  <a:graphic>
+                    <a:graphicData uri="http://schemas.openxmlformats.org/drawingml/2006/picture">
+                      <pic:pic>
+                        <pic:nvPicPr>
+                          <pic:cNvPr id="0" name="12_tambah_klinik_sukses_1781492068537.png"/>
+                          <pic:cNvPicPr/>
+                        </pic:nvPicPr>
+                        <pic:blipFill>
+                          <a:blip r:embed="rId33"/>
+                          <a:stretch>
+                            <a:fillRect/>
+                          </a:stretch>
+                        </pic:blipFill>
+                        <pic:spPr>
+                          <a:xfrm>
+                            <a:off x="0" y="0"/>
+                            <a:ext cx="4389120" cy="2265426"/>
+                          </a:xfrm>
+                          <a:prstGeom prst="rect"/>
+                        </pic:spPr>
+                      </pic:pic>
+                    </a:graphicData>
+                  </a:graphic>
+                </wp:inline>
+              </w:drawing>
             </w:r>
           </w:p>
         </w:tc>
       </w:tr>
     </w:tbl>
-    <w:p>
-      <w:pPr>
-        <w:spacing w:before="240" w:after="80"/>
-        <w:jc w:val="center"/>
-      </w:pPr>
-      <w:r>
-        <w:drawing>
-          <wp:inline xmlns:a="http://schemas.openxmlformats.org/drawingml/2006/main" xmlns:pic="http://schemas.openxmlformats.org/drawingml/2006/picture">
-            <wp:extent cx="5303520" cy="2737390"/>
-            <wp:docPr id="2011434108" name="Picture 2011434108"/>
-            <wp:cNvGraphicFramePr>
-              <a:graphicFrameLocks noChangeAspect="1"/>
-            </wp:cNvGraphicFramePr>
-            <a:graphic>
-              <a:graphicData uri="http://schemas.openxmlformats.org/drawingml/2006/picture">
-                <pic:pic>
-                  <pic:nvPicPr>
-                    <pic:cNvPr id="0" name="12_tambah_klinik_sukses_1781492068537.png"/>
-                    <pic:cNvPicPr/>
-                  </pic:nvPicPr>
-                  <pic:blipFill>
-                    <a:blip r:embed="rId26"/>
-                    <a:stretch>
-                      <a:fillRect/>
-                    </a:stretch>
-                  </pic:blipFill>
-                  <pic:spPr>
-                    <a:xfrm>
-                      <a:off x="0" y="0"/>
-                      <a:ext cx="5303520" cy="2737390"/>
-                    </a:xfrm>
-                    <a:prstGeom prst="rect"/>
-                  </pic:spPr>
-                </pic:pic>
-              </a:graphicData>
-            </a:graphic>
-          </wp:inline>
-        </w:drawing>
-      </w:r>
-    </w:p>
-    <w:p>
-      <w:pPr>
-        <w:spacing w:before="120" w:after="240"/>
-        <w:jc w:val="center"/>
-      </w:pPr>
-      <w:r>
-        <w:rPr>
-          <w:b/>
-          <w:sz w:val="22"/>
-        </w:rPr>
-        <w:t>Gambar 5.7 Evidence Pengujian Data Master</w:t>
-      </w:r>
-    </w:p>
     <w:p>
       <w:pPr>
         <w:spacing w:line="360" w:lineRule="auto"/>
@@ -20728,8 +21040,51 @@
             <w:tcW w:w="5617" w:type="dxa"/>
           </w:tcPr>
           <w:p>
-            <w:r>
-              <w:t>Query Params: { phone: string, text: string }</w:t>
+            <w:pPr>
+              <w:pStyle w:val="DaftarParagraf"/>
+              <w:spacing w:line="360" w:lineRule="auto" w:before="80" w:after="80"/>
+              <w:ind w:left="0"/>
+              <w:jc w:val="center"/>
+              <w:rPr>
+                <w:color w:val="000000"/>
+                <w:szCs w:val="24"/>
+                <w:lang w:val="en-ID"/>
+              </w:rPr>
+            </w:pPr>
+            <w:r/>
+            <w:r>
+              <w:drawing>
+                <wp:inline xmlns:a="http://schemas.openxmlformats.org/drawingml/2006/main" xmlns:pic="http://schemas.openxmlformats.org/drawingml/2006/picture">
+                  <wp:extent cx="4389120" cy="2217420"/>
+                  <wp:docPr id="2011434116" name="Picture 2011434116"/>
+                  <wp:cNvGraphicFramePr>
+                    <a:graphicFrameLocks noChangeAspect="1"/>
+                  </wp:cNvGraphicFramePr>
+                  <a:graphic>
+                    <a:graphicData uri="http://schemas.openxmlformats.org/drawingml/2006/picture">
+                      <pic:pic>
+                        <pic:nvPicPr>
+                          <pic:cNvPr id="0" name="backend_fr08_1781609865682.png"/>
+                          <pic:cNvPicPr/>
+                        </pic:nvPicPr>
+                        <pic:blipFill>
+                          <a:blip r:embed="rId34"/>
+                          <a:stretch>
+                            <a:fillRect/>
+                          </a:stretch>
+                        </pic:blipFill>
+                        <pic:spPr>
+                          <a:xfrm>
+                            <a:off x="0" y="0"/>
+                            <a:ext cx="4389120" cy="2217420"/>
+                          </a:xfrm>
+                          <a:prstGeom prst="rect"/>
+                        </pic:spPr>
+                      </pic:pic>
+                    </a:graphicData>
+                  </a:graphic>
+                </wp:inline>
+              </w:drawing>
             </w:r>
           </w:p>
         </w:tc>
@@ -20820,66 +21175,56 @@
             <w:tcW w:w="5617" w:type="dxa"/>
           </w:tcPr>
           <w:p>
-            <w:r>
-              <w:t>Gambar 5.8 Evidence Pengujian WhatsApp Klinik</w:t>
+            <w:pPr>
+              <w:pStyle w:val="DaftarParagraf"/>
+              <w:spacing w:line="360" w:lineRule="auto" w:before="80" w:after="80"/>
+              <w:ind w:left="0"/>
+              <w:jc w:val="center"/>
+              <w:rPr>
+                <w:color w:val="000000"/>
+                <w:szCs w:val="24"/>
+                <w:lang w:val="en-ID"/>
+              </w:rPr>
+            </w:pPr>
+            <w:r/>
+            <w:r>
+              <w:drawing>
+                <wp:inline xmlns:a="http://schemas.openxmlformats.org/drawingml/2006/main" xmlns:pic="http://schemas.openxmlformats.org/drawingml/2006/picture">
+                  <wp:extent cx="4389120" cy="4448618"/>
+                  <wp:docPr id="2011434117" name="Picture 2011434117"/>
+                  <wp:cNvGraphicFramePr>
+                    <a:graphicFrameLocks noChangeAspect="1"/>
+                  </wp:cNvGraphicFramePr>
+                  <a:graphic>
+                    <a:graphicData uri="http://schemas.openxmlformats.org/drawingml/2006/picture">
+                      <pic:pic>
+                        <pic:nvPicPr>
+                          <pic:cNvPr id="0" name="whatsapp_redirect.png"/>
+                          <pic:cNvPicPr/>
+                        </pic:nvPicPr>
+                        <pic:blipFill>
+                          <a:blip r:embed="rId35"/>
+                          <a:stretch>
+                            <a:fillRect/>
+                          </a:stretch>
+                        </pic:blipFill>
+                        <pic:spPr>
+                          <a:xfrm>
+                            <a:off x="0" y="0"/>
+                            <a:ext cx="4389120" cy="4448618"/>
+                          </a:xfrm>
+                          <a:prstGeom prst="rect"/>
+                        </pic:spPr>
+                      </pic:pic>
+                    </a:graphicData>
+                  </a:graphic>
+                </wp:inline>
+              </w:drawing>
             </w:r>
           </w:p>
         </w:tc>
       </w:tr>
     </w:tbl>
-    <w:p>
-      <w:pPr>
-        <w:spacing w:before="240" w:after="80"/>
-        <w:jc w:val="center"/>
-      </w:pPr>
-      <w:r>
-        <w:drawing>
-          <wp:inline xmlns:a="http://schemas.openxmlformats.org/drawingml/2006/main" xmlns:pic="http://schemas.openxmlformats.org/drawingml/2006/picture">
-            <wp:extent cx="5303520" cy="5375413"/>
-            <wp:docPr id="2011434109" name="Picture 2011434109"/>
-            <wp:cNvGraphicFramePr>
-              <a:graphicFrameLocks noChangeAspect="1"/>
-            </wp:cNvGraphicFramePr>
-            <a:graphic>
-              <a:graphicData uri="http://schemas.openxmlformats.org/drawingml/2006/picture">
-                <pic:pic>
-                  <pic:nvPicPr>
-                    <pic:cNvPr id="0" name="whatsapp_redirect.png"/>
-                    <pic:cNvPicPr/>
-                  </pic:nvPicPr>
-                  <pic:blipFill>
-                    <a:blip r:embed="rId27"/>
-                    <a:stretch>
-                      <a:fillRect/>
-                    </a:stretch>
-                  </pic:blipFill>
-                  <pic:spPr>
-                    <a:xfrm>
-                      <a:off x="0" y="0"/>
-                      <a:ext cx="5303520" cy="5375413"/>
-                    </a:xfrm>
-                    <a:prstGeom prst="rect"/>
-                  </pic:spPr>
-                </pic:pic>
-              </a:graphicData>
-            </a:graphic>
-          </wp:inline>
-        </w:drawing>
-      </w:r>
-    </w:p>
-    <w:p>
-      <w:pPr>
-        <w:spacing w:before="120" w:after="240"/>
-        <w:jc w:val="center"/>
-      </w:pPr>
-      <w:r>
-        <w:rPr>
-          <w:b/>
-          <w:sz w:val="22"/>
-        </w:rPr>
-        <w:t>Gambar 5.8 Evidence Pengujian WhatsApp Klinik</w:t>
-      </w:r>
-    </w:p>
     <w:p>
       <w:pPr>
         <w:spacing w:line="360" w:lineRule="auto"/>
@@ -21635,8 +21980,51 @@
             <w:tcW w:w="6108" w:type="dxa"/>
           </w:tcPr>
           <w:p>
-            <w:r>
-              <w:t>HTTP Method &amp; Path: GET /portal/appointments/new</w:t>
+            <w:pPr>
+              <w:pStyle w:val="DaftarParagraf"/>
+              <w:spacing w:line="360" w:lineRule="auto" w:before="80" w:after="80"/>
+              <w:ind w:left="0"/>
+              <w:jc w:val="center"/>
+              <w:rPr>
+                <w:color w:val="000000"/>
+                <w:szCs w:val="24"/>
+                <w:lang w:val="en-ID"/>
+              </w:rPr>
+            </w:pPr>
+            <w:r/>
+            <w:r>
+              <w:drawing>
+                <wp:inline xmlns:a="http://schemas.openxmlformats.org/drawingml/2006/main" xmlns:pic="http://schemas.openxmlformats.org/drawingml/2006/picture">
+                  <wp:extent cx="4389120" cy="2217420"/>
+                  <wp:docPr id="2011434118" name="Picture 2011434118"/>
+                  <wp:cNvGraphicFramePr>
+                    <a:graphicFrameLocks noChangeAspect="1"/>
+                  </wp:cNvGraphicFramePr>
+                  <a:graphic>
+                    <a:graphicData uri="http://schemas.openxmlformats.org/drawingml/2006/picture">
+                      <pic:pic>
+                        <pic:nvPicPr>
+                          <pic:cNvPr id="0" name="backend_nf01_1781609873827.png"/>
+                          <pic:cNvPicPr/>
+                        </pic:nvPicPr>
+                        <pic:blipFill>
+                          <a:blip r:embed="rId36"/>
+                          <a:stretch>
+                            <a:fillRect/>
+                          </a:stretch>
+                        </pic:blipFill>
+                        <pic:spPr>
+                          <a:xfrm>
+                            <a:off x="0" y="0"/>
+                            <a:ext cx="4389120" cy="2217420"/>
+                          </a:xfrm>
+                          <a:prstGeom prst="rect"/>
+                        </pic:spPr>
+                      </pic:pic>
+                    </a:graphicData>
+                  </a:graphic>
+                </wp:inline>
+              </w:drawing>
             </w:r>
           </w:p>
         </w:tc>
@@ -21727,66 +22115,56 @@
             <w:tcW w:w="6108" w:type="dxa"/>
           </w:tcPr>
           <w:p>
-            <w:r>
-              <w:t>Gambar 5.9 Evidence Pengujian Booking Availability Validation</w:t>
+            <w:pPr>
+              <w:pStyle w:val="DaftarParagraf"/>
+              <w:spacing w:line="360" w:lineRule="auto" w:before="80" w:after="80"/>
+              <w:ind w:left="0"/>
+              <w:jc w:val="center"/>
+              <w:rPr>
+                <w:color w:val="000000"/>
+                <w:szCs w:val="24"/>
+                <w:lang w:val="en-ID"/>
+              </w:rPr>
+            </w:pPr>
+            <w:r/>
+            <w:r>
+              <w:drawing>
+                <wp:inline xmlns:a="http://schemas.openxmlformats.org/drawingml/2006/main" xmlns:pic="http://schemas.openxmlformats.org/drawingml/2006/picture">
+                  <wp:extent cx="4389120" cy="2265426"/>
+                  <wp:docPr id="2011434119" name="Picture 2011434119"/>
+                  <wp:cNvGraphicFramePr>
+                    <a:graphicFrameLocks noChangeAspect="1"/>
+                  </wp:cNvGraphicFramePr>
+                  <a:graphic>
+                    <a:graphicData uri="http://schemas.openxmlformats.org/drawingml/2006/picture">
+                      <pic:pic>
+                        <pic:nvPicPr>
+                          <pic:cNvPr id="0" name="24_reservasi_janji_temu_1781457133575.png"/>
+                          <pic:cNvPicPr/>
+                        </pic:nvPicPr>
+                        <pic:blipFill>
+                          <a:blip r:embed="rId37"/>
+                          <a:stretch>
+                            <a:fillRect/>
+                          </a:stretch>
+                        </pic:blipFill>
+                        <pic:spPr>
+                          <a:xfrm>
+                            <a:off x="0" y="0"/>
+                            <a:ext cx="4389120" cy="2265426"/>
+                          </a:xfrm>
+                          <a:prstGeom prst="rect"/>
+                        </pic:spPr>
+                      </pic:pic>
+                    </a:graphicData>
+                  </a:graphic>
+                </wp:inline>
+              </w:drawing>
             </w:r>
           </w:p>
         </w:tc>
       </w:tr>
     </w:tbl>
-    <w:p>
-      <w:pPr>
-        <w:spacing w:before="240" w:after="80"/>
-        <w:jc w:val="center"/>
-      </w:pPr>
-      <w:r>
-        <w:drawing>
-          <wp:inline xmlns:a="http://schemas.openxmlformats.org/drawingml/2006/main" xmlns:pic="http://schemas.openxmlformats.org/drawingml/2006/picture">
-            <wp:extent cx="5303520" cy="2737390"/>
-            <wp:docPr id="2011434110" name="Picture 2011434110"/>
-            <wp:cNvGraphicFramePr>
-              <a:graphicFrameLocks noChangeAspect="1"/>
-            </wp:cNvGraphicFramePr>
-            <a:graphic>
-              <a:graphicData uri="http://schemas.openxmlformats.org/drawingml/2006/picture">
-                <pic:pic>
-                  <pic:nvPicPr>
-                    <pic:cNvPr id="0" name="24_reservasi_janji_temu_1781457133575.png"/>
-                    <pic:cNvPicPr/>
-                  </pic:nvPicPr>
-                  <pic:blipFill>
-                    <a:blip r:embed="rId28"/>
-                    <a:stretch>
-                      <a:fillRect/>
-                    </a:stretch>
-                  </pic:blipFill>
-                  <pic:spPr>
-                    <a:xfrm>
-                      <a:off x="0" y="0"/>
-                      <a:ext cx="5303520" cy="2737390"/>
-                    </a:xfrm>
-                    <a:prstGeom prst="rect"/>
-                  </pic:spPr>
-                </pic:pic>
-              </a:graphicData>
-            </a:graphic>
-          </wp:inline>
-        </w:drawing>
-      </w:r>
-    </w:p>
-    <w:p>
-      <w:pPr>
-        <w:spacing w:before="120" w:after="240"/>
-        <w:jc w:val="center"/>
-      </w:pPr>
-      <w:r>
-        <w:rPr>
-          <w:b/>
-          <w:sz w:val="22"/>
-        </w:rPr>
-        <w:t>Gambar 5.9 Evidence Pengujian Booking Availability Validation</w:t>
-      </w:r>
-    </w:p>
     <w:p>
       <w:pPr>
         <w:spacing w:line="360" w:lineRule="auto"/>
@@ -22051,8 +22429,51 @@
             <w:tcW w:w="6108" w:type="dxa"/>
           </w:tcPr>
           <w:p>
-            <w:r>
-              <w:t>Security Spec: SSL/HTTPS port 443, hashing algorithm: bcrypt</w:t>
+            <w:pPr>
+              <w:pStyle w:val="DaftarParagraf"/>
+              <w:spacing w:line="360" w:lineRule="auto" w:before="80" w:after="80"/>
+              <w:ind w:left="0"/>
+              <w:jc w:val="center"/>
+              <w:rPr>
+                <w:color w:val="000000"/>
+                <w:szCs w:val="24"/>
+                <w:lang w:val="en-ID"/>
+              </w:rPr>
+            </w:pPr>
+            <w:r/>
+            <w:r>
+              <w:drawing>
+                <wp:inline xmlns:a="http://schemas.openxmlformats.org/drawingml/2006/main" xmlns:pic="http://schemas.openxmlformats.org/drawingml/2006/picture">
+                  <wp:extent cx="4389120" cy="2217420"/>
+                  <wp:docPr id="2011434120" name="Picture 2011434120"/>
+                  <wp:cNvGraphicFramePr>
+                    <a:graphicFrameLocks noChangeAspect="1"/>
+                  </wp:cNvGraphicFramePr>
+                  <a:graphic>
+                    <a:graphicData uri="http://schemas.openxmlformats.org/drawingml/2006/picture">
+                      <pic:pic>
+                        <pic:nvPicPr>
+                          <pic:cNvPr id="0" name="backend_nf02_1781609880356.png"/>
+                          <pic:cNvPicPr/>
+                        </pic:nvPicPr>
+                        <pic:blipFill>
+                          <a:blip r:embed="rId38"/>
+                          <a:stretch>
+                            <a:fillRect/>
+                          </a:stretch>
+                        </pic:blipFill>
+                        <pic:spPr>
+                          <a:xfrm>
+                            <a:off x="0" y="0"/>
+                            <a:ext cx="4389120" cy="2217420"/>
+                          </a:xfrm>
+                          <a:prstGeom prst="rect"/>
+                        </pic:spPr>
+                      </pic:pic>
+                    </a:graphicData>
+                  </a:graphic>
+                </wp:inline>
+              </w:drawing>
             </w:r>
           </w:p>
         </w:tc>
@@ -22143,66 +22564,56 @@
             <w:tcW w:w="6108" w:type="dxa"/>
           </w:tcPr>
           <w:p>
-            <w:r>
-              <w:t>Gambar 5.10 Evidence Pengujian Data Security Validation</w:t>
+            <w:pPr>
+              <w:pStyle w:val="DaftarParagraf"/>
+              <w:spacing w:line="360" w:lineRule="auto" w:before="80" w:after="80"/>
+              <w:ind w:left="0"/>
+              <w:jc w:val="center"/>
+              <w:rPr>
+                <w:color w:val="000000"/>
+                <w:szCs w:val="24"/>
+                <w:lang w:val="en-ID"/>
+              </w:rPr>
+            </w:pPr>
+            <w:r/>
+            <w:r>
+              <w:drawing>
+                <wp:inline xmlns:a="http://schemas.openxmlformats.org/drawingml/2006/main" xmlns:pic="http://schemas.openxmlformats.org/drawingml/2006/picture">
+                  <wp:extent cx="4389120" cy="2265426"/>
+                  <wp:docPr id="2011434121" name="Picture 2011434121"/>
+                  <wp:cNvGraphicFramePr>
+                    <a:graphicFrameLocks noChangeAspect="1"/>
+                  </wp:cNvGraphicFramePr>
+                  <a:graphic>
+                    <a:graphicData uri="http://schemas.openxmlformats.org/drawingml/2006/picture">
+                      <pic:pic>
+                        <pic:nvPicPr>
+                          <pic:cNvPr id="0" name="01_login_staf_sukses_1781491070641.png"/>
+                          <pic:cNvPicPr/>
+                        </pic:nvPicPr>
+                        <pic:blipFill>
+                          <a:blip r:embed="rId21"/>
+                          <a:stretch>
+                            <a:fillRect/>
+                          </a:stretch>
+                        </pic:blipFill>
+                        <pic:spPr>
+                          <a:xfrm>
+                            <a:off x="0" y="0"/>
+                            <a:ext cx="4389120" cy="2265426"/>
+                          </a:xfrm>
+                          <a:prstGeom prst="rect"/>
+                        </pic:spPr>
+                      </pic:pic>
+                    </a:graphicData>
+                  </a:graphic>
+                </wp:inline>
+              </w:drawing>
             </w:r>
           </w:p>
         </w:tc>
       </w:tr>
     </w:tbl>
-    <w:p>
-      <w:pPr>
-        <w:spacing w:before="240" w:after="80"/>
-        <w:jc w:val="center"/>
-      </w:pPr>
-      <w:r>
-        <w:drawing>
-          <wp:inline xmlns:a="http://schemas.openxmlformats.org/drawingml/2006/main" xmlns:pic="http://schemas.openxmlformats.org/drawingml/2006/picture">
-            <wp:extent cx="5303520" cy="2737390"/>
-            <wp:docPr id="2011434111" name="Picture 2011434111"/>
-            <wp:cNvGraphicFramePr>
-              <a:graphicFrameLocks noChangeAspect="1"/>
-            </wp:cNvGraphicFramePr>
-            <a:graphic>
-              <a:graphicData uri="http://schemas.openxmlformats.org/drawingml/2006/picture">
-                <pic:pic>
-                  <pic:nvPicPr>
-                    <pic:cNvPr id="0" name="01_login_staf_sukses_1781491070641.png"/>
-                    <pic:cNvPicPr/>
-                  </pic:nvPicPr>
-                  <pic:blipFill>
-                    <a:blip r:embed="rId20"/>
-                    <a:stretch>
-                      <a:fillRect/>
-                    </a:stretch>
-                  </pic:blipFill>
-                  <pic:spPr>
-                    <a:xfrm>
-                      <a:off x="0" y="0"/>
-                      <a:ext cx="5303520" cy="2737390"/>
-                    </a:xfrm>
-                    <a:prstGeom prst="rect"/>
-                  </pic:spPr>
-                </pic:pic>
-              </a:graphicData>
-            </a:graphic>
-          </wp:inline>
-        </w:drawing>
-      </w:r>
-    </w:p>
-    <w:p>
-      <w:pPr>
-        <w:spacing w:before="120" w:after="240"/>
-        <w:jc w:val="center"/>
-      </w:pPr>
-      <w:r>
-        <w:rPr>
-          <w:b/>
-          <w:sz w:val="22"/>
-        </w:rPr>
-        <w:t>Gambar 5.10 Evidence Pengujian Data Security Validation</w:t>
-      </w:r>
-    </w:p>
     <w:p>
       <w:pPr>
         <w:spacing w:line="360" w:lineRule="auto"/>
@@ -22485,8 +22896,51 @@
             <w:tcW w:w="6108" w:type="dxa"/>
           </w:tcPr>
           <w:p>
-            <w:r>
-              <w:t>Viewport Dimensions: [360x740, 768x1024, 1920x1080]</w:t>
+            <w:pPr>
+              <w:pStyle w:val="DaftarParagraf"/>
+              <w:spacing w:line="360" w:lineRule="auto" w:before="80" w:after="80"/>
+              <w:ind w:left="0"/>
+              <w:jc w:val="center"/>
+              <w:rPr>
+                <w:color w:val="000000"/>
+                <w:szCs w:val="24"/>
+                <w:lang w:val="en-ID"/>
+              </w:rPr>
+            </w:pPr>
+            <w:r/>
+            <w:r>
+              <w:drawing>
+                <wp:inline xmlns:a="http://schemas.openxmlformats.org/drawingml/2006/main" xmlns:pic="http://schemas.openxmlformats.org/drawingml/2006/picture">
+                  <wp:extent cx="4389120" cy="2217420"/>
+                  <wp:docPr id="2011434122" name="Picture 2011434122"/>
+                  <wp:cNvGraphicFramePr>
+                    <a:graphicFrameLocks noChangeAspect="1"/>
+                  </wp:cNvGraphicFramePr>
+                  <a:graphic>
+                    <a:graphicData uri="http://schemas.openxmlformats.org/drawingml/2006/picture">
+                      <pic:pic>
+                        <pic:nvPicPr>
+                          <pic:cNvPr id="0" name="backend_nf03_1781609886910.png"/>
+                          <pic:cNvPicPr/>
+                        </pic:nvPicPr>
+                        <pic:blipFill>
+                          <a:blip r:embed="rId39"/>
+                          <a:stretch>
+                            <a:fillRect/>
+                          </a:stretch>
+                        </pic:blipFill>
+                        <pic:spPr>
+                          <a:xfrm>
+                            <a:off x="0" y="0"/>
+                            <a:ext cx="4389120" cy="2217420"/>
+                          </a:xfrm>
+                          <a:prstGeom prst="rect"/>
+                        </pic:spPr>
+                      </pic:pic>
+                    </a:graphicData>
+                  </a:graphic>
+                </wp:inline>
+              </w:drawing>
             </w:r>
           </w:p>
         </w:tc>
@@ -22577,66 +23031,56 @@
             <w:tcW w:w="6108" w:type="dxa"/>
           </w:tcPr>
           <w:p>
-            <w:r>
-              <w:t>Gambar 5.11 Evidence Pengujian Responsive Interface Validation</w:t>
+            <w:pPr>
+              <w:pStyle w:val="DaftarParagraf"/>
+              <w:spacing w:line="360" w:lineRule="auto" w:before="80" w:after="80"/>
+              <w:ind w:left="0"/>
+              <w:jc w:val="center"/>
+              <w:rPr>
+                <w:color w:val="000000"/>
+                <w:szCs w:val="24"/>
+                <w:lang w:val="en-ID"/>
+              </w:rPr>
+            </w:pPr>
+            <w:r/>
+            <w:r>
+              <w:drawing>
+                <wp:inline xmlns:a="http://schemas.openxmlformats.org/drawingml/2006/main" xmlns:pic="http://schemas.openxmlformats.org/drawingml/2006/picture">
+                  <wp:extent cx="4389120" cy="6293998"/>
+                  <wp:docPr id="2011434123" name="Picture 2011434123"/>
+                  <wp:cNvGraphicFramePr>
+                    <a:graphicFrameLocks noChangeAspect="1"/>
+                  </wp:cNvGraphicFramePr>
+                  <a:graphic>
+                    <a:graphicData uri="http://schemas.openxmlformats.org/drawingml/2006/picture">
+                      <pic:pic>
+                        <pic:nvPicPr>
+                          <pic:cNvPr id="0" name="mobile_login_view_1781025189516.png"/>
+                          <pic:cNvPicPr/>
+                        </pic:nvPicPr>
+                        <pic:blipFill>
+                          <a:blip r:embed="rId40"/>
+                          <a:stretch>
+                            <a:fillRect/>
+                          </a:stretch>
+                        </pic:blipFill>
+                        <pic:spPr>
+                          <a:xfrm>
+                            <a:off x="0" y="0"/>
+                            <a:ext cx="4389120" cy="6293998"/>
+                          </a:xfrm>
+                          <a:prstGeom prst="rect"/>
+                        </pic:spPr>
+                      </pic:pic>
+                    </a:graphicData>
+                  </a:graphic>
+                </wp:inline>
+              </w:drawing>
             </w:r>
           </w:p>
         </w:tc>
       </w:tr>
     </w:tbl>
-    <w:p>
-      <w:pPr>
-        <w:spacing w:before="240" w:after="80"/>
-        <w:jc w:val="center"/>
-      </w:pPr>
-      <w:r>
-        <w:drawing>
-          <wp:inline xmlns:a="http://schemas.openxmlformats.org/drawingml/2006/main" xmlns:pic="http://schemas.openxmlformats.org/drawingml/2006/picture">
-            <wp:extent cx="5303520" cy="7605248"/>
-            <wp:docPr id="2011434112" name="Picture 2011434112"/>
-            <wp:cNvGraphicFramePr>
-              <a:graphicFrameLocks noChangeAspect="1"/>
-            </wp:cNvGraphicFramePr>
-            <a:graphic>
-              <a:graphicData uri="http://schemas.openxmlformats.org/drawingml/2006/picture">
-                <pic:pic>
-                  <pic:nvPicPr>
-                    <pic:cNvPr id="0" name="mobile_login_view_1781025189516.png"/>
-                    <pic:cNvPicPr/>
-                  </pic:nvPicPr>
-                  <pic:blipFill>
-                    <a:blip r:embed="rId29"/>
-                    <a:stretch>
-                      <a:fillRect/>
-                    </a:stretch>
-                  </pic:blipFill>
-                  <pic:spPr>
-                    <a:xfrm>
-                      <a:off x="0" y="0"/>
-                      <a:ext cx="5303520" cy="7605248"/>
-                    </a:xfrm>
-                    <a:prstGeom prst="rect"/>
-                  </pic:spPr>
-                </pic:pic>
-              </a:graphicData>
-            </a:graphic>
-          </wp:inline>
-        </w:drawing>
-      </w:r>
-    </w:p>
-    <w:p>
-      <w:pPr>
-        <w:spacing w:before="120" w:after="240"/>
-        <w:jc w:val="center"/>
-      </w:pPr>
-      <w:r>
-        <w:rPr>
-          <w:b/>
-          <w:sz w:val="22"/>
-        </w:rPr>
-        <w:t>Gambar 5.11 Evidence Pengujian Responsive Interface Validation</w:t>
-      </w:r>
-    </w:p>
     <w:p>
       <w:pPr>
         <w:spacing w:line="360" w:lineRule="auto"/>
@@ -22910,8 +23354,51 @@
             <w:tcW w:w="6108" w:type="dxa"/>
           </w:tcPr>
           <w:p>
-            <w:r>
-              <w:t>Action triggers: onClick(), onChange(), onSubmit()</w:t>
+            <w:pPr>
+              <w:pStyle w:val="DaftarParagraf"/>
+              <w:spacing w:line="360" w:lineRule="auto" w:before="80" w:after="80"/>
+              <w:ind w:left="0"/>
+              <w:jc w:val="center"/>
+              <w:rPr>
+                <w:color w:val="000000"/>
+                <w:szCs w:val="24"/>
+                <w:lang w:val="en-ID"/>
+              </w:rPr>
+            </w:pPr>
+            <w:r/>
+            <w:r>
+              <w:drawing>
+                <wp:inline xmlns:a="http://schemas.openxmlformats.org/drawingml/2006/main" xmlns:pic="http://schemas.openxmlformats.org/drawingml/2006/picture">
+                  <wp:extent cx="4389120" cy="2217420"/>
+                  <wp:docPr id="2011434124" name="Picture 2011434124"/>
+                  <wp:cNvGraphicFramePr>
+                    <a:graphicFrameLocks noChangeAspect="1"/>
+                  </wp:cNvGraphicFramePr>
+                  <a:graphic>
+                    <a:graphicData uri="http://schemas.openxmlformats.org/drawingml/2006/picture">
+                      <pic:pic>
+                        <pic:nvPicPr>
+                          <pic:cNvPr id="0" name="backend_nf04_1781609902152.png"/>
+                          <pic:cNvPicPr/>
+                        </pic:nvPicPr>
+                        <pic:blipFill>
+                          <a:blip r:embed="rId41"/>
+                          <a:stretch>
+                            <a:fillRect/>
+                          </a:stretch>
+                        </pic:blipFill>
+                        <pic:spPr>
+                          <a:xfrm>
+                            <a:off x="0" y="0"/>
+                            <a:ext cx="4389120" cy="2217420"/>
+                          </a:xfrm>
+                          <a:prstGeom prst="rect"/>
+                        </pic:spPr>
+                      </pic:pic>
+                    </a:graphicData>
+                  </a:graphic>
+                </wp:inline>
+              </w:drawing>
             </w:r>
           </w:p>
         </w:tc>
@@ -23002,66 +23489,56 @@
             <w:tcW w:w="6108" w:type="dxa"/>
           </w:tcPr>
           <w:p>
-            <w:r>
-              <w:t>Gambar 5.12 Evidence Pengujian User Interaction Efficiency</w:t>
+            <w:pPr>
+              <w:pStyle w:val="DaftarParagraf"/>
+              <w:spacing w:line="360" w:lineRule="auto" w:before="80" w:after="80"/>
+              <w:ind w:left="0"/>
+              <w:jc w:val="center"/>
+              <w:rPr>
+                <w:color w:val="000000"/>
+                <w:szCs w:val="24"/>
+                <w:lang w:val="en-ID"/>
+              </w:rPr>
+            </w:pPr>
+            <w:r/>
+            <w:r>
+              <w:drawing>
+                <wp:inline xmlns:a="http://schemas.openxmlformats.org/drawingml/2006/main" xmlns:pic="http://schemas.openxmlformats.org/drawingml/2006/picture">
+                  <wp:extent cx="4389120" cy="2265426"/>
+                  <wp:docPr id="2011434125" name="Picture 2011434125"/>
+                  <wp:cNvGraphicFramePr>
+                    <a:graphicFrameLocks noChangeAspect="1"/>
+                  </wp:cNvGraphicFramePr>
+                  <a:graphic>
+                    <a:graphicData uri="http://schemas.openxmlformats.org/drawingml/2006/picture">
+                      <pic:pic>
+                        <pic:nvPicPr>
+                          <pic:cNvPr id="0" name="53_dashboard_summary_cards_1781491979654.png"/>
+                          <pic:cNvPicPr/>
+                        </pic:nvPicPr>
+                        <pic:blipFill>
+                          <a:blip r:embed="rId42"/>
+                          <a:stretch>
+                            <a:fillRect/>
+                          </a:stretch>
+                        </pic:blipFill>
+                        <pic:spPr>
+                          <a:xfrm>
+                            <a:off x="0" y="0"/>
+                            <a:ext cx="4389120" cy="2265426"/>
+                          </a:xfrm>
+                          <a:prstGeom prst="rect"/>
+                        </pic:spPr>
+                      </pic:pic>
+                    </a:graphicData>
+                  </a:graphic>
+                </wp:inline>
+              </w:drawing>
             </w:r>
           </w:p>
         </w:tc>
       </w:tr>
     </w:tbl>
-    <w:p>
-      <w:pPr>
-        <w:spacing w:before="240" w:after="80"/>
-        <w:jc w:val="center"/>
-      </w:pPr>
-      <w:r>
-        <w:drawing>
-          <wp:inline xmlns:a="http://schemas.openxmlformats.org/drawingml/2006/main" xmlns:pic="http://schemas.openxmlformats.org/drawingml/2006/picture">
-            <wp:extent cx="5303520" cy="2737390"/>
-            <wp:docPr id="2011434113" name="Picture 2011434113"/>
-            <wp:cNvGraphicFramePr>
-              <a:graphicFrameLocks noChangeAspect="1"/>
-            </wp:cNvGraphicFramePr>
-            <a:graphic>
-              <a:graphicData uri="http://schemas.openxmlformats.org/drawingml/2006/picture">
-                <pic:pic>
-                  <pic:nvPicPr>
-                    <pic:cNvPr id="0" name="53_dashboard_summary_cards_1781491979654.png"/>
-                    <pic:cNvPicPr/>
-                  </pic:nvPicPr>
-                  <pic:blipFill>
-                    <a:blip r:embed="rId30"/>
-                    <a:stretch>
-                      <a:fillRect/>
-                    </a:stretch>
-                  </pic:blipFill>
-                  <pic:spPr>
-                    <a:xfrm>
-                      <a:off x="0" y="0"/>
-                      <a:ext cx="5303520" cy="2737390"/>
-                    </a:xfrm>
-                    <a:prstGeom prst="rect"/>
-                  </pic:spPr>
-                </pic:pic>
-              </a:graphicData>
-            </a:graphic>
-          </wp:inline>
-        </w:drawing>
-      </w:r>
-    </w:p>
-    <w:p>
-      <w:pPr>
-        <w:spacing w:before="120" w:after="240"/>
-        <w:jc w:val="center"/>
-      </w:pPr>
-      <w:r>
-        <w:rPr>
-          <w:b/>
-          <w:sz w:val="22"/>
-        </w:rPr>
-        <w:t>Gambar 5.12 Evidence Pengujian User Interaction Efficiency</w:t>
-      </w:r>
-    </w:p>
     <w:p>
       <w:pPr>
         <w:spacing w:line="360" w:lineRule="auto"/>
@@ -23325,8 +23802,51 @@
             <w:tcW w:w="6108" w:type="dxa"/>
           </w:tcPr>
           <w:p>
-            <w:r>
-              <w:t>Network performance logs: [DNS Lookup, TCP Handshake, TTFB, DOM Content Loaded]</w:t>
+            <w:pPr>
+              <w:pStyle w:val="DaftarParagraf"/>
+              <w:spacing w:line="360" w:lineRule="auto" w:before="80" w:after="80"/>
+              <w:ind w:left="0"/>
+              <w:jc w:val="center"/>
+              <w:rPr>
+                <w:color w:val="000000"/>
+                <w:szCs w:val="24"/>
+                <w:lang w:val="en-ID"/>
+              </w:rPr>
+            </w:pPr>
+            <w:r/>
+            <w:r>
+              <w:drawing>
+                <wp:inline xmlns:a="http://schemas.openxmlformats.org/drawingml/2006/main" xmlns:pic="http://schemas.openxmlformats.org/drawingml/2006/picture">
+                  <wp:extent cx="4389120" cy="2217420"/>
+                  <wp:docPr id="2011434126" name="Picture 2011434126"/>
+                  <wp:cNvGraphicFramePr>
+                    <a:graphicFrameLocks noChangeAspect="1"/>
+                  </wp:cNvGraphicFramePr>
+                  <a:graphic>
+                    <a:graphicData uri="http://schemas.openxmlformats.org/drawingml/2006/picture">
+                      <pic:pic>
+                        <pic:nvPicPr>
+                          <pic:cNvPr id="0" name="backend_nf05_1781609910206.png"/>
+                          <pic:cNvPicPr/>
+                        </pic:nvPicPr>
+                        <pic:blipFill>
+                          <a:blip r:embed="rId43"/>
+                          <a:stretch>
+                            <a:fillRect/>
+                          </a:stretch>
+                        </pic:blipFill>
+                        <pic:spPr>
+                          <a:xfrm>
+                            <a:off x="0" y="0"/>
+                            <a:ext cx="4389120" cy="2217420"/>
+                          </a:xfrm>
+                          <a:prstGeom prst="rect"/>
+                        </pic:spPr>
+                      </pic:pic>
+                    </a:graphicData>
+                  </a:graphic>
+                </wp:inline>
+              </w:drawing>
             </w:r>
           </w:p>
         </w:tc>
@@ -23417,66 +23937,56 @@
             <w:tcW w:w="6108" w:type="dxa"/>
           </w:tcPr>
           <w:p>
-            <w:r>
-              <w:t>Gambar 5.13 Evidence Pengujian Page Load Time Measurement</w:t>
+            <w:pPr>
+              <w:pStyle w:val="DaftarParagraf"/>
+              <w:spacing w:line="360" w:lineRule="auto" w:before="80" w:after="80"/>
+              <w:ind w:left="0"/>
+              <w:jc w:val="center"/>
+              <w:rPr>
+                <w:color w:val="000000"/>
+                <w:szCs w:val="24"/>
+                <w:lang w:val="en-ID"/>
+              </w:rPr>
+            </w:pPr>
+            <w:r/>
+            <w:r>
+              <w:drawing>
+                <wp:inline xmlns:a="http://schemas.openxmlformats.org/drawingml/2006/main" xmlns:pic="http://schemas.openxmlformats.org/drawingml/2006/picture">
+                  <wp:extent cx="4389120" cy="2265426"/>
+                  <wp:docPr id="2011434127" name="Picture 2011434127"/>
+                  <wp:cNvGraphicFramePr>
+                    <a:graphicFrameLocks noChangeAspect="1"/>
+                  </wp:cNvGraphicFramePr>
+                  <a:graphic>
+                    <a:graphicData uri="http://schemas.openxmlformats.org/drawingml/2006/picture">
+                      <pic:pic>
+                        <pic:nvPicPr>
+                          <pic:cNvPr id="0" name="53_dashboard_summary_cards_1781491979654.png"/>
+                          <pic:cNvPicPr/>
+                        </pic:nvPicPr>
+                        <pic:blipFill>
+                          <a:blip r:embed="rId42"/>
+                          <a:stretch>
+                            <a:fillRect/>
+                          </a:stretch>
+                        </pic:blipFill>
+                        <pic:spPr>
+                          <a:xfrm>
+                            <a:off x="0" y="0"/>
+                            <a:ext cx="4389120" cy="2265426"/>
+                          </a:xfrm>
+                          <a:prstGeom prst="rect"/>
+                        </pic:spPr>
+                      </pic:pic>
+                    </a:graphicData>
+                  </a:graphic>
+                </wp:inline>
+              </w:drawing>
             </w:r>
           </w:p>
         </w:tc>
       </w:tr>
     </w:tbl>
-    <w:p>
-      <w:pPr>
-        <w:spacing w:before="240" w:after="80"/>
-        <w:jc w:val="center"/>
-      </w:pPr>
-      <w:r>
-        <w:drawing>
-          <wp:inline xmlns:a="http://schemas.openxmlformats.org/drawingml/2006/main" xmlns:pic="http://schemas.openxmlformats.org/drawingml/2006/picture">
-            <wp:extent cx="5303520" cy="2737390"/>
-            <wp:docPr id="2011434114" name="Picture 2011434114"/>
-            <wp:cNvGraphicFramePr>
-              <a:graphicFrameLocks noChangeAspect="1"/>
-            </wp:cNvGraphicFramePr>
-            <a:graphic>
-              <a:graphicData uri="http://schemas.openxmlformats.org/drawingml/2006/picture">
-                <pic:pic>
-                  <pic:nvPicPr>
-                    <pic:cNvPr id="0" name="53_dashboard_summary_cards_1781491979654.png"/>
-                    <pic:cNvPicPr/>
-                  </pic:nvPicPr>
-                  <pic:blipFill>
-                    <a:blip r:embed="rId30"/>
-                    <a:stretch>
-                      <a:fillRect/>
-                    </a:stretch>
-                  </pic:blipFill>
-                  <pic:spPr>
-                    <a:xfrm>
-                      <a:off x="0" y="0"/>
-                      <a:ext cx="5303520" cy="2737390"/>
-                    </a:xfrm>
-                    <a:prstGeom prst="rect"/>
-                  </pic:spPr>
-                </pic:pic>
-              </a:graphicData>
-            </a:graphic>
-          </wp:inline>
-        </w:drawing>
-      </w:r>
-    </w:p>
-    <w:p>
-      <w:pPr>
-        <w:spacing w:before="120" w:after="240"/>
-        <w:jc w:val="center"/>
-      </w:pPr>
-      <w:r>
-        <w:rPr>
-          <w:b/>
-          <w:sz w:val="22"/>
-        </w:rPr>
-        <w:t>Gambar 5.13 Evidence Pengujian Page Load Time Measurement</w:t>
-      </w:r>
-    </w:p>
     <w:p>
       <w:pPr>
         <w:spacing w:line="360" w:lineRule="auto"/>

</xml_diff>

<commit_message>
docs: split requirements tables with multiple scenarios, insert their screenshots inline, add Response Time to NF-05 with Chrome DevTools timing screenshot, and set Data Input to typed text
</commit_message>
<xml_diff>
--- a/Draft CD5.docx
+++ b/Draft CD5.docx
@@ -17595,6 +17595,9 @@
             <w:tcW w:w="5617" w:type="dxa"/>
           </w:tcPr>
           <w:p>
+            <w:pPr>
+              <w:jc w:val="left"/>
+            </w:pPr>
             <w:r>
               <w:t>FR-01</w:t>
             </w:r>
@@ -17618,6 +17621,9 @@
             <w:tcW w:w="5617" w:type="dxa"/>
           </w:tcPr>
           <w:p>
+            <w:pPr>
+              <w:jc w:val="left"/>
+            </w:pPr>
             <w:r>
               <w:t>Pendaftaran Akun, Login, &amp; Hak Akses</w:t>
             </w:r>
@@ -17632,7 +17638,7 @@
           </w:tcPr>
           <w:p>
             <w:r>
-              <w:t>Skenario Pengujian</w:t>
+              <w:t>Data Input</w:t>
             </w:r>
           </w:p>
         </w:tc>
@@ -17641,8 +17647,11 @@
             <w:tcW w:w="5617" w:type="dxa"/>
           </w:tcPr>
           <w:p>
-            <w:r>
-              <w:t>Staf melakukan registrasi pasien baru melalui antarmuka UI dan menggunakan Google Sign-In. Apabila akun Google belum pernah terdaftar, sistem mengarahkan pengguna ke halaman pendaftaran untuk melengkapi data diri. Staf kemudian melakukan login dan mencoba mengakses halaman dashboard dokter maupun admin menggunakan akun pasien untuk memverifikasi pembatasan hak akses.</w:t>
+            <w:pPr>
+              <w:jc w:val="left"/>
+            </w:pPr>
+            <w:r>
+              <w:t>Payload: { username: "...", passwords: "...", email: "...", role: "admin|doctor|patient" }</w:t>
             </w:r>
           </w:p>
         </w:tc>
@@ -17655,7 +17664,111 @@
           </w:tcPr>
           <w:p>
             <w:r>
-              <w:t>Data Input</w:t>
+              <w:t>Expected Result</w:t>
+            </w:r>
+          </w:p>
+        </w:tc>
+        <w:tc>
+          <w:tcPr>
+            <w:tcW w:w="5617" w:type="dxa"/>
+          </w:tcPr>
+          <w:p>
+            <w:pPr>
+              <w:jc w:val="left"/>
+            </w:pPr>
+            <w:r>
+              <w:t>Sistem berhasil membuat akun pasien baru, mengarahkan pengguna ke halaman pelengkapan data apabila akun Google belum terdaftar, serta membatasi akses halaman berdasarkan peran pengguna yang masuk (Pasien, Dokter, dan Admin).</w:t>
+            </w:r>
+          </w:p>
+        </w:tc>
+      </w:tr>
+      <w:tr>
+        <w:trPr/>
+        <w:tc>
+          <w:tcPr>
+            <w:tcW w:w="2121" w:type="dxa"/>
+          </w:tcPr>
+          <w:p>
+            <w:r>
+              <w:t>Actual Result</w:t>
+            </w:r>
+          </w:p>
+        </w:tc>
+        <w:tc>
+          <w:tcPr>
+            <w:tcW w:w="5617" w:type="dxa"/>
+          </w:tcPr>
+          <w:p>
+            <w:pPr>
+              <w:jc w:val="left"/>
+            </w:pPr>
+            <w:r>
+              <w:t>Registrasi akun pasien berhasil dilakukan melalui formulir pendaftaran dan Google Sign-In. Sistem berhasil mengarahkan pengguna untuk melengkapi data diri apabila akun belum terdaftar. Pengguna dapat login ke sistem dan pembatasan akses halaman berdasarkan peran pengguna berjalan dengan baik.</w:t>
+            </w:r>
+          </w:p>
+        </w:tc>
+      </w:tr>
+      <w:tr>
+        <w:trPr/>
+        <w:tc>
+          <w:tcPr>
+            <w:tcW w:w="2121" w:type="dxa"/>
+          </w:tcPr>
+          <w:p>
+            <w:r>
+              <w:t>Status</w:t>
+            </w:r>
+          </w:p>
+        </w:tc>
+        <w:tc>
+          <w:tcPr>
+            <w:tcW w:w="5617" w:type="dxa"/>
+          </w:tcPr>
+          <w:p>
+            <w:pPr>
+              <w:jc w:val="left"/>
+            </w:pPr>
+            <w:r>
+              <w:t>Berhasil</w:t>
+            </w:r>
+          </w:p>
+        </w:tc>
+      </w:tr>
+      <w:tr>
+        <w:trPr/>
+        <w:tc>
+          <w:tcPr>
+            <w:tcW w:w="2121" w:type="dxa"/>
+          </w:tcPr>
+          <w:p>
+            <w:r>
+              <w:t>Skenario 1: Registrasi Akun Pasien Baru</w:t>
+            </w:r>
+          </w:p>
+        </w:tc>
+        <w:tc>
+          <w:tcPr>
+            <w:tcW w:w="5617" w:type="dxa"/>
+          </w:tcPr>
+          <w:p>
+            <w:pPr>
+              <w:jc w:val="left"/>
+            </w:pPr>
+            <w:r>
+              <w:t>Pasien melakukan registrasi akun baru melalui form pendaftaran.</w:t>
+            </w:r>
+          </w:p>
+        </w:tc>
+      </w:tr>
+      <w:tr>
+        <w:trPr/>
+        <w:tc>
+          <w:tcPr>
+            <w:tcW w:w="2121" w:type="dxa"/>
+          </w:tcPr>
+          <w:p>
+            <w:r>
+              <w:t>Evidence (Skenario 1: Registrasi Akun Pasien Baru)</w:t>
             </w:r>
           </w:p>
         </w:tc>
@@ -17679,8 +17792,8 @@
             <w:r>
               <w:drawing>
                 <wp:inline xmlns:a="http://schemas.openxmlformats.org/drawingml/2006/main" xmlns:pic="http://schemas.openxmlformats.org/drawingml/2006/picture">
-                  <wp:extent cx="4389120" cy="2217420"/>
-                  <wp:docPr id="2011434102" name="Picture 2011434102"/>
+                  <wp:extent cx="4389120" cy="2265426"/>
+                  <wp:docPr id="2011434128" name="Picture 2011434128"/>
                   <wp:cNvGraphicFramePr>
                     <a:graphicFrameLocks noChangeAspect="1"/>
                   </wp:cNvGraphicFramePr>
@@ -17688,11 +17801,11 @@
                     <a:graphicData uri="http://schemas.openxmlformats.org/drawingml/2006/picture">
                       <pic:pic>
                         <pic:nvPicPr>
-                          <pic:cNvPr id="0" name="backend_fr01_1781609802322.png"/>
+                          <pic:cNvPr id="0" name="04_register_pasien_sukses_1781446961933.png"/>
                           <pic:cNvPicPr/>
                         </pic:nvPicPr>
                         <pic:blipFill>
-                          <a:blip r:embed="rId20"/>
+                          <a:blip r:embed="rId44"/>
                           <a:stretch>
                             <a:fillRect/>
                           </a:stretch>
@@ -17700,7 +17813,7 @@
                         <pic:spPr>
                           <a:xfrm>
                             <a:off x="0" y="0"/>
-                            <a:ext cx="4389120" cy="2217420"/>
+                            <a:ext cx="4389120" cy="2265426"/>
                           </a:xfrm>
                           <a:prstGeom prst="rect"/>
                         </pic:spPr>
@@ -17721,7 +17834,7 @@
           </w:tcPr>
           <w:p>
             <w:r>
-              <w:t>Expected Result</w:t>
+              <w:t>Skenario 2: Login Portal Pasien</w:t>
             </w:r>
           </w:p>
         </w:tc>
@@ -17730,8 +17843,11 @@
             <w:tcW w:w="5617" w:type="dxa"/>
           </w:tcPr>
           <w:p>
-            <w:r>
-              <w:t>Sistem berhasil membuat akun pasien baru, mengarahkan pengguna ke halaman pelengkapan data apabila akun Google belum terdaftar, serta membatasi akses halaman berdasarkan peran pengguna yang masuk (Pasien, Dokter, dan Admin).</w:t>
+            <w:pPr>
+              <w:jc w:val="left"/>
+            </w:pPr>
+            <w:r>
+              <w:t>Pasien melakukan login dengan kredensial yang baru didaftarkan.</w:t>
             </w:r>
           </w:p>
         </w:tc>
@@ -17744,53 +17860,7 @@
           </w:tcPr>
           <w:p>
             <w:r>
-              <w:t>Actual Result</w:t>
-            </w:r>
-          </w:p>
-        </w:tc>
-        <w:tc>
-          <w:tcPr>
-            <w:tcW w:w="5617" w:type="dxa"/>
-          </w:tcPr>
-          <w:p>
-            <w:r>
-              <w:t>Registrasi akun pasien berhasil dilakukan melalui formulir pendaftaran dan Google Sign-In. Sistem berhasil mengarahkan pengguna untuk melengkapi data diri apabila akun belum terdaftar. Pengguna dapat login ke sistem dan pembatasan akses halaman berdasarkan peran pengguna berjalan dengan baik.</w:t>
-            </w:r>
-          </w:p>
-        </w:tc>
-      </w:tr>
-      <w:tr>
-        <w:trPr/>
-        <w:tc>
-          <w:tcPr>
-            <w:tcW w:w="2121" w:type="dxa"/>
-          </w:tcPr>
-          <w:p>
-            <w:r>
-              <w:t>Status</w:t>
-            </w:r>
-          </w:p>
-        </w:tc>
-        <w:tc>
-          <w:tcPr>
-            <w:tcW w:w="5617" w:type="dxa"/>
-          </w:tcPr>
-          <w:p>
-            <w:r>
-              <w:t>Berhasil</w:t>
-            </w:r>
-          </w:p>
-        </w:tc>
-      </w:tr>
-      <w:tr>
-        <w:trPr/>
-        <w:tc>
-          <w:tcPr>
-            <w:tcW w:w="2121" w:type="dxa"/>
-          </w:tcPr>
-          <w:p>
-            <w:r>
-              <w:t>Evidence</w:t>
+              <w:t>Evidence (Skenario 2: Login Portal Pasien)</w:t>
             </w:r>
           </w:p>
         </w:tc>
@@ -17815,7 +17885,7 @@
               <w:drawing>
                 <wp:inline xmlns:a="http://schemas.openxmlformats.org/drawingml/2006/main" xmlns:pic="http://schemas.openxmlformats.org/drawingml/2006/picture">
                   <wp:extent cx="4389120" cy="2265426"/>
-                  <wp:docPr id="2011434103" name="Picture 2011434103"/>
+                  <wp:docPr id="2011434129" name="Picture 2011434129"/>
                   <wp:cNvGraphicFramePr>
                     <a:graphicFrameLocks noChangeAspect="1"/>
                   </wp:cNvGraphicFramePr>
@@ -17823,7 +17893,99 @@
                     <a:graphicData uri="http://schemas.openxmlformats.org/drawingml/2006/picture">
                       <pic:pic>
                         <pic:nvPicPr>
-                          <pic:cNvPr id="0" name="01_login_staf_sukses_1781491070641.png"/>
+                          <pic:cNvPr id="0" name="03_login_pasien_sukses_1781447068920.png"/>
+                          <pic:cNvPicPr/>
+                        </pic:nvPicPr>
+                        <pic:blipFill>
+                          <a:blip r:embed="rId45"/>
+                          <a:stretch>
+                            <a:fillRect/>
+                          </a:stretch>
+                        </pic:blipFill>
+                        <pic:spPr>
+                          <a:xfrm>
+                            <a:off x="0" y="0"/>
+                            <a:ext cx="4389120" cy="2265426"/>
+                          </a:xfrm>
+                          <a:prstGeom prst="rect"/>
+                        </pic:spPr>
+                      </pic:pic>
+                    </a:graphicData>
+                  </a:graphic>
+                </wp:inline>
+              </w:drawing>
+            </w:r>
+          </w:p>
+        </w:tc>
+      </w:tr>
+      <w:tr>
+        <w:trPr/>
+        <w:tc>
+          <w:tcPr>
+            <w:tcW w:w="2121" w:type="dxa"/>
+          </w:tcPr>
+          <w:p>
+            <w:r>
+              <w:t>Skenario 3: Login Portal Staf/Dokter</w:t>
+            </w:r>
+          </w:p>
+        </w:tc>
+        <w:tc>
+          <w:tcPr>
+            <w:tcW w:w="5617" w:type="dxa"/>
+          </w:tcPr>
+          <w:p>
+            <w:pPr>
+              <w:jc w:val="left"/>
+            </w:pPr>
+            <w:r>
+              <w:t>Staf internal/dokter login untuk menguji hak akses halaman internal.</w:t>
+            </w:r>
+          </w:p>
+        </w:tc>
+      </w:tr>
+      <w:tr>
+        <w:trPr/>
+        <w:tc>
+          <w:tcPr>
+            <w:tcW w:w="2121" w:type="dxa"/>
+          </w:tcPr>
+          <w:p>
+            <w:r>
+              <w:t>Evidence (Skenario 3: Login Portal Staf/Dokter)</w:t>
+            </w:r>
+          </w:p>
+        </w:tc>
+        <w:tc>
+          <w:tcPr>
+            <w:tcW w:w="5617" w:type="dxa"/>
+          </w:tcPr>
+          <w:p>
+            <w:pPr>
+              <w:pStyle w:val="DaftarParagraf"/>
+              <w:spacing w:line="360" w:lineRule="auto" w:before="80" w:after="80"/>
+              <w:ind w:left="0"/>
+              <w:jc w:val="center"/>
+              <w:rPr>
+                <w:color w:val="000000"/>
+                <w:szCs w:val="24"/>
+                <w:lang w:val="en-ID"/>
+              </w:rPr>
+            </w:pPr>
+            <w:r/>
+            <w:r>
+              <w:drawing>
+                <wp:inline xmlns:a="http://schemas.openxmlformats.org/drawingml/2006/main" xmlns:pic="http://schemas.openxmlformats.org/drawingml/2006/picture">
+                  <wp:extent cx="4389120" cy="2265426"/>
+                  <wp:docPr id="2011434130" name="Picture 2011434130"/>
+                  <wp:cNvGraphicFramePr>
+                    <a:graphicFrameLocks noChangeAspect="1"/>
+                  </wp:cNvGraphicFramePr>
+                  <a:graphic>
+                    <a:graphicData uri="http://schemas.openxmlformats.org/drawingml/2006/picture">
+                      <pic:pic>
+                        <pic:nvPicPr>
+                          <pic:cNvPr id="0" name="image.png"/>
                           <pic:cNvPicPr/>
                         </pic:nvPicPr>
                         <pic:blipFill>
@@ -17848,6 +18010,98 @@
           </w:p>
         </w:tc>
       </w:tr>
+      <w:tr>
+        <w:trPr/>
+        <w:tc>
+          <w:tcPr>
+            <w:tcW w:w="2121" w:type="dxa"/>
+          </w:tcPr>
+          <w:p>
+            <w:r>
+              <w:t>Skenario 4: Logout Pengguna</w:t>
+            </w:r>
+          </w:p>
+        </w:tc>
+        <w:tc>
+          <w:tcPr>
+            <w:tcW w:w="5617" w:type="dxa"/>
+          </w:tcPr>
+          <w:p>
+            <w:pPr>
+              <w:jc w:val="left"/>
+            </w:pPr>
+            <w:r>
+              <w:t>Pengguna melakukan logout dari sistem untuk mengakhiri sesi.</w:t>
+            </w:r>
+          </w:p>
+        </w:tc>
+      </w:tr>
+      <w:tr>
+        <w:trPr/>
+        <w:tc>
+          <w:tcPr>
+            <w:tcW w:w="2121" w:type="dxa"/>
+          </w:tcPr>
+          <w:p>
+            <w:r>
+              <w:t>Evidence (Skenario 4: Logout Pengguna)</w:t>
+            </w:r>
+          </w:p>
+        </w:tc>
+        <w:tc>
+          <w:tcPr>
+            <w:tcW w:w="5617" w:type="dxa"/>
+          </w:tcPr>
+          <w:p>
+            <w:pPr>
+              <w:pStyle w:val="DaftarParagraf"/>
+              <w:spacing w:line="360" w:lineRule="auto" w:before="80" w:after="80"/>
+              <w:ind w:left="0"/>
+              <w:jc w:val="center"/>
+              <w:rPr>
+                <w:color w:val="000000"/>
+                <w:szCs w:val="24"/>
+                <w:lang w:val="en-ID"/>
+              </w:rPr>
+            </w:pPr>
+            <w:r/>
+            <w:r>
+              <w:drawing>
+                <wp:inline xmlns:a="http://schemas.openxmlformats.org/drawingml/2006/main" xmlns:pic="http://schemas.openxmlformats.org/drawingml/2006/picture">
+                  <wp:extent cx="4389120" cy="2265426"/>
+                  <wp:docPr id="2011434131" name="Picture 2011434131"/>
+                  <wp:cNvGraphicFramePr>
+                    <a:graphicFrameLocks noChangeAspect="1"/>
+                  </wp:cNvGraphicFramePr>
+                  <a:graphic>
+                    <a:graphicData uri="http://schemas.openxmlformats.org/drawingml/2006/picture">
+                      <pic:pic>
+                        <pic:nvPicPr>
+                          <pic:cNvPr id="0" name="11_logout_pengguna_1781474544132.png"/>
+                          <pic:cNvPicPr/>
+                        </pic:nvPicPr>
+                        <pic:blipFill>
+                          <a:blip r:embed="rId46"/>
+                          <a:stretch>
+                            <a:fillRect/>
+                          </a:stretch>
+                        </pic:blipFill>
+                        <pic:spPr>
+                          <a:xfrm>
+                            <a:off x="0" y="0"/>
+                            <a:ext cx="4389120" cy="2265426"/>
+                          </a:xfrm>
+                          <a:prstGeom prst="rect"/>
+                        </pic:spPr>
+                      </pic:pic>
+                    </a:graphicData>
+                  </a:graphic>
+                </wp:inline>
+              </w:drawing>
+            </w:r>
+          </w:p>
+        </w:tc>
+      </w:tr>
     </w:tbl>
     <w:p>
       <w:pPr>
@@ -18043,6 +18297,9 @@
             <w:tcW w:w="5617" w:type="dxa"/>
           </w:tcPr>
           <w:p>
+            <w:pPr>
+              <w:jc w:val="left"/>
+            </w:pPr>
             <w:r>
               <w:t>FR-02</w:t>
             </w:r>
@@ -18066,6 +18323,9 @@
             <w:tcW w:w="5617" w:type="dxa"/>
           </w:tcPr>
           <w:p>
+            <w:pPr>
+              <w:jc w:val="left"/>
+            </w:pPr>
             <w:r>
               <w:t>Appointment Online, Tingkat Urgensi, &amp; Analisis AI</w:t>
             </w:r>
@@ -18080,7 +18340,7 @@
           </w:tcPr>
           <w:p>
             <w:r>
-              <w:t>Skenario Pengujian</w:t>
+              <w:t>Data Input</w:t>
             </w:r>
           </w:p>
         </w:tc>
@@ -18089,8 +18349,11 @@
             <w:tcW w:w="5617" w:type="dxa"/>
           </w:tcPr>
           <w:p>
-            <w:r>
-              <w:t>Pasien melakukan appointment dengan memilih Lokasi klinik dan jadwal kunjungan, mengisi form keluhan, dan mengunggah citra gigi.</w:t>
+            <w:pPr>
+              <w:jc w:val="left"/>
+            </w:pPr>
+            <w:r>
+              <w:t>Payload: { id_klinik: int, tanggal_kunjungan: date, id_jadwal: int, keluhan_utama: text, kuesioner: array[10], file_citra: binary }</w:t>
             </w:r>
           </w:p>
         </w:tc>
@@ -18103,7 +18366,111 @@
           </w:tcPr>
           <w:p>
             <w:r>
-              <w:t>Data Input</w:t>
+              <w:t>Expected Result/Kriteria Keberhasilan</w:t>
+            </w:r>
+          </w:p>
+        </w:tc>
+        <w:tc>
+          <w:tcPr>
+            <w:tcW w:w="5617" w:type="dxa"/>
+          </w:tcPr>
+          <w:p>
+            <w:pPr>
+              <w:jc w:val="left"/>
+            </w:pPr>
+            <w:r>
+              <w:t>Sistem berhasil menyimpan data appointment, menghasilkan tingkat urgensi, dan menampilkan hasil analisis AI pada dashboard dokter.</w:t>
+            </w:r>
+          </w:p>
+        </w:tc>
+      </w:tr>
+      <w:tr>
+        <w:trPr/>
+        <w:tc>
+          <w:tcPr>
+            <w:tcW w:w="2121" w:type="dxa"/>
+          </w:tcPr>
+          <w:p>
+            <w:r>
+              <w:t>Actual Result</w:t>
+            </w:r>
+          </w:p>
+        </w:tc>
+        <w:tc>
+          <w:tcPr>
+            <w:tcW w:w="5617" w:type="dxa"/>
+          </w:tcPr>
+          <w:p>
+            <w:pPr>
+              <w:jc w:val="left"/>
+            </w:pPr>
+            <w:r>
+              <w:t>Data appointment berhasil tersimpan pada database, menghasilkan tingkat urgensi Sedang, dan menampilkan hasil AI Karies pada dashboard dokter.</w:t>
+            </w:r>
+          </w:p>
+        </w:tc>
+      </w:tr>
+      <w:tr>
+        <w:trPr/>
+        <w:tc>
+          <w:tcPr>
+            <w:tcW w:w="2121" w:type="dxa"/>
+          </w:tcPr>
+          <w:p>
+            <w:r>
+              <w:t>Status</w:t>
+            </w:r>
+          </w:p>
+        </w:tc>
+        <w:tc>
+          <w:tcPr>
+            <w:tcW w:w="5617" w:type="dxa"/>
+          </w:tcPr>
+          <w:p>
+            <w:pPr>
+              <w:jc w:val="left"/>
+            </w:pPr>
+            <w:r>
+              <w:t>Berhasil</w:t>
+            </w:r>
+          </w:p>
+        </w:tc>
+      </w:tr>
+      <w:tr>
+        <w:trPr/>
+        <w:tc>
+          <w:tcPr>
+            <w:tcW w:w="2121" w:type="dxa"/>
+          </w:tcPr>
+          <w:p>
+            <w:r>
+              <w:t>Skenario 1: Reservasi Janji Temu Online</w:t>
+            </w:r>
+          </w:p>
+        </w:tc>
+        <w:tc>
+          <w:tcPr>
+            <w:tcW w:w="5617" w:type="dxa"/>
+          </w:tcPr>
+          <w:p>
+            <w:pPr>
+              <w:jc w:val="left"/>
+            </w:pPr>
+            <w:r>
+              <w:t>Pasien memilih lokasi klinik, dokter, dan jadwal kunjungan.</w:t>
+            </w:r>
+          </w:p>
+        </w:tc>
+      </w:tr>
+      <w:tr>
+        <w:trPr/>
+        <w:tc>
+          <w:tcPr>
+            <w:tcW w:w="2121" w:type="dxa"/>
+          </w:tcPr>
+          <w:p>
+            <w:r>
+              <w:t>Evidence (Skenario 1: Reservasi Janji Temu Online)</w:t>
             </w:r>
           </w:p>
         </w:tc>
@@ -18127,8 +18494,8 @@
             <w:r>
               <w:drawing>
                 <wp:inline xmlns:a="http://schemas.openxmlformats.org/drawingml/2006/main" xmlns:pic="http://schemas.openxmlformats.org/drawingml/2006/picture">
-                  <wp:extent cx="4389120" cy="2217420"/>
-                  <wp:docPr id="2011434104" name="Picture 2011434104"/>
+                  <wp:extent cx="4389120" cy="2265426"/>
+                  <wp:docPr id="2011434132" name="Picture 2011434132"/>
                   <wp:cNvGraphicFramePr>
                     <a:graphicFrameLocks noChangeAspect="1"/>
                   </wp:cNvGraphicFramePr>
@@ -18136,11 +18503,11 @@
                     <a:graphicData uri="http://schemas.openxmlformats.org/drawingml/2006/picture">
                       <pic:pic>
                         <pic:nvPicPr>
-                          <pic:cNvPr id="0" name="backend_fr02_1781609812101.png"/>
+                          <pic:cNvPr id="0" name="image.png"/>
                           <pic:cNvPicPr/>
                         </pic:nvPicPr>
                         <pic:blipFill>
-                          <a:blip r:embed="rId22"/>
+                          <a:blip r:embed="rId37"/>
                           <a:stretch>
                             <a:fillRect/>
                           </a:stretch>
@@ -18148,7 +18515,7 @@
                         <pic:spPr>
                           <a:xfrm>
                             <a:off x="0" y="0"/>
-                            <a:ext cx="4389120" cy="2217420"/>
+                            <a:ext cx="4389120" cy="2265426"/>
                           </a:xfrm>
                           <a:prstGeom prst="rect"/>
                         </pic:spPr>
@@ -18169,7 +18536,7 @@
           </w:tcPr>
           <w:p>
             <w:r>
-              <w:t>Expected Result/Kriteria Keberhasilan</w:t>
+              <w:t>Skenario 2: Form Kuesioner Keluhan Gigi</w:t>
             </w:r>
           </w:p>
         </w:tc>
@@ -18178,8 +18545,11 @@
             <w:tcW w:w="5617" w:type="dxa"/>
           </w:tcPr>
           <w:p>
-            <w:r>
-              <w:t>Sistem berhasil menyimpan data appointment, menghasilkan tingkat urgensi, dan menampilkan hasil analisis AI pada dashboard dokter.</w:t>
+            <w:pPr>
+              <w:jc w:val="left"/>
+            </w:pPr>
+            <w:r>
+              <w:t>Pasien mengisi kuesioner keluhan gigi untuk perhitungan urgensi.</w:t>
             </w:r>
           </w:p>
         </w:tc>
@@ -18192,53 +18562,7 @@
           </w:tcPr>
           <w:p>
             <w:r>
-              <w:t>Actual Result</w:t>
-            </w:r>
-          </w:p>
-        </w:tc>
-        <w:tc>
-          <w:tcPr>
-            <w:tcW w:w="5617" w:type="dxa"/>
-          </w:tcPr>
-          <w:p>
-            <w:r>
-              <w:t>Data appointment berhasil tersimpan pada database, menghasilkan tingkat urgensi Sedang, dan menampilkan hasil AI Karies pada dashboard dokter.</w:t>
-            </w:r>
-          </w:p>
-        </w:tc>
-      </w:tr>
-      <w:tr>
-        <w:trPr/>
-        <w:tc>
-          <w:tcPr>
-            <w:tcW w:w="2121" w:type="dxa"/>
-          </w:tcPr>
-          <w:p>
-            <w:r>
-              <w:t>Status</w:t>
-            </w:r>
-          </w:p>
-        </w:tc>
-        <w:tc>
-          <w:tcPr>
-            <w:tcW w:w="5617" w:type="dxa"/>
-          </w:tcPr>
-          <w:p>
-            <w:r>
-              <w:t>Berhasil</w:t>
-            </w:r>
-          </w:p>
-        </w:tc>
-      </w:tr>
-      <w:tr>
-        <w:trPr/>
-        <w:tc>
-          <w:tcPr>
-            <w:tcW w:w="2121" w:type="dxa"/>
-          </w:tcPr>
-          <w:p>
-            <w:r>
-              <w:t>Evidence</w:t>
+              <w:t>Evidence (Skenario 2: Form Kuesioner Keluhan Gigi)</w:t>
             </w:r>
           </w:p>
         </w:tc>
@@ -18263,7 +18587,7 @@
               <w:drawing>
                 <wp:inline xmlns:a="http://schemas.openxmlformats.org/drawingml/2006/main" xmlns:pic="http://schemas.openxmlformats.org/drawingml/2006/picture">
                   <wp:extent cx="4389120" cy="2265426"/>
-                  <wp:docPr id="2011434105" name="Picture 2011434105"/>
+                  <wp:docPr id="2011434133" name="Picture 2011434133"/>
                   <wp:cNvGraphicFramePr>
                     <a:graphicFrameLocks noChangeAspect="1"/>
                   </wp:cNvGraphicFramePr>
@@ -18271,7 +18595,99 @@
                     <a:graphicData uri="http://schemas.openxmlformats.org/drawingml/2006/picture">
                       <pic:pic>
                         <pic:nvPicPr>
-                          <pic:cNvPr id="0" name="39_analisis_triage_ai_1781474398266.png"/>
+                          <pic:cNvPr id="0" name="25_kuesioner_keluhan_1781457271417.png"/>
+                          <pic:cNvPicPr/>
+                        </pic:nvPicPr>
+                        <pic:blipFill>
+                          <a:blip r:embed="rId47"/>
+                          <a:stretch>
+                            <a:fillRect/>
+                          </a:stretch>
+                        </pic:blipFill>
+                        <pic:spPr>
+                          <a:xfrm>
+                            <a:off x="0" y="0"/>
+                            <a:ext cx="4389120" cy="2265426"/>
+                          </a:xfrm>
+                          <a:prstGeom prst="rect"/>
+                        </pic:spPr>
+                      </pic:pic>
+                    </a:graphicData>
+                  </a:graphic>
+                </wp:inline>
+              </w:drawing>
+            </w:r>
+          </w:p>
+        </w:tc>
+      </w:tr>
+      <w:tr>
+        <w:trPr/>
+        <w:tc>
+          <w:tcPr>
+            <w:tcW w:w="2121" w:type="dxa"/>
+          </w:tcPr>
+          <w:p>
+            <w:r>
+              <w:t>Skenario 3: Analisis Urgensi &amp; Deteksi Karies AI</w:t>
+            </w:r>
+          </w:p>
+        </w:tc>
+        <w:tc>
+          <w:tcPr>
+            <w:tcW w:w="5617" w:type="dxa"/>
+          </w:tcPr>
+          <w:p>
+            <w:pPr>
+              <w:jc w:val="left"/>
+            </w:pPr>
+            <w:r>
+              <w:t>Sistem menampilkan klasifikasi triage prioritas awal dan hasil analisis citra gigi.</w:t>
+            </w:r>
+          </w:p>
+        </w:tc>
+      </w:tr>
+      <w:tr>
+        <w:trPr/>
+        <w:tc>
+          <w:tcPr>
+            <w:tcW w:w="2121" w:type="dxa"/>
+          </w:tcPr>
+          <w:p>
+            <w:r>
+              <w:t>Evidence (Skenario 3: Analisis Urgensi &amp; Deteksi Karies AI)</w:t>
+            </w:r>
+          </w:p>
+        </w:tc>
+        <w:tc>
+          <w:tcPr>
+            <w:tcW w:w="5617" w:type="dxa"/>
+          </w:tcPr>
+          <w:p>
+            <w:pPr>
+              <w:pStyle w:val="DaftarParagraf"/>
+              <w:spacing w:line="360" w:lineRule="auto" w:before="80" w:after="80"/>
+              <w:ind w:left="0"/>
+              <w:jc w:val="center"/>
+              <w:rPr>
+                <w:color w:val="000000"/>
+                <w:szCs w:val="24"/>
+                <w:lang w:val="en-ID"/>
+              </w:rPr>
+            </w:pPr>
+            <w:r/>
+            <w:r>
+              <w:drawing>
+                <wp:inline xmlns:a="http://schemas.openxmlformats.org/drawingml/2006/main" xmlns:pic="http://schemas.openxmlformats.org/drawingml/2006/picture">
+                  <wp:extent cx="4389120" cy="2265426"/>
+                  <wp:docPr id="2011434134" name="Picture 2011434134"/>
+                  <wp:cNvGraphicFramePr>
+                    <a:graphicFrameLocks noChangeAspect="1"/>
+                  </wp:cNvGraphicFramePr>
+                  <a:graphic>
+                    <a:graphicData uri="http://schemas.openxmlformats.org/drawingml/2006/picture">
+                      <pic:pic>
+                        <pic:nvPicPr>
+                          <pic:cNvPr id="0" name="image.png"/>
                           <pic:cNvPicPr/>
                         </pic:nvPicPr>
                         <pic:blipFill>
@@ -18668,6 +19084,9 @@
             <w:tcW w:w="5617" w:type="dxa"/>
           </w:tcPr>
           <w:p>
+            <w:pPr>
+              <w:jc w:val="left"/>
+            </w:pPr>
             <w:r>
               <w:t>FR-03</w:t>
             </w:r>
@@ -18691,6 +19110,9 @@
             <w:tcW w:w="5617" w:type="dxa"/>
           </w:tcPr>
           <w:p>
+            <w:pPr>
+              <w:jc w:val="left"/>
+            </w:pPr>
             <w:r>
               <w:t>Pemantauan Antrean Pasien</w:t>
             </w:r>
@@ -18705,7 +19127,7 @@
           </w:tcPr>
           <w:p>
             <w:r>
-              <w:t>Skenario Pengujian</w:t>
+              <w:t>Data Input</w:t>
             </w:r>
           </w:p>
         </w:tc>
@@ -18714,8 +19136,11 @@
             <w:tcW w:w="5617" w:type="dxa"/>
           </w:tcPr>
           <w:p>
-            <w:r>
-              <w:t>Pasien membuka halaman lihat antrean untuk memeriksa nomor antrean, urutan pasien yang sedang dilayani, estimasi waktu pelayanan, dan status antrean. Setelah dokter mengubah status salah satu pasien, penguji melakukan refresh halaman antrean untuk memastikan data yang ditampilkan telah diperbarui sesuai data terbaru pada database.</w:t>
+            <w:pPr>
+              <w:jc w:val="left"/>
+            </w:pPr>
+            <w:r>
+              <w:t>Query Params: { id_klinik: int, tanggal: date }</w:t>
             </w:r>
           </w:p>
         </w:tc>
@@ -18728,7 +19153,111 @@
           </w:tcPr>
           <w:p>
             <w:r>
-              <w:t>Data Input</w:t>
+              <w:t>Expected Result</w:t>
+            </w:r>
+          </w:p>
+        </w:tc>
+        <w:tc>
+          <w:tcPr>
+            <w:tcW w:w="5617" w:type="dxa"/>
+          </w:tcPr>
+          <w:p>
+            <w:pPr>
+              <w:jc w:val="left"/>
+            </w:pPr>
+            <w:r>
+              <w:t>Sistem menampilkan informasi antrean pasien secara lengkap, meliputi nomor antrean, daftar antrean, estimasi waktu pelayanan, dan status pasien. Setelah halaman diperbarui, data antrean yang tampil sesuai dengan perubahan status terbaru pada database. Nama pasien lain disamarkan untuk menjaga privasi pasien.</w:t>
+            </w:r>
+          </w:p>
+        </w:tc>
+      </w:tr>
+      <w:tr>
+        <w:trPr/>
+        <w:tc>
+          <w:tcPr>
+            <w:tcW w:w="2121" w:type="dxa"/>
+          </w:tcPr>
+          <w:p>
+            <w:r>
+              <w:t>Actual Result</w:t>
+            </w:r>
+          </w:p>
+        </w:tc>
+        <w:tc>
+          <w:tcPr>
+            <w:tcW w:w="5617" w:type="dxa"/>
+          </w:tcPr>
+          <w:p>
+            <w:pPr>
+              <w:jc w:val="left"/>
+            </w:pPr>
+            <w:r>
+              <w:t>Informasi antrean berhasil ditampilkan pada halaman pasien, meliputi nomor antrean, daftar antrean, estimasi waktu pelayanan, dan status pasien. Setelah dilakukan perubahan status pasien oleh dokter, data antrean berhasil diperbarui dan ditampilkan sesuai dengan data terbaru pada database setelah halaman di-refresh. Selain itu, nama pasien lain pada daftar antrean berhasil disamarkan secara otomatis sehingga privasi pasien tetap terjaga.</w:t>
+            </w:r>
+          </w:p>
+        </w:tc>
+      </w:tr>
+      <w:tr>
+        <w:trPr/>
+        <w:tc>
+          <w:tcPr>
+            <w:tcW w:w="2121" w:type="dxa"/>
+          </w:tcPr>
+          <w:p>
+            <w:r>
+              <w:t>Status</w:t>
+            </w:r>
+          </w:p>
+        </w:tc>
+        <w:tc>
+          <w:tcPr>
+            <w:tcW w:w="5617" w:type="dxa"/>
+          </w:tcPr>
+          <w:p>
+            <w:pPr>
+              <w:jc w:val="left"/>
+            </w:pPr>
+            <w:r>
+              <w:t>Berhasil</w:t>
+            </w:r>
+          </w:p>
+        </w:tc>
+      </w:tr>
+      <w:tr>
+        <w:trPr/>
+        <w:tc>
+          <w:tcPr>
+            <w:tcW w:w="2121" w:type="dxa"/>
+          </w:tcPr>
+          <w:p>
+            <w:r>
+              <w:t>Skenario 1: Lihat Urutan Antrean Dinamis Pasien</w:t>
+            </w:r>
+          </w:p>
+        </w:tc>
+        <w:tc>
+          <w:tcPr>
+            <w:tcW w:w="5617" w:type="dxa"/>
+          </w:tcPr>
+          <w:p>
+            <w:pPr>
+              <w:jc w:val="left"/>
+            </w:pPr>
+            <w:r>
+              <w:t>Pasien memantau nomor antrean aktif dan status pelayanan.</w:t>
+            </w:r>
+          </w:p>
+        </w:tc>
+      </w:tr>
+      <w:tr>
+        <w:trPr/>
+        <w:tc>
+          <w:tcPr>
+            <w:tcW w:w="2121" w:type="dxa"/>
+          </w:tcPr>
+          <w:p>
+            <w:r>
+              <w:t>Evidence (Skenario 1: Lihat Urutan Antrean Dinamis Pasien)</w:t>
             </w:r>
           </w:p>
         </w:tc>
@@ -18752,8 +19281,8 @@
             <w:r>
               <w:drawing>
                 <wp:inline xmlns:a="http://schemas.openxmlformats.org/drawingml/2006/main" xmlns:pic="http://schemas.openxmlformats.org/drawingml/2006/picture">
-                  <wp:extent cx="4389120" cy="2217420"/>
-                  <wp:docPr id="2011434106" name="Picture 2011434106"/>
+                  <wp:extent cx="4389120" cy="2265426"/>
+                  <wp:docPr id="2011434135" name="Picture 2011434135"/>
                   <wp:cNvGraphicFramePr>
                     <a:graphicFrameLocks noChangeAspect="1"/>
                   </wp:cNvGraphicFramePr>
@@ -18761,142 +19290,7 @@
                     <a:graphicData uri="http://schemas.openxmlformats.org/drawingml/2006/picture">
                       <pic:pic>
                         <pic:nvPicPr>
-                          <pic:cNvPr id="0" name="backend_fr03_1781609829204.png"/>
-                          <pic:cNvPicPr/>
-                        </pic:nvPicPr>
-                        <pic:blipFill>
-                          <a:blip r:embed="rId24"/>
-                          <a:stretch>
-                            <a:fillRect/>
-                          </a:stretch>
-                        </pic:blipFill>
-                        <pic:spPr>
-                          <a:xfrm>
-                            <a:off x="0" y="0"/>
-                            <a:ext cx="4389120" cy="2217420"/>
-                          </a:xfrm>
-                          <a:prstGeom prst="rect"/>
-                        </pic:spPr>
-                      </pic:pic>
-                    </a:graphicData>
-                  </a:graphic>
-                </wp:inline>
-              </w:drawing>
-            </w:r>
-          </w:p>
-        </w:tc>
-      </w:tr>
-      <w:tr>
-        <w:trPr/>
-        <w:tc>
-          <w:tcPr>
-            <w:tcW w:w="2121" w:type="dxa"/>
-          </w:tcPr>
-          <w:p>
-            <w:r>
-              <w:t>Expected Result</w:t>
-            </w:r>
-          </w:p>
-        </w:tc>
-        <w:tc>
-          <w:tcPr>
-            <w:tcW w:w="5617" w:type="dxa"/>
-          </w:tcPr>
-          <w:p>
-            <w:r>
-              <w:t>Sistem menampilkan informasi antrean pasien secara lengkap, meliputi nomor antrean, daftar antrean, estimasi waktu pelayanan, dan status pasien. Setelah halaman diperbarui, data antrean yang tampil sesuai dengan perubahan status terbaru pada database. Nama pasien lain disamarkan untuk menjaga privasi pasien.</w:t>
-            </w:r>
-          </w:p>
-        </w:tc>
-      </w:tr>
-      <w:tr>
-        <w:trPr/>
-        <w:tc>
-          <w:tcPr>
-            <w:tcW w:w="2121" w:type="dxa"/>
-          </w:tcPr>
-          <w:p>
-            <w:r>
-              <w:t>Actual Result</w:t>
-            </w:r>
-          </w:p>
-        </w:tc>
-        <w:tc>
-          <w:tcPr>
-            <w:tcW w:w="5617" w:type="dxa"/>
-          </w:tcPr>
-          <w:p>
-            <w:r>
-              <w:t>Informasi antrean berhasil ditampilkan pada halaman pasien, meliputi nomor antrean, daftar antrean, estimasi waktu pelayanan, dan status pasien. Setelah dilakukan perubahan status pasien oleh dokter, data antrean berhasil diperbarui dan ditampilkan sesuai dengan data terbaru pada database setelah halaman di-refresh. Selain itu, nama pasien lain pada daftar antrean berhasil disamarkan secara otomatis sehingga privasi pasien tetap terjaga.</w:t>
-            </w:r>
-          </w:p>
-        </w:tc>
-      </w:tr>
-      <w:tr>
-        <w:trPr/>
-        <w:tc>
-          <w:tcPr>
-            <w:tcW w:w="2121" w:type="dxa"/>
-          </w:tcPr>
-          <w:p>
-            <w:r>
-              <w:t>Status</w:t>
-            </w:r>
-          </w:p>
-        </w:tc>
-        <w:tc>
-          <w:tcPr>
-            <w:tcW w:w="5617" w:type="dxa"/>
-          </w:tcPr>
-          <w:p>
-            <w:r>
-              <w:t>Berhasil</w:t>
-            </w:r>
-          </w:p>
-        </w:tc>
-      </w:tr>
-      <w:tr>
-        <w:trPr/>
-        <w:tc>
-          <w:tcPr>
-            <w:tcW w:w="2121" w:type="dxa"/>
-          </w:tcPr>
-          <w:p>
-            <w:r>
-              <w:t>Evidence</w:t>
-            </w:r>
-          </w:p>
-        </w:tc>
-        <w:tc>
-          <w:tcPr>
-            <w:tcW w:w="5617" w:type="dxa"/>
-          </w:tcPr>
-          <w:p>
-            <w:pPr>
-              <w:pStyle w:val="DaftarParagraf"/>
-              <w:spacing w:line="360" w:lineRule="auto" w:before="80" w:after="80"/>
-              <w:ind w:left="0"/>
-              <w:jc w:val="center"/>
-              <w:rPr>
-                <w:color w:val="000000"/>
-                <w:szCs w:val="24"/>
-                <w:lang w:val="en-ID"/>
-              </w:rPr>
-            </w:pPr>
-            <w:r/>
-            <w:r>
-              <w:drawing>
-                <wp:inline xmlns:a="http://schemas.openxmlformats.org/drawingml/2006/main" xmlns:pic="http://schemas.openxmlformats.org/drawingml/2006/picture">
-                  <wp:extent cx="4389120" cy="2265426"/>
-                  <wp:docPr id="2011434107" name="Picture 2011434107"/>
-                  <wp:cNvGraphicFramePr>
-                    <a:graphicFrameLocks noChangeAspect="1"/>
-                  </wp:cNvGraphicFramePr>
-                  <a:graphic>
-                    <a:graphicData uri="http://schemas.openxmlformats.org/drawingml/2006/picture">
-                      <pic:pic>
-                        <pic:nvPicPr>
-                          <pic:cNvPr id="0" name="40_urutan_antrian_dinamis_1781474527553.png"/>
+                          <pic:cNvPr id="0" name="image.png"/>
                           <pic:cNvPicPr/>
                         </pic:nvPicPr>
                         <pic:blipFill>
@@ -19145,6 +19539,9 @@
             <w:tcW w:w="5617" w:type="dxa"/>
           </w:tcPr>
           <w:p>
+            <w:pPr>
+              <w:jc w:val="left"/>
+            </w:pPr>
             <w:r>
               <w:t>FR-04</w:t>
             </w:r>
@@ -19168,6 +19565,9 @@
             <w:tcW w:w="5617" w:type="dxa"/>
           </w:tcPr>
           <w:p>
+            <w:pPr>
+              <w:jc w:val="left"/>
+            </w:pPr>
             <w:r>
               <w:t>Detail pasien dokter</w:t>
             </w:r>
@@ -19182,7 +19582,7 @@
           </w:tcPr>
           <w:p>
             <w:r>
-              <w:t>Skenario Pengujian</w:t>
+              <w:t>Data Input</w:t>
             </w:r>
           </w:p>
         </w:tc>
@@ -19191,8 +19591,11 @@
             <w:tcW w:w="5617" w:type="dxa"/>
           </w:tcPr>
           <w:p>
-            <w:r>
-              <w:t>Dokter membuka halaman detail pasien yang sedang mengantre untuk memverifikasi data diri pasien, jawaban form keluhan, foto gigi, dan hasil analisis AI yang ditampilkan oleh sistem.</w:t>
+            <w:pPr>
+              <w:jc w:val="left"/>
+            </w:pPr>
+            <w:r>
+              <w:t>Path Params: { id_appointment: int }</w:t>
             </w:r>
           </w:p>
         </w:tc>
@@ -19205,7 +19608,111 @@
           </w:tcPr>
           <w:p>
             <w:r>
-              <w:t>Data Input</w:t>
+              <w:t>Expected Result</w:t>
+            </w:r>
+          </w:p>
+        </w:tc>
+        <w:tc>
+          <w:tcPr>
+            <w:tcW w:w="5617" w:type="dxa"/>
+          </w:tcPr>
+          <w:p>
+            <w:pPr>
+              <w:jc w:val="left"/>
+            </w:pPr>
+            <w:r>
+              <w:t>Sistem menampilkan data diri pasien, jawaban form keluhan, foto gigi, serta hasil analisis AI secara lengkap dan sesuai dengan data yang diinput oleh pasien.</w:t>
+            </w:r>
+          </w:p>
+        </w:tc>
+      </w:tr>
+      <w:tr>
+        <w:trPr/>
+        <w:tc>
+          <w:tcPr>
+            <w:tcW w:w="2121" w:type="dxa"/>
+          </w:tcPr>
+          <w:p>
+            <w:r>
+              <w:t>Actual Result</w:t>
+            </w:r>
+          </w:p>
+        </w:tc>
+        <w:tc>
+          <w:tcPr>
+            <w:tcW w:w="5617" w:type="dxa"/>
+          </w:tcPr>
+          <w:p>
+            <w:pPr>
+              <w:jc w:val="left"/>
+            </w:pPr>
+            <w:r>
+              <w:t>Seluruh data pasien berhasil ditampilkan dengan lengkap dan sesuai dengan data yang tersimpan pada sistem. Informasi keluhan pasien, foto gigi, dan hasil analisis AI dapat diakses oleh dokter tanpa kendala.</w:t>
+            </w:r>
+          </w:p>
+        </w:tc>
+      </w:tr>
+      <w:tr>
+        <w:trPr/>
+        <w:tc>
+          <w:tcPr>
+            <w:tcW w:w="2121" w:type="dxa"/>
+          </w:tcPr>
+          <w:p>
+            <w:r>
+              <w:t>Status</w:t>
+            </w:r>
+          </w:p>
+        </w:tc>
+        <w:tc>
+          <w:tcPr>
+            <w:tcW w:w="5617" w:type="dxa"/>
+          </w:tcPr>
+          <w:p>
+            <w:pPr>
+              <w:jc w:val="left"/>
+            </w:pPr>
+            <w:r>
+              <w:t>Berhasil</w:t>
+            </w:r>
+          </w:p>
+        </w:tc>
+      </w:tr>
+      <w:tr>
+        <w:trPr/>
+        <w:tc>
+          <w:tcPr>
+            <w:tcW w:w="2121" w:type="dxa"/>
+          </w:tcPr>
+          <w:p>
+            <w:r>
+              <w:t>Skenario 1: Verifikasi Keluhan &amp; Analisis AI oleh Dokter</w:t>
+            </w:r>
+          </w:p>
+        </w:tc>
+        <w:tc>
+          <w:tcPr>
+            <w:tcW w:w="5617" w:type="dxa"/>
+          </w:tcPr>
+          <w:p>
+            <w:pPr>
+              <w:jc w:val="left"/>
+            </w:pPr>
+            <w:r>
+              <w:t>Dokter membuka dashboard detail pasien untuk memverifikasi anamnesis AI.</w:t>
+            </w:r>
+          </w:p>
+        </w:tc>
+      </w:tr>
+      <w:tr>
+        <w:trPr/>
+        <w:tc>
+          <w:tcPr>
+            <w:tcW w:w="2121" w:type="dxa"/>
+          </w:tcPr>
+          <w:p>
+            <w:r>
+              <w:t>Evidence (Skenario 1: Verifikasi Keluhan &amp; Analisis AI oleh Dokter)</w:t>
             </w:r>
           </w:p>
         </w:tc>
@@ -19229,8 +19736,8 @@
             <w:r>
               <w:drawing>
                 <wp:inline xmlns:a="http://schemas.openxmlformats.org/drawingml/2006/main" xmlns:pic="http://schemas.openxmlformats.org/drawingml/2006/picture">
-                  <wp:extent cx="4389120" cy="2217420"/>
-                  <wp:docPr id="2011434108" name="Picture 2011434108"/>
+                  <wp:extent cx="4389120" cy="2265426"/>
+                  <wp:docPr id="2011434136" name="Picture 2011434136"/>
                   <wp:cNvGraphicFramePr>
                     <a:graphicFrameLocks noChangeAspect="1"/>
                   </wp:cNvGraphicFramePr>
@@ -19238,142 +19745,7 @@
                     <a:graphicData uri="http://schemas.openxmlformats.org/drawingml/2006/picture">
                       <pic:pic>
                         <pic:nvPicPr>
-                          <pic:cNvPr id="0" name="backend_fr04_1781609835927.png"/>
-                          <pic:cNvPicPr/>
-                        </pic:nvPicPr>
-                        <pic:blipFill>
-                          <a:blip r:embed="rId26"/>
-                          <a:stretch>
-                            <a:fillRect/>
-                          </a:stretch>
-                        </pic:blipFill>
-                        <pic:spPr>
-                          <a:xfrm>
-                            <a:off x="0" y="0"/>
-                            <a:ext cx="4389120" cy="2217420"/>
-                          </a:xfrm>
-                          <a:prstGeom prst="rect"/>
-                        </pic:spPr>
-                      </pic:pic>
-                    </a:graphicData>
-                  </a:graphic>
-                </wp:inline>
-              </w:drawing>
-            </w:r>
-          </w:p>
-        </w:tc>
-      </w:tr>
-      <w:tr>
-        <w:trPr/>
-        <w:tc>
-          <w:tcPr>
-            <w:tcW w:w="2121" w:type="dxa"/>
-          </w:tcPr>
-          <w:p>
-            <w:r>
-              <w:t>Expected Result</w:t>
-            </w:r>
-          </w:p>
-        </w:tc>
-        <w:tc>
-          <w:tcPr>
-            <w:tcW w:w="5617" w:type="dxa"/>
-          </w:tcPr>
-          <w:p>
-            <w:r>
-              <w:t>Sistem menampilkan data diri pasien, jawaban form keluhan, foto gigi, serta hasil analisis AI secara lengkap dan sesuai dengan data yang diinput oleh pasien.</w:t>
-            </w:r>
-          </w:p>
-        </w:tc>
-      </w:tr>
-      <w:tr>
-        <w:trPr/>
-        <w:tc>
-          <w:tcPr>
-            <w:tcW w:w="2121" w:type="dxa"/>
-          </w:tcPr>
-          <w:p>
-            <w:r>
-              <w:t>Actual Result</w:t>
-            </w:r>
-          </w:p>
-        </w:tc>
-        <w:tc>
-          <w:tcPr>
-            <w:tcW w:w="5617" w:type="dxa"/>
-          </w:tcPr>
-          <w:p>
-            <w:r>
-              <w:t>Seluruh data pasien berhasil ditampilkan dengan lengkap dan sesuai dengan data yang tersimpan pada sistem. Informasi keluhan pasien, foto gigi, dan hasil analisis AI dapat diakses oleh dokter tanpa kendala.</w:t>
-            </w:r>
-          </w:p>
-        </w:tc>
-      </w:tr>
-      <w:tr>
-        <w:trPr/>
-        <w:tc>
-          <w:tcPr>
-            <w:tcW w:w="2121" w:type="dxa"/>
-          </w:tcPr>
-          <w:p>
-            <w:r>
-              <w:t>Status</w:t>
-            </w:r>
-          </w:p>
-        </w:tc>
-        <w:tc>
-          <w:tcPr>
-            <w:tcW w:w="5617" w:type="dxa"/>
-          </w:tcPr>
-          <w:p>
-            <w:r>
-              <w:t>Berhasil</w:t>
-            </w:r>
-          </w:p>
-        </w:tc>
-      </w:tr>
-      <w:tr>
-        <w:trPr/>
-        <w:tc>
-          <w:tcPr>
-            <w:tcW w:w="2121" w:type="dxa"/>
-          </w:tcPr>
-          <w:p>
-            <w:r>
-              <w:t>Evidence</w:t>
-            </w:r>
-          </w:p>
-        </w:tc>
-        <w:tc>
-          <w:tcPr>
-            <w:tcW w:w="5617" w:type="dxa"/>
-          </w:tcPr>
-          <w:p>
-            <w:pPr>
-              <w:pStyle w:val="DaftarParagraf"/>
-              <w:spacing w:line="360" w:lineRule="auto" w:before="80" w:after="80"/>
-              <w:ind w:left="0"/>
-              <w:jc w:val="center"/>
-              <w:rPr>
-                <w:color w:val="000000"/>
-                <w:szCs w:val="24"/>
-                <w:lang w:val="en-ID"/>
-              </w:rPr>
-            </w:pPr>
-            <w:r/>
-            <w:r>
-              <w:drawing>
-                <wp:inline xmlns:a="http://schemas.openxmlformats.org/drawingml/2006/main" xmlns:pic="http://schemas.openxmlformats.org/drawingml/2006/picture">
-                  <wp:extent cx="4389120" cy="2265426"/>
-                  <wp:docPr id="2011434109" name="Picture 2011434109"/>
-                  <wp:cNvGraphicFramePr>
-                    <a:graphicFrameLocks noChangeAspect="1"/>
-                  </wp:cNvGraphicFramePr>
-                  <a:graphic>
-                    <a:graphicData uri="http://schemas.openxmlformats.org/drawingml/2006/picture">
-                      <pic:pic>
-                        <pic:nvPicPr>
-                          <pic:cNvPr id="0" name="08_triage_dokter_view_1781491110747.png"/>
+                          <pic:cNvPr id="0" name="image.png"/>
                           <pic:cNvPicPr/>
                         </pic:nvPicPr>
                         <pic:blipFill>
@@ -19622,6 +19994,9 @@
             <w:tcW w:w="5617" w:type="dxa"/>
           </w:tcPr>
           <w:p>
+            <w:pPr>
+              <w:jc w:val="left"/>
+            </w:pPr>
             <w:r>
               <w:t>FR-05</w:t>
             </w:r>
@@ -19645,6 +20020,9 @@
             <w:tcW w:w="5617" w:type="dxa"/>
           </w:tcPr>
           <w:p>
+            <w:pPr>
+              <w:jc w:val="left"/>
+            </w:pPr>
             <w:r>
               <w:t>Rekam Medis &amp; Unduh PDF</w:t>
             </w:r>
@@ -19659,7 +20037,7 @@
           </w:tcPr>
           <w:p>
             <w:r>
-              <w:t>Skenario Pengujian</w:t>
+              <w:t>Data Input</w:t>
             </w:r>
           </w:p>
         </w:tc>
@@ -19668,8 +20046,11 @@
             <w:tcW w:w="5617" w:type="dxa"/>
           </w:tcPr>
           <w:p>
-            <w:r>
-              <w:t>Dokter mengisi formulir rekam medis yang meliputi catatan diagnosis, tindakan medis, dan resep obat melalui dashboard dokter. Setelah data disimpan, pasien mengakses menu riwayat rekam medis dan mengunduh rekam medis dalam format PDF.</w:t>
+            <w:pPr>
+              <w:jc w:val="left"/>
+            </w:pPr>
+            <w:r>
+              <w:t>Payload: { id_appointment: int, keluhan: text, diagnosis: string(ICD-10), tindakan: string, resep: array[{id_obat, dosis, qty}], odontogram: array[{gigi, kondisi}] }</w:t>
             </w:r>
           </w:p>
         </w:tc>
@@ -19682,7 +20063,111 @@
           </w:tcPr>
           <w:p>
             <w:r>
-              <w:t>Data Input</w:t>
+              <w:t>Expected Result</w:t>
+            </w:r>
+          </w:p>
+        </w:tc>
+        <w:tc>
+          <w:tcPr>
+            <w:tcW w:w="5617" w:type="dxa"/>
+          </w:tcPr>
+          <w:p>
+            <w:pPr>
+              <w:jc w:val="left"/>
+            </w:pPr>
+            <w:r>
+              <w:t>Sistem berhasil menyimpan data rekam medis yang diinput oleh dokter dan pasien dapat mengakses serta mengunduh rekam medis dalam format PDF melalui akun pasien.</w:t>
+            </w:r>
+          </w:p>
+        </w:tc>
+      </w:tr>
+      <w:tr>
+        <w:trPr/>
+        <w:tc>
+          <w:tcPr>
+            <w:tcW w:w="2121" w:type="dxa"/>
+          </w:tcPr>
+          <w:p>
+            <w:r>
+              <w:t>Actual Result</w:t>
+            </w:r>
+          </w:p>
+        </w:tc>
+        <w:tc>
+          <w:tcPr>
+            <w:tcW w:w="5617" w:type="dxa"/>
+          </w:tcPr>
+          <w:p>
+            <w:pPr>
+              <w:jc w:val="left"/>
+            </w:pPr>
+            <w:r>
+              <w:t>Data rekam medis berhasil disimpan ke dalam sistem. Pasien dapat melihat riwayat rekam medis dan mengunduh dokumen rekam medis dalam format PDF sesuai data yang telah diinput oleh dokter.</w:t>
+            </w:r>
+          </w:p>
+        </w:tc>
+      </w:tr>
+      <w:tr>
+        <w:trPr/>
+        <w:tc>
+          <w:tcPr>
+            <w:tcW w:w="2121" w:type="dxa"/>
+          </w:tcPr>
+          <w:p>
+            <w:r>
+              <w:t>Status</w:t>
+            </w:r>
+          </w:p>
+        </w:tc>
+        <w:tc>
+          <w:tcPr>
+            <w:tcW w:w="5617" w:type="dxa"/>
+          </w:tcPr>
+          <w:p>
+            <w:pPr>
+              <w:jc w:val="left"/>
+            </w:pPr>
+            <w:r>
+              <w:t>Berhasil</w:t>
+            </w:r>
+          </w:p>
+        </w:tc>
+      </w:tr>
+      <w:tr>
+        <w:trPr/>
+        <w:tc>
+          <w:tcPr>
+            <w:tcW w:w="2121" w:type="dxa"/>
+          </w:tcPr>
+          <w:p>
+            <w:r>
+              <w:t>Skenario 1: Pengoperasian Odontogram Interaktif</w:t>
+            </w:r>
+          </w:p>
+        </w:tc>
+        <w:tc>
+          <w:tcPr>
+            <w:tcW w:w="5617" w:type="dxa"/>
+          </w:tcPr>
+          <w:p>
+            <w:pPr>
+              <w:jc w:val="left"/>
+            </w:pPr>
+            <w:r>
+              <w:t>Dokter mencatat kondisi gigi pasien pada form odontogram SVG.</w:t>
+            </w:r>
+          </w:p>
+        </w:tc>
+      </w:tr>
+      <w:tr>
+        <w:trPr/>
+        <w:tc>
+          <w:tcPr>
+            <w:tcW w:w="2121" w:type="dxa"/>
+          </w:tcPr>
+          <w:p>
+            <w:r>
+              <w:t>Evidence (Skenario 1: Pengoperasian Odontogram Interaktif)</w:t>
             </w:r>
           </w:p>
         </w:tc>
@@ -19706,8 +20191,8 @@
             <w:r>
               <w:drawing>
                 <wp:inline xmlns:a="http://schemas.openxmlformats.org/drawingml/2006/main" xmlns:pic="http://schemas.openxmlformats.org/drawingml/2006/picture">
-                  <wp:extent cx="4389120" cy="2217420"/>
-                  <wp:docPr id="2011434110" name="Picture 2011434110"/>
+                  <wp:extent cx="4389120" cy="2265426"/>
+                  <wp:docPr id="2011434137" name="Picture 2011434137"/>
                   <wp:cNvGraphicFramePr>
                     <a:graphicFrameLocks noChangeAspect="1"/>
                   </wp:cNvGraphicFramePr>
@@ -19715,11 +20200,11 @@
                     <a:graphicData uri="http://schemas.openxmlformats.org/drawingml/2006/picture">
                       <pic:pic>
                         <pic:nvPicPr>
-                          <pic:cNvPr id="0" name="backend_fr05_1781609842192.png"/>
+                          <pic:cNvPr id="0" name="44_odontogram_interaktif_1781491174771.png"/>
                           <pic:cNvPicPr/>
                         </pic:nvPicPr>
                         <pic:blipFill>
-                          <a:blip r:embed="rId28"/>
+                          <a:blip r:embed="rId48"/>
                           <a:stretch>
                             <a:fillRect/>
                           </a:stretch>
@@ -19727,7 +20212,7 @@
                         <pic:spPr>
                           <a:xfrm>
                             <a:off x="0" y="0"/>
-                            <a:ext cx="4389120" cy="2217420"/>
+                            <a:ext cx="4389120" cy="2265426"/>
                           </a:xfrm>
                           <a:prstGeom prst="rect"/>
                         </pic:spPr>
@@ -19748,7 +20233,7 @@
           </w:tcPr>
           <w:p>
             <w:r>
-              <w:t>Expected Result</w:t>
+              <w:t>Skenario 2: Pencatatan Diagnosa &amp; Tindakan Medis</w:t>
             </w:r>
           </w:p>
         </w:tc>
@@ -19757,8 +20242,11 @@
             <w:tcW w:w="5617" w:type="dxa"/>
           </w:tcPr>
           <w:p>
-            <w:r>
-              <w:t>Sistem berhasil menyimpan data rekam medis yang diinput oleh dokter dan pasien dapat mengakses serta mengunduh rekam medis dalam format PDF melalui akun pasien.</w:t>
+            <w:pPr>
+              <w:jc w:val="left"/>
+            </w:pPr>
+            <w:r>
+              <w:t>Dokter menginput rekam medis pasien di dashboard pemeriksaan.</w:t>
             </w:r>
           </w:p>
         </w:tc>
@@ -19771,53 +20259,7 @@
           </w:tcPr>
           <w:p>
             <w:r>
-              <w:t>Actual Result</w:t>
-            </w:r>
-          </w:p>
-        </w:tc>
-        <w:tc>
-          <w:tcPr>
-            <w:tcW w:w="5617" w:type="dxa"/>
-          </w:tcPr>
-          <w:p>
-            <w:r>
-              <w:t>Data rekam medis berhasil disimpan ke dalam sistem. Pasien dapat melihat riwayat rekam medis dan mengunduh dokumen rekam medis dalam format PDF sesuai data yang telah diinput oleh dokter.</w:t>
-            </w:r>
-          </w:p>
-        </w:tc>
-      </w:tr>
-      <w:tr>
-        <w:trPr/>
-        <w:tc>
-          <w:tcPr>
-            <w:tcW w:w="2121" w:type="dxa"/>
-          </w:tcPr>
-          <w:p>
-            <w:r>
-              <w:t>Status</w:t>
-            </w:r>
-          </w:p>
-        </w:tc>
-        <w:tc>
-          <w:tcPr>
-            <w:tcW w:w="5617" w:type="dxa"/>
-          </w:tcPr>
-          <w:p>
-            <w:r>
-              <w:t>Berhasil</w:t>
-            </w:r>
-          </w:p>
-        </w:tc>
-      </w:tr>
-      <w:tr>
-        <w:trPr/>
-        <w:tc>
-          <w:tcPr>
-            <w:tcW w:w="2121" w:type="dxa"/>
-          </w:tcPr>
-          <w:p>
-            <w:r>
-              <w:t>Evidence</w:t>
+              <w:t>Evidence (Skenario 2: Pencatatan Diagnosa &amp; Tindakan Medis)</w:t>
             </w:r>
           </w:p>
         </w:tc>
@@ -19842,7 +20284,7 @@
               <w:drawing>
                 <wp:inline xmlns:a="http://schemas.openxmlformats.org/drawingml/2006/main" xmlns:pic="http://schemas.openxmlformats.org/drawingml/2006/picture">
                   <wp:extent cx="4389120" cy="2265426"/>
-                  <wp:docPr id="2011434111" name="Picture 2011434111"/>
+                  <wp:docPr id="2011434138" name="Picture 2011434138"/>
                   <wp:cNvGraphicFramePr>
                     <a:graphicFrameLocks noChangeAspect="1"/>
                   </wp:cNvGraphicFramePr>
@@ -19850,7 +20292,7 @@
                     <a:graphicData uri="http://schemas.openxmlformats.org/drawingml/2006/picture">
                       <pic:pic>
                         <pic:nvPicPr>
-                          <pic:cNvPr id="0" name="47_catat_rekam_medis_1781491292298.png"/>
+                          <pic:cNvPr id="0" name="image.png"/>
                           <pic:cNvPicPr/>
                         </pic:nvPicPr>
                         <pic:blipFill>
@@ -19875,6 +20317,190 @@
           </w:p>
         </w:tc>
       </w:tr>
+      <w:tr>
+        <w:trPr/>
+        <w:tc>
+          <w:tcPr>
+            <w:tcW w:w="2121" w:type="dxa"/>
+          </w:tcPr>
+          <w:p>
+            <w:r>
+              <w:t>Skenario 3: Penulisan Resep Obat</w:t>
+            </w:r>
+          </w:p>
+        </w:tc>
+        <w:tc>
+          <w:tcPr>
+            <w:tcW w:w="5617" w:type="dxa"/>
+          </w:tcPr>
+          <w:p>
+            <w:pPr>
+              <w:jc w:val="left"/>
+            </w:pPr>
+            <w:r>
+              <w:t>Dokter meresepkan obat melalui form resep obat terintegrasi.</w:t>
+            </w:r>
+          </w:p>
+        </w:tc>
+      </w:tr>
+      <w:tr>
+        <w:trPr/>
+        <w:tc>
+          <w:tcPr>
+            <w:tcW w:w="2121" w:type="dxa"/>
+          </w:tcPr>
+          <w:p>
+            <w:r>
+              <w:t>Evidence (Skenario 3: Penulisan Resep Obat)</w:t>
+            </w:r>
+          </w:p>
+        </w:tc>
+        <w:tc>
+          <w:tcPr>
+            <w:tcW w:w="5617" w:type="dxa"/>
+          </w:tcPr>
+          <w:p>
+            <w:pPr>
+              <w:pStyle w:val="DaftarParagraf"/>
+              <w:spacing w:line="360" w:lineRule="auto" w:before="80" w:after="80"/>
+              <w:ind w:left="0"/>
+              <w:jc w:val="center"/>
+              <w:rPr>
+                <w:color w:val="000000"/>
+                <w:szCs w:val="24"/>
+                <w:lang w:val="en-ID"/>
+              </w:rPr>
+            </w:pPr>
+            <w:r/>
+            <w:r>
+              <w:drawing>
+                <wp:inline xmlns:a="http://schemas.openxmlformats.org/drawingml/2006/main" xmlns:pic="http://schemas.openxmlformats.org/drawingml/2006/picture">
+                  <wp:extent cx="4389120" cy="2265426"/>
+                  <wp:docPr id="2011434139" name="Picture 2011434139"/>
+                  <wp:cNvGraphicFramePr>
+                    <a:graphicFrameLocks noChangeAspect="1"/>
+                  </wp:cNvGraphicFramePr>
+                  <a:graphic>
+                    <a:graphicData uri="http://schemas.openxmlformats.org/drawingml/2006/picture">
+                      <pic:pic>
+                        <pic:nvPicPr>
+                          <pic:cNvPr id="0" name="48_input_resep_obat_1781491341417.png"/>
+                          <pic:cNvPicPr/>
+                        </pic:nvPicPr>
+                        <pic:blipFill>
+                          <a:blip r:embed="rId49"/>
+                          <a:stretch>
+                            <a:fillRect/>
+                          </a:stretch>
+                        </pic:blipFill>
+                        <pic:spPr>
+                          <a:xfrm>
+                            <a:off x="0" y="0"/>
+                            <a:ext cx="4389120" cy="2265426"/>
+                          </a:xfrm>
+                          <a:prstGeom prst="rect"/>
+                        </pic:spPr>
+                      </pic:pic>
+                    </a:graphicData>
+                  </a:graphic>
+                </wp:inline>
+              </w:drawing>
+            </w:r>
+          </w:p>
+        </w:tc>
+      </w:tr>
+      <w:tr>
+        <w:trPr/>
+        <w:tc>
+          <w:tcPr>
+            <w:tcW w:w="2121" w:type="dxa"/>
+          </w:tcPr>
+          <w:p>
+            <w:r>
+              <w:t>Skenario 4: Cetak &amp; Unduh PDF Rekam Medis / Resep</w:t>
+            </w:r>
+          </w:p>
+        </w:tc>
+        <w:tc>
+          <w:tcPr>
+            <w:tcW w:w="5617" w:type="dxa"/>
+          </w:tcPr>
+          <w:p>
+            <w:pPr>
+              <w:jc w:val="left"/>
+            </w:pPr>
+            <w:r>
+              <w:t>Pasien mengunduh file PDF rekam medis hasil pemeriksaan.</w:t>
+            </w:r>
+          </w:p>
+        </w:tc>
+      </w:tr>
+      <w:tr>
+        <w:trPr/>
+        <w:tc>
+          <w:tcPr>
+            <w:tcW w:w="2121" w:type="dxa"/>
+          </w:tcPr>
+          <w:p>
+            <w:r>
+              <w:t>Evidence (Skenario 4: Cetak &amp; Unduh PDF Rekam Medis / Resep)</w:t>
+            </w:r>
+          </w:p>
+        </w:tc>
+        <w:tc>
+          <w:tcPr>
+            <w:tcW w:w="5617" w:type="dxa"/>
+          </w:tcPr>
+          <w:p>
+            <w:pPr>
+              <w:pStyle w:val="DaftarParagraf"/>
+              <w:spacing w:line="360" w:lineRule="auto" w:before="80" w:after="80"/>
+              <w:ind w:left="0"/>
+              <w:jc w:val="center"/>
+              <w:rPr>
+                <w:color w:val="000000"/>
+                <w:szCs w:val="24"/>
+                <w:lang w:val="en-ID"/>
+              </w:rPr>
+            </w:pPr>
+            <w:r/>
+            <w:r>
+              <w:drawing>
+                <wp:inline xmlns:a="http://schemas.openxmlformats.org/drawingml/2006/main" xmlns:pic="http://schemas.openxmlformats.org/drawingml/2006/picture">
+                  <wp:extent cx="4389120" cy="2265426"/>
+                  <wp:docPr id="2011434140" name="Picture 2011434140"/>
+                  <wp:cNvGraphicFramePr>
+                    <a:graphicFrameLocks noChangeAspect="1"/>
+                  </wp:cNvGraphicFramePr>
+                  <a:graphic>
+                    <a:graphicData uri="http://schemas.openxmlformats.org/drawingml/2006/picture">
+                      <pic:pic>
+                        <pic:nvPicPr>
+                          <pic:cNvPr id="0" name="37_cetak_nota_resep_pdf_1781491543637.png"/>
+                          <pic:cNvPicPr/>
+                        </pic:nvPicPr>
+                        <pic:blipFill>
+                          <a:blip r:embed="rId50"/>
+                          <a:stretch>
+                            <a:fillRect/>
+                          </a:stretch>
+                        </pic:blipFill>
+                        <pic:spPr>
+                          <a:xfrm>
+                            <a:off x="0" y="0"/>
+                            <a:ext cx="4389120" cy="2265426"/>
+                          </a:xfrm>
+                          <a:prstGeom prst="rect"/>
+                        </pic:spPr>
+                      </pic:pic>
+                    </a:graphicData>
+                  </a:graphic>
+                </wp:inline>
+              </w:drawing>
+            </w:r>
+          </w:p>
+        </w:tc>
+      </w:tr>
     </w:tbl>
     <w:p>
       <w:pPr>
@@ -20086,6 +20712,9 @@
             <w:tcW w:w="5617" w:type="dxa"/>
           </w:tcPr>
           <w:p>
+            <w:pPr>
+              <w:jc w:val="left"/>
+            </w:pPr>
             <w:r>
               <w:t>FR-06</w:t>
             </w:r>
@@ -20109,6 +20738,9 @@
             <w:tcW w:w="5617" w:type="dxa"/>
           </w:tcPr>
           <w:p>
+            <w:pPr>
+              <w:jc w:val="left"/>
+            </w:pPr>
             <w:r>
               <w:t>Pembayaran &amp; Kasir</w:t>
             </w:r>
@@ -20123,7 +20755,7 @@
           </w:tcPr>
           <w:p>
             <w:r>
-              <w:t>Skenario Pengujian</w:t>
+              <w:t>Data Input</w:t>
             </w:r>
           </w:p>
         </w:tc>
@@ -20132,8 +20764,11 @@
             <w:tcW w:w="5617" w:type="dxa"/>
           </w:tcPr>
           <w:p>
-            <w:r>
-              <w:t>Admin/Kasir membuka dashboard pembayaran, memilih data pasien yang telah selesai diperiksa, kemudian melakukan perubahan status pembayaran pasien.</w:t>
+            <w:pPr>
+              <w:jc w:val="left"/>
+            </w:pPr>
+            <w:r>
+              <w:t>Payload: { id_pembayaran: int, nominal_bayar: decimal, diskon: decimal, status_pembayaran: string }</w:t>
             </w:r>
           </w:p>
         </w:tc>
@@ -20146,7 +20781,111 @@
           </w:tcPr>
           <w:p>
             <w:r>
-              <w:t>Data Input</w:t>
+              <w:t>Expected Result</w:t>
+            </w:r>
+          </w:p>
+        </w:tc>
+        <w:tc>
+          <w:tcPr>
+            <w:tcW w:w="5617" w:type="dxa"/>
+          </w:tcPr>
+          <w:p>
+            <w:pPr>
+              <w:jc w:val="left"/>
+            </w:pPr>
+            <w:r>
+              <w:t>Sistem dapat menampilkan data pembayaran pasien dan memperbarui status pembayaran sesuai perubahan yang dilakukan oleh admin/kasir.</w:t>
+            </w:r>
+          </w:p>
+        </w:tc>
+      </w:tr>
+      <w:tr>
+        <w:trPr/>
+        <w:tc>
+          <w:tcPr>
+            <w:tcW w:w="2121" w:type="dxa"/>
+          </w:tcPr>
+          <w:p>
+            <w:r>
+              <w:t>Actual Result</w:t>
+            </w:r>
+          </w:p>
+        </w:tc>
+        <w:tc>
+          <w:tcPr>
+            <w:tcW w:w="5617" w:type="dxa"/>
+          </w:tcPr>
+          <w:p>
+            <w:pPr>
+              <w:jc w:val="left"/>
+            </w:pPr>
+            <w:r>
+              <w:t>Data pembayaran pasien berhasil ditampilkan pada dashboard. Perubahan status pembayaran berhasil diproses dan tersimpan sesuai dengan tindakan yang dilakukan oleh admin/kasir.</w:t>
+            </w:r>
+          </w:p>
+        </w:tc>
+      </w:tr>
+      <w:tr>
+        <w:trPr/>
+        <w:tc>
+          <w:tcPr>
+            <w:tcW w:w="2121" w:type="dxa"/>
+          </w:tcPr>
+          <w:p>
+            <w:r>
+              <w:t>Status</w:t>
+            </w:r>
+          </w:p>
+        </w:tc>
+        <w:tc>
+          <w:tcPr>
+            <w:tcW w:w="5617" w:type="dxa"/>
+          </w:tcPr>
+          <w:p>
+            <w:pPr>
+              <w:jc w:val="left"/>
+            </w:pPr>
+            <w:r>
+              <w:t>Berhasil</w:t>
+            </w:r>
+          </w:p>
+        </w:tc>
+      </w:tr>
+      <w:tr>
+        <w:trPr/>
+        <w:tc>
+          <w:tcPr>
+            <w:tcW w:w="2121" w:type="dxa"/>
+          </w:tcPr>
+          <w:p>
+            <w:r>
+              <w:t>Skenario 1: Kalkulasi Biaya &amp; Status Pembayaran Kasir</w:t>
+            </w:r>
+          </w:p>
+        </w:tc>
+        <w:tc>
+          <w:tcPr>
+            <w:tcW w:w="5617" w:type="dxa"/>
+          </w:tcPr>
+          <w:p>
+            <w:pPr>
+              <w:jc w:val="left"/>
+            </w:pPr>
+            <w:r>
+              <w:t>Kasir menginput nominal pembayaran, diskon, dan mengubah status menjadi lunas.</w:t>
+            </w:r>
+          </w:p>
+        </w:tc>
+      </w:tr>
+      <w:tr>
+        <w:trPr/>
+        <w:tc>
+          <w:tcPr>
+            <w:tcW w:w="2121" w:type="dxa"/>
+          </w:tcPr>
+          <w:p>
+            <w:r>
+              <w:t>Evidence (Skenario 1: Kalkulasi Biaya &amp; Status Pembayaran Kasir)</w:t>
             </w:r>
           </w:p>
         </w:tc>
@@ -20170,8 +20909,8 @@
             <w:r>
               <w:drawing>
                 <wp:inline xmlns:a="http://schemas.openxmlformats.org/drawingml/2006/main" xmlns:pic="http://schemas.openxmlformats.org/drawingml/2006/picture">
-                  <wp:extent cx="4389120" cy="2217420"/>
-                  <wp:docPr id="2011434112" name="Picture 2011434112"/>
+                  <wp:extent cx="4389120" cy="2265426"/>
+                  <wp:docPr id="2011434141" name="Picture 2011434141"/>
                   <wp:cNvGraphicFramePr>
                     <a:graphicFrameLocks noChangeAspect="1"/>
                   </wp:cNvGraphicFramePr>
@@ -20179,142 +20918,7 @@
                     <a:graphicData uri="http://schemas.openxmlformats.org/drawingml/2006/picture">
                       <pic:pic>
                         <pic:nvPicPr>
-                          <pic:cNvPr id="0" name="backend_fr06_1781609850630.png"/>
-                          <pic:cNvPicPr/>
-                        </pic:nvPicPr>
-                        <pic:blipFill>
-                          <a:blip r:embed="rId30"/>
-                          <a:stretch>
-                            <a:fillRect/>
-                          </a:stretch>
-                        </pic:blipFill>
-                        <pic:spPr>
-                          <a:xfrm>
-                            <a:off x="0" y="0"/>
-                            <a:ext cx="4389120" cy="2217420"/>
-                          </a:xfrm>
-                          <a:prstGeom prst="rect"/>
-                        </pic:spPr>
-                      </pic:pic>
-                    </a:graphicData>
-                  </a:graphic>
-                </wp:inline>
-              </w:drawing>
-            </w:r>
-          </w:p>
-        </w:tc>
-      </w:tr>
-      <w:tr>
-        <w:trPr/>
-        <w:tc>
-          <w:tcPr>
-            <w:tcW w:w="2121" w:type="dxa"/>
-          </w:tcPr>
-          <w:p>
-            <w:r>
-              <w:t>Expected Result</w:t>
-            </w:r>
-          </w:p>
-        </w:tc>
-        <w:tc>
-          <w:tcPr>
-            <w:tcW w:w="5617" w:type="dxa"/>
-          </w:tcPr>
-          <w:p>
-            <w:r>
-              <w:t>Sistem dapat menampilkan data pembayaran pasien dan memperbarui status pembayaran sesuai perubahan yang dilakukan oleh admin/kasir.</w:t>
-            </w:r>
-          </w:p>
-        </w:tc>
-      </w:tr>
-      <w:tr>
-        <w:trPr/>
-        <w:tc>
-          <w:tcPr>
-            <w:tcW w:w="2121" w:type="dxa"/>
-          </w:tcPr>
-          <w:p>
-            <w:r>
-              <w:t>Actual Result</w:t>
-            </w:r>
-          </w:p>
-        </w:tc>
-        <w:tc>
-          <w:tcPr>
-            <w:tcW w:w="5617" w:type="dxa"/>
-          </w:tcPr>
-          <w:p>
-            <w:r>
-              <w:t>Data pembayaran pasien berhasil ditampilkan pada dashboard. Perubahan status pembayaran berhasil diproses dan tersimpan sesuai dengan tindakan yang dilakukan oleh admin/kasir.</w:t>
-            </w:r>
-          </w:p>
-        </w:tc>
-      </w:tr>
-      <w:tr>
-        <w:trPr/>
-        <w:tc>
-          <w:tcPr>
-            <w:tcW w:w="2121" w:type="dxa"/>
-          </w:tcPr>
-          <w:p>
-            <w:r>
-              <w:t>Status</w:t>
-            </w:r>
-          </w:p>
-        </w:tc>
-        <w:tc>
-          <w:tcPr>
-            <w:tcW w:w="5617" w:type="dxa"/>
-          </w:tcPr>
-          <w:p>
-            <w:r>
-              <w:t>Berhasil</w:t>
-            </w:r>
-          </w:p>
-        </w:tc>
-      </w:tr>
-      <w:tr>
-        <w:trPr/>
-        <w:tc>
-          <w:tcPr>
-            <w:tcW w:w="2121" w:type="dxa"/>
-          </w:tcPr>
-          <w:p>
-            <w:r>
-              <w:t>Evidence</w:t>
-            </w:r>
-          </w:p>
-        </w:tc>
-        <w:tc>
-          <w:tcPr>
-            <w:tcW w:w="5617" w:type="dxa"/>
-          </w:tcPr>
-          <w:p>
-            <w:pPr>
-              <w:pStyle w:val="DaftarParagraf"/>
-              <w:spacing w:line="360" w:lineRule="auto" w:before="80" w:after="80"/>
-              <w:ind w:left="0"/>
-              <w:jc w:val="center"/>
-              <w:rPr>
-                <w:color w:val="000000"/>
-                <w:szCs w:val="24"/>
-                <w:lang w:val="en-ID"/>
-              </w:rPr>
-            </w:pPr>
-            <w:r/>
-            <w:r>
-              <w:drawing>
-                <wp:inline xmlns:a="http://schemas.openxmlformats.org/drawingml/2006/main" xmlns:pic="http://schemas.openxmlformats.org/drawingml/2006/picture">
-                  <wp:extent cx="4389120" cy="2265426"/>
-                  <wp:docPr id="2011434113" name="Picture 2011434113"/>
-                  <wp:cNvGraphicFramePr>
-                    <a:graphicFrameLocks noChangeAspect="1"/>
-                  </wp:cNvGraphicFramePr>
-                  <a:graphic>
-                    <a:graphicData uri="http://schemas.openxmlformats.org/drawingml/2006/picture">
-                      <pic:pic>
-                        <pic:nvPicPr>
-                          <pic:cNvPr id="0" name="36_pembayaran_diskon_1781491534469.png"/>
+                          <pic:cNvPr id="0" name="image.png"/>
                           <pic:cNvPicPr/>
                         </pic:nvPicPr>
                         <pic:blipFill>
@@ -20532,6 +21136,9 @@
             <w:tcW w:w="5617" w:type="dxa"/>
           </w:tcPr>
           <w:p>
+            <w:pPr>
+              <w:jc w:val="left"/>
+            </w:pPr>
             <w:r>
               <w:t>FR-07</w:t>
             </w:r>
@@ -20555,6 +21162,9 @@
             <w:tcW w:w="5617" w:type="dxa"/>
           </w:tcPr>
           <w:p>
+            <w:pPr>
+              <w:jc w:val="left"/>
+            </w:pPr>
             <w:r>
               <w:t>Data Master</w:t>
             </w:r>
@@ -20569,7 +21179,7 @@
           </w:tcPr>
           <w:p>
             <w:r>
-              <w:t>Skenario Pengujian</w:t>
+              <w:t>Data Input</w:t>
             </w:r>
           </w:p>
         </w:tc>
@@ -20578,8 +21188,11 @@
             <w:tcW w:w="5617" w:type="dxa"/>
           </w:tcPr>
           <w:p>
-            <w:r>
-              <w:t>Staf melakukan operasi Create, Read, Update, dan Delete (CRUD) pada data master klinik yang meliputi data obat, tarif tindakan, tarif obat, dan kode penyakit gigi melalui dashboard admin.</w:t>
+            <w:pPr>
+              <w:jc w:val="left"/>
+            </w:pPr>
+            <w:r>
+              <w:t>Payload: { nama_obat: string, harga: decimal, kode_icd10: string, nama_tindakan: string }</w:t>
             </w:r>
           </w:p>
         </w:tc>
@@ -20592,7 +21205,111 @@
           </w:tcPr>
           <w:p>
             <w:r>
-              <w:t>Data Input</w:t>
+              <w:t>Expected Result</w:t>
+            </w:r>
+          </w:p>
+        </w:tc>
+        <w:tc>
+          <w:tcPr>
+            <w:tcW w:w="5617" w:type="dxa"/>
+          </w:tcPr>
+          <w:p>
+            <w:pPr>
+              <w:jc w:val="left"/>
+            </w:pPr>
+            <w:r>
+              <w:t>Sistem dapat membuat, menampilkan, mengubah, dan menghapus data master klinik sesuai dengan proses yang dilakukan oleh admin.</w:t>
+            </w:r>
+          </w:p>
+        </w:tc>
+      </w:tr>
+      <w:tr>
+        <w:trPr/>
+        <w:tc>
+          <w:tcPr>
+            <w:tcW w:w="2121" w:type="dxa"/>
+          </w:tcPr>
+          <w:p>
+            <w:r>
+              <w:t>Actual Result</w:t>
+            </w:r>
+          </w:p>
+        </w:tc>
+        <w:tc>
+          <w:tcPr>
+            <w:tcW w:w="5617" w:type="dxa"/>
+          </w:tcPr>
+          <w:p>
+            <w:pPr>
+              <w:jc w:val="left"/>
+            </w:pPr>
+            <w:r>
+              <w:t>Seluruh proses CRUD pada data master klinik berhasil dilakukan. Data berhasil ditambahkan, ditampilkan, diperbarui, dan dihapus sesuai dengan kebutuhan pengelolaan data oleh admin.</w:t>
+            </w:r>
+          </w:p>
+        </w:tc>
+      </w:tr>
+      <w:tr>
+        <w:trPr/>
+        <w:tc>
+          <w:tcPr>
+            <w:tcW w:w="2121" w:type="dxa"/>
+          </w:tcPr>
+          <w:p>
+            <w:r>
+              <w:t>Status</w:t>
+            </w:r>
+          </w:p>
+        </w:tc>
+        <w:tc>
+          <w:tcPr>
+            <w:tcW w:w="5617" w:type="dxa"/>
+          </w:tcPr>
+          <w:p>
+            <w:pPr>
+              <w:jc w:val="left"/>
+            </w:pPr>
+            <w:r>
+              <w:t>Berhasil</w:t>
+            </w:r>
+          </w:p>
+        </w:tc>
+      </w:tr>
+      <w:tr>
+        <w:trPr/>
+        <w:tc>
+          <w:tcPr>
+            <w:tcW w:w="2121" w:type="dxa"/>
+          </w:tcPr>
+          <w:p>
+            <w:r>
+              <w:t>Skenario 1: Kelola Data Master Klinik</w:t>
+            </w:r>
+          </w:p>
+        </w:tc>
+        <w:tc>
+          <w:tcPr>
+            <w:tcW w:w="5617" w:type="dxa"/>
+          </w:tcPr>
+          <w:p>
+            <w:pPr>
+              <w:jc w:val="left"/>
+            </w:pPr>
+            <w:r>
+              <w:t>Admin melakukan CRUD data master klinik seperti klinik, dokter, dan obat.</w:t>
+            </w:r>
+          </w:p>
+        </w:tc>
+      </w:tr>
+      <w:tr>
+        <w:trPr/>
+        <w:tc>
+          <w:tcPr>
+            <w:tcW w:w="2121" w:type="dxa"/>
+          </w:tcPr>
+          <w:p>
+            <w:r>
+              <w:t>Evidence (Skenario 1: Kelola Data Master Klinik)</w:t>
             </w:r>
           </w:p>
         </w:tc>
@@ -20616,8 +21333,8 @@
             <w:r>
               <w:drawing>
                 <wp:inline xmlns:a="http://schemas.openxmlformats.org/drawingml/2006/main" xmlns:pic="http://schemas.openxmlformats.org/drawingml/2006/picture">
-                  <wp:extent cx="4389120" cy="2217420"/>
-                  <wp:docPr id="2011434114" name="Picture 2011434114"/>
+                  <wp:extent cx="4389120" cy="2265426"/>
+                  <wp:docPr id="2011434142" name="Picture 2011434142"/>
                   <wp:cNvGraphicFramePr>
                     <a:graphicFrameLocks noChangeAspect="1"/>
                   </wp:cNvGraphicFramePr>
@@ -20625,142 +21342,7 @@
                     <a:graphicData uri="http://schemas.openxmlformats.org/drawingml/2006/picture">
                       <pic:pic>
                         <pic:nvPicPr>
-                          <pic:cNvPr id="0" name="backend_fr07_1781609859466.png"/>
-                          <pic:cNvPicPr/>
-                        </pic:nvPicPr>
-                        <pic:blipFill>
-                          <a:blip r:embed="rId32"/>
-                          <a:stretch>
-                            <a:fillRect/>
-                          </a:stretch>
-                        </pic:blipFill>
-                        <pic:spPr>
-                          <a:xfrm>
-                            <a:off x="0" y="0"/>
-                            <a:ext cx="4389120" cy="2217420"/>
-                          </a:xfrm>
-                          <a:prstGeom prst="rect"/>
-                        </pic:spPr>
-                      </pic:pic>
-                    </a:graphicData>
-                  </a:graphic>
-                </wp:inline>
-              </w:drawing>
-            </w:r>
-          </w:p>
-        </w:tc>
-      </w:tr>
-      <w:tr>
-        <w:trPr/>
-        <w:tc>
-          <w:tcPr>
-            <w:tcW w:w="2121" w:type="dxa"/>
-          </w:tcPr>
-          <w:p>
-            <w:r>
-              <w:t>Expected Result</w:t>
-            </w:r>
-          </w:p>
-        </w:tc>
-        <w:tc>
-          <w:tcPr>
-            <w:tcW w:w="5617" w:type="dxa"/>
-          </w:tcPr>
-          <w:p>
-            <w:r>
-              <w:t>Sistem dapat membuat, menampilkan, mengubah, dan menghapus data master klinik sesuai dengan proses yang dilakukan oleh admin.</w:t>
-            </w:r>
-          </w:p>
-        </w:tc>
-      </w:tr>
-      <w:tr>
-        <w:trPr/>
-        <w:tc>
-          <w:tcPr>
-            <w:tcW w:w="2121" w:type="dxa"/>
-          </w:tcPr>
-          <w:p>
-            <w:r>
-              <w:t>Actual Result</w:t>
-            </w:r>
-          </w:p>
-        </w:tc>
-        <w:tc>
-          <w:tcPr>
-            <w:tcW w:w="5617" w:type="dxa"/>
-          </w:tcPr>
-          <w:p>
-            <w:r>
-              <w:t>Seluruh proses CRUD pada data master klinik berhasil dilakukan. Data berhasil ditambahkan, ditampilkan, diperbarui, dan dihapus sesuai dengan kebutuhan pengelolaan data oleh admin.</w:t>
-            </w:r>
-          </w:p>
-        </w:tc>
-      </w:tr>
-      <w:tr>
-        <w:trPr/>
-        <w:tc>
-          <w:tcPr>
-            <w:tcW w:w="2121" w:type="dxa"/>
-          </w:tcPr>
-          <w:p>
-            <w:r>
-              <w:t>Status</w:t>
-            </w:r>
-          </w:p>
-        </w:tc>
-        <w:tc>
-          <w:tcPr>
-            <w:tcW w:w="5617" w:type="dxa"/>
-          </w:tcPr>
-          <w:p>
-            <w:r>
-              <w:t>Berhasil</w:t>
-            </w:r>
-          </w:p>
-        </w:tc>
-      </w:tr>
-      <w:tr>
-        <w:trPr/>
-        <w:tc>
-          <w:tcPr>
-            <w:tcW w:w="2121" w:type="dxa"/>
-          </w:tcPr>
-          <w:p>
-            <w:r>
-              <w:t>Evidence</w:t>
-            </w:r>
-          </w:p>
-        </w:tc>
-        <w:tc>
-          <w:tcPr>
-            <w:tcW w:w="5617" w:type="dxa"/>
-          </w:tcPr>
-          <w:p>
-            <w:pPr>
-              <w:pStyle w:val="DaftarParagraf"/>
-              <w:spacing w:line="360" w:lineRule="auto" w:before="80" w:after="80"/>
-              <w:ind w:left="0"/>
-              <w:jc w:val="center"/>
-              <w:rPr>
-                <w:color w:val="000000"/>
-                <w:szCs w:val="24"/>
-                <w:lang w:val="en-ID"/>
-              </w:rPr>
-            </w:pPr>
-            <w:r/>
-            <w:r>
-              <w:drawing>
-                <wp:inline xmlns:a="http://schemas.openxmlformats.org/drawingml/2006/main" xmlns:pic="http://schemas.openxmlformats.org/drawingml/2006/picture">
-                  <wp:extent cx="4389120" cy="2265426"/>
-                  <wp:docPr id="2011434115" name="Picture 2011434115"/>
-                  <wp:cNvGraphicFramePr>
-                    <a:graphicFrameLocks noChangeAspect="1"/>
-                  </wp:cNvGraphicFramePr>
-                  <a:graphic>
-                    <a:graphicData uri="http://schemas.openxmlformats.org/drawingml/2006/picture">
-                      <pic:pic>
-                        <pic:nvPicPr>
-                          <pic:cNvPr id="0" name="12_tambah_klinik_sukses_1781492068537.png"/>
+                          <pic:cNvPr id="0" name="image.png"/>
                           <pic:cNvPicPr/>
                         </pic:nvPicPr>
                         <pic:blipFill>
@@ -20971,6 +21553,9 @@
             <w:tcW w:w="5617" w:type="dxa"/>
           </w:tcPr>
           <w:p>
+            <w:pPr>
+              <w:jc w:val="left"/>
+            </w:pPr>
             <w:r>
               <w:t>FR-08</w:t>
             </w:r>
@@ -20994,6 +21579,9 @@
             <w:tcW w:w="5617" w:type="dxa"/>
           </w:tcPr>
           <w:p>
+            <w:pPr>
+              <w:jc w:val="left"/>
+            </w:pPr>
             <w:r>
               <w:t>WhatsApp Klinik</w:t>
             </w:r>
@@ -21008,7 +21596,7 @@
           </w:tcPr>
           <w:p>
             <w:r>
-              <w:t>Skenario Pengujian</w:t>
+              <w:t>Data Input</w:t>
             </w:r>
           </w:p>
         </w:tc>
@@ -21017,8 +21605,11 @@
             <w:tcW w:w="5617" w:type="dxa"/>
           </w:tcPr>
           <w:p>
-            <w:r>
-              <w:t>Staf menekan tombol ikon WhatsApp pada bagian header halaman pasien untuk memverifikasi fungsi penghubung ke nomor admin klinik.</w:t>
+            <w:pPr>
+              <w:jc w:val="left"/>
+            </w:pPr>
+            <w:r>
+              <w:t>Query Params: { phone: string, text: string }</w:t>
             </w:r>
           </w:p>
         </w:tc>
@@ -21031,7 +21622,111 @@
           </w:tcPr>
           <w:p>
             <w:r>
-              <w:t>Data Input</w:t>
+              <w:t>Expected Result</w:t>
+            </w:r>
+          </w:p>
+        </w:tc>
+        <w:tc>
+          <w:tcPr>
+            <w:tcW w:w="5617" w:type="dxa"/>
+          </w:tcPr>
+          <w:p>
+            <w:pPr>
+              <w:jc w:val="left"/>
+            </w:pPr>
+            <w:r>
+              <w:t>Sistem membuka tab baru yang mengarah ke tautan WhatsApp API dengan nomor tujuan admin klinik.</w:t>
+            </w:r>
+          </w:p>
+        </w:tc>
+      </w:tr>
+      <w:tr>
+        <w:trPr/>
+        <w:tc>
+          <w:tcPr>
+            <w:tcW w:w="2121" w:type="dxa"/>
+          </w:tcPr>
+          <w:p>
+            <w:r>
+              <w:t>Actual Result</w:t>
+            </w:r>
+          </w:p>
+        </w:tc>
+        <w:tc>
+          <w:tcPr>
+            <w:tcW w:w="5617" w:type="dxa"/>
+          </w:tcPr>
+          <w:p>
+            <w:pPr>
+              <w:jc w:val="left"/>
+            </w:pPr>
+            <w:r>
+              <w:t>Tombol WhatsApp berhasil membuka halaman WhatsApp dan menghubungkan pengguna dengan nomor admin klinik sesuai yang telah dikonfigurasi pada sistem.</w:t>
+            </w:r>
+          </w:p>
+        </w:tc>
+      </w:tr>
+      <w:tr>
+        <w:trPr/>
+        <w:tc>
+          <w:tcPr>
+            <w:tcW w:w="2121" w:type="dxa"/>
+          </w:tcPr>
+          <w:p>
+            <w:r>
+              <w:t>Status</w:t>
+            </w:r>
+          </w:p>
+        </w:tc>
+        <w:tc>
+          <w:tcPr>
+            <w:tcW w:w="5617" w:type="dxa"/>
+          </w:tcPr>
+          <w:p>
+            <w:pPr>
+              <w:jc w:val="left"/>
+            </w:pPr>
+            <w:r>
+              <w:t>Berhasil</w:t>
+            </w:r>
+          </w:p>
+        </w:tc>
+      </w:tr>
+      <w:tr>
+        <w:trPr/>
+        <w:tc>
+          <w:tcPr>
+            <w:tcW w:w="2121" w:type="dxa"/>
+          </w:tcPr>
+          <w:p>
+            <w:r>
+              <w:t>Skenario 1: Hubungi Admin via Integrasi WhatsApp</w:t>
+            </w:r>
+          </w:p>
+        </w:tc>
+        <w:tc>
+          <w:tcPr>
+            <w:tcW w:w="5617" w:type="dxa"/>
+          </w:tcPr>
+          <w:p>
+            <w:pPr>
+              <w:jc w:val="left"/>
+            </w:pPr>
+            <w:r>
+              <w:t>Pasien mengklik tombol WhatsApp untuk membuka chat bantuan admin.</w:t>
+            </w:r>
+          </w:p>
+        </w:tc>
+      </w:tr>
+      <w:tr>
+        <w:trPr/>
+        <w:tc>
+          <w:tcPr>
+            <w:tcW w:w="2121" w:type="dxa"/>
+          </w:tcPr>
+          <w:p>
+            <w:r>
+              <w:t>Evidence (Skenario 1: Hubungi Admin via Integrasi WhatsApp)</w:t>
             </w:r>
           </w:p>
         </w:tc>
@@ -21055,8 +21750,8 @@
             <w:r>
               <w:drawing>
                 <wp:inline xmlns:a="http://schemas.openxmlformats.org/drawingml/2006/main" xmlns:pic="http://schemas.openxmlformats.org/drawingml/2006/picture">
-                  <wp:extent cx="4389120" cy="2217420"/>
-                  <wp:docPr id="2011434116" name="Picture 2011434116"/>
+                  <wp:extent cx="4389120" cy="4448618"/>
+                  <wp:docPr id="2011434143" name="Picture 2011434143"/>
                   <wp:cNvGraphicFramePr>
                     <a:graphicFrameLocks noChangeAspect="1"/>
                   </wp:cNvGraphicFramePr>
@@ -21064,142 +21759,7 @@
                     <a:graphicData uri="http://schemas.openxmlformats.org/drawingml/2006/picture">
                       <pic:pic>
                         <pic:nvPicPr>
-                          <pic:cNvPr id="0" name="backend_fr08_1781609865682.png"/>
-                          <pic:cNvPicPr/>
-                        </pic:nvPicPr>
-                        <pic:blipFill>
-                          <a:blip r:embed="rId34"/>
-                          <a:stretch>
-                            <a:fillRect/>
-                          </a:stretch>
-                        </pic:blipFill>
-                        <pic:spPr>
-                          <a:xfrm>
-                            <a:off x="0" y="0"/>
-                            <a:ext cx="4389120" cy="2217420"/>
-                          </a:xfrm>
-                          <a:prstGeom prst="rect"/>
-                        </pic:spPr>
-                      </pic:pic>
-                    </a:graphicData>
-                  </a:graphic>
-                </wp:inline>
-              </w:drawing>
-            </w:r>
-          </w:p>
-        </w:tc>
-      </w:tr>
-      <w:tr>
-        <w:trPr/>
-        <w:tc>
-          <w:tcPr>
-            <w:tcW w:w="2121" w:type="dxa"/>
-          </w:tcPr>
-          <w:p>
-            <w:r>
-              <w:t>Expected Result</w:t>
-            </w:r>
-          </w:p>
-        </w:tc>
-        <w:tc>
-          <w:tcPr>
-            <w:tcW w:w="5617" w:type="dxa"/>
-          </w:tcPr>
-          <w:p>
-            <w:r>
-              <w:t>Sistem membuka tab baru yang mengarah ke tautan WhatsApp API dengan nomor tujuan admin klinik.</w:t>
-            </w:r>
-          </w:p>
-        </w:tc>
-      </w:tr>
-      <w:tr>
-        <w:trPr/>
-        <w:tc>
-          <w:tcPr>
-            <w:tcW w:w="2121" w:type="dxa"/>
-          </w:tcPr>
-          <w:p>
-            <w:r>
-              <w:t>Actual Result</w:t>
-            </w:r>
-          </w:p>
-        </w:tc>
-        <w:tc>
-          <w:tcPr>
-            <w:tcW w:w="5617" w:type="dxa"/>
-          </w:tcPr>
-          <w:p>
-            <w:r>
-              <w:t>Tombol WhatsApp berhasil membuka halaman WhatsApp dan menghubungkan pengguna dengan nomor admin klinik sesuai yang telah dikonfigurasi pada sistem.</w:t>
-            </w:r>
-          </w:p>
-        </w:tc>
-      </w:tr>
-      <w:tr>
-        <w:trPr/>
-        <w:tc>
-          <w:tcPr>
-            <w:tcW w:w="2121" w:type="dxa"/>
-          </w:tcPr>
-          <w:p>
-            <w:r>
-              <w:t>Status</w:t>
-            </w:r>
-          </w:p>
-        </w:tc>
-        <w:tc>
-          <w:tcPr>
-            <w:tcW w:w="5617" w:type="dxa"/>
-          </w:tcPr>
-          <w:p>
-            <w:r>
-              <w:t>Berhasil</w:t>
-            </w:r>
-          </w:p>
-        </w:tc>
-      </w:tr>
-      <w:tr>
-        <w:trPr/>
-        <w:tc>
-          <w:tcPr>
-            <w:tcW w:w="2121" w:type="dxa"/>
-          </w:tcPr>
-          <w:p>
-            <w:r>
-              <w:t>Evidence</w:t>
-            </w:r>
-          </w:p>
-        </w:tc>
-        <w:tc>
-          <w:tcPr>
-            <w:tcW w:w="5617" w:type="dxa"/>
-          </w:tcPr>
-          <w:p>
-            <w:pPr>
-              <w:pStyle w:val="DaftarParagraf"/>
-              <w:spacing w:line="360" w:lineRule="auto" w:before="80" w:after="80"/>
-              <w:ind w:left="0"/>
-              <w:jc w:val="center"/>
-              <w:rPr>
-                <w:color w:val="000000"/>
-                <w:szCs w:val="24"/>
-                <w:lang w:val="en-ID"/>
-              </w:rPr>
-            </w:pPr>
-            <w:r/>
-            <w:r>
-              <w:drawing>
-                <wp:inline xmlns:a="http://schemas.openxmlformats.org/drawingml/2006/main" xmlns:pic="http://schemas.openxmlformats.org/drawingml/2006/picture">
-                  <wp:extent cx="4389120" cy="4448618"/>
-                  <wp:docPr id="2011434117" name="Picture 2011434117"/>
-                  <wp:cNvGraphicFramePr>
-                    <a:graphicFrameLocks noChangeAspect="1"/>
-                  </wp:cNvGraphicFramePr>
-                  <a:graphic>
-                    <a:graphicData uri="http://schemas.openxmlformats.org/drawingml/2006/picture">
-                      <pic:pic>
-                        <pic:nvPicPr>
-                          <pic:cNvPr id="0" name="whatsapp_redirect.png"/>
+                          <pic:cNvPr id="0" name="image.png"/>
                           <pic:cNvPicPr/>
                         </pic:nvPicPr>
                         <pic:blipFill>
@@ -21911,6 +22471,9 @@
             <w:tcW w:w="6108" w:type="dxa"/>
           </w:tcPr>
           <w:p>
+            <w:pPr>
+              <w:jc w:val="left"/>
+            </w:pPr>
             <w:r>
               <w:t>NF-01</w:t>
             </w:r>
@@ -21934,6 +22497,9 @@
             <w:tcW w:w="6108" w:type="dxa"/>
           </w:tcPr>
           <w:p>
+            <w:pPr>
+              <w:jc w:val="left"/>
+            </w:pPr>
             <w:r>
               <w:t>Booking Availability Validation</w:t>
             </w:r>
@@ -21948,7 +22514,7 @@
           </w:tcPr>
           <w:p>
             <w:r>
-              <w:t>Skenario Pengujian</w:t>
+              <w:t>Data Input</w:t>
             </w:r>
           </w:p>
         </w:tc>
@@ -21957,8 +22523,11 @@
             <w:tcW w:w="6108" w:type="dxa"/>
           </w:tcPr>
           <w:p>
-            <w:r>
-              <w:t>Penguji mengakses halaman appointment/booking pada beberapa waktu pengujian yang berbeda untuk memastikan halaman dapat dibuka dengan normal. Penguji juga memeriksa respons server melalui Browser Developer Tools untuk memastikan request berhasil diproses tanpa error.</w:t>
+            <w:pPr>
+              <w:jc w:val="left"/>
+            </w:pPr>
+            <w:r>
+              <w:t>HTTP Method &amp; Path: GET /portal/appointments/new</w:t>
             </w:r>
           </w:p>
         </w:tc>
@@ -21971,7 +22540,111 @@
           </w:tcPr>
           <w:p>
             <w:r>
-              <w:t>Data Input</w:t>
+              <w:t>Expected Result</w:t>
+            </w:r>
+          </w:p>
+        </w:tc>
+        <w:tc>
+          <w:tcPr>
+            <w:tcW w:w="6108" w:type="dxa"/>
+          </w:tcPr>
+          <w:p>
+            <w:pPr>
+              <w:jc w:val="left"/>
+            </w:pPr>
+            <w:r>
+              <w:t>Halaman appointment dapat diakses dengan normal pada setiap waktu pengujian, seluruh komponen halaman berhasil dimuat, dan server memberikan respons yang berhasil tanpa error.</w:t>
+            </w:r>
+          </w:p>
+        </w:tc>
+      </w:tr>
+      <w:tr>
+        <w:trPr/>
+        <w:tc>
+          <w:tcPr>
+            <w:tcW w:w="1630" w:type="dxa"/>
+          </w:tcPr>
+          <w:p>
+            <w:r>
+              <w:t>Actual Result</w:t>
+            </w:r>
+          </w:p>
+        </w:tc>
+        <w:tc>
+          <w:tcPr>
+            <w:tcW w:w="6108" w:type="dxa"/>
+          </w:tcPr>
+          <w:p>
+            <w:pPr>
+              <w:jc w:val="left"/>
+            </w:pPr>
+            <w:r>
+              <w:t>Halaman appointment berhasil diakses pada seluruh waktu pengujian. Seluruh komponen halaman berhasil dimuat dengan baik dan request ke server berhasil diproses tanpa ditemukan error pada proses pengujian.</w:t>
+            </w:r>
+          </w:p>
+        </w:tc>
+      </w:tr>
+      <w:tr>
+        <w:trPr/>
+        <w:tc>
+          <w:tcPr>
+            <w:tcW w:w="1630" w:type="dxa"/>
+          </w:tcPr>
+          <w:p>
+            <w:r>
+              <w:t>Status</w:t>
+            </w:r>
+          </w:p>
+        </w:tc>
+        <w:tc>
+          <w:tcPr>
+            <w:tcW w:w="6108" w:type="dxa"/>
+          </w:tcPr>
+          <w:p>
+            <w:pPr>
+              <w:jc w:val="left"/>
+            </w:pPr>
+            <w:r>
+              <w:t>Berhasil</w:t>
+            </w:r>
+          </w:p>
+        </w:tc>
+      </w:tr>
+      <w:tr>
+        <w:trPr/>
+        <w:tc>
+          <w:tcPr>
+            <w:tcW w:w="1630" w:type="dxa"/>
+          </w:tcPr>
+          <w:p>
+            <w:r>
+              <w:t>Skenario 1: Validasi Akses &amp; Ketersediaan Halaman Booking</w:t>
+            </w:r>
+          </w:p>
+        </w:tc>
+        <w:tc>
+          <w:tcPr>
+            <w:tcW w:w="6108" w:type="dxa"/>
+          </w:tcPr>
+          <w:p>
+            <w:pPr>
+              <w:jc w:val="left"/>
+            </w:pPr>
+            <w:r>
+              <w:t>Memverifikasi halaman booking dapat diakses secara lancar.</w:t>
+            </w:r>
+          </w:p>
+        </w:tc>
+      </w:tr>
+      <w:tr>
+        <w:trPr/>
+        <w:tc>
+          <w:tcPr>
+            <w:tcW w:w="1630" w:type="dxa"/>
+          </w:tcPr>
+          <w:p>
+            <w:r>
+              <w:t>Evidence (Skenario 1: Validasi Akses &amp; Ketersediaan Halaman Booking)</w:t>
             </w:r>
           </w:p>
         </w:tc>
@@ -21995,8 +22668,8 @@
             <w:r>
               <w:drawing>
                 <wp:inline xmlns:a="http://schemas.openxmlformats.org/drawingml/2006/main" xmlns:pic="http://schemas.openxmlformats.org/drawingml/2006/picture">
-                  <wp:extent cx="4389120" cy="2217420"/>
-                  <wp:docPr id="2011434118" name="Picture 2011434118"/>
+                  <wp:extent cx="4389120" cy="2265426"/>
+                  <wp:docPr id="2011434144" name="Picture 2011434144"/>
                   <wp:cNvGraphicFramePr>
                     <a:graphicFrameLocks noChangeAspect="1"/>
                   </wp:cNvGraphicFramePr>
@@ -22004,142 +22677,7 @@
                     <a:graphicData uri="http://schemas.openxmlformats.org/drawingml/2006/picture">
                       <pic:pic>
                         <pic:nvPicPr>
-                          <pic:cNvPr id="0" name="backend_nf01_1781609873827.png"/>
-                          <pic:cNvPicPr/>
-                        </pic:nvPicPr>
-                        <pic:blipFill>
-                          <a:blip r:embed="rId36"/>
-                          <a:stretch>
-                            <a:fillRect/>
-                          </a:stretch>
-                        </pic:blipFill>
-                        <pic:spPr>
-                          <a:xfrm>
-                            <a:off x="0" y="0"/>
-                            <a:ext cx="4389120" cy="2217420"/>
-                          </a:xfrm>
-                          <a:prstGeom prst="rect"/>
-                        </pic:spPr>
-                      </pic:pic>
-                    </a:graphicData>
-                  </a:graphic>
-                </wp:inline>
-              </w:drawing>
-            </w:r>
-          </w:p>
-        </w:tc>
-      </w:tr>
-      <w:tr>
-        <w:trPr/>
-        <w:tc>
-          <w:tcPr>
-            <w:tcW w:w="1630" w:type="dxa"/>
-          </w:tcPr>
-          <w:p>
-            <w:r>
-              <w:t>Expected Result</w:t>
-            </w:r>
-          </w:p>
-        </w:tc>
-        <w:tc>
-          <w:tcPr>
-            <w:tcW w:w="6108" w:type="dxa"/>
-          </w:tcPr>
-          <w:p>
-            <w:r>
-              <w:t>Halaman appointment dapat diakses dengan normal pada setiap waktu pengujian, seluruh komponen halaman berhasil dimuat, dan server memberikan respons yang berhasil tanpa error.</w:t>
-            </w:r>
-          </w:p>
-        </w:tc>
-      </w:tr>
-      <w:tr>
-        <w:trPr/>
-        <w:tc>
-          <w:tcPr>
-            <w:tcW w:w="1630" w:type="dxa"/>
-          </w:tcPr>
-          <w:p>
-            <w:r>
-              <w:t>Actual Result</w:t>
-            </w:r>
-          </w:p>
-        </w:tc>
-        <w:tc>
-          <w:tcPr>
-            <w:tcW w:w="6108" w:type="dxa"/>
-          </w:tcPr>
-          <w:p>
-            <w:r>
-              <w:t>Halaman appointment berhasil diakses pada seluruh waktu pengujian. Seluruh komponen halaman berhasil dimuat dengan baik dan request ke server berhasil diproses tanpa ditemukan error pada proses pengujian.</w:t>
-            </w:r>
-          </w:p>
-        </w:tc>
-      </w:tr>
-      <w:tr>
-        <w:trPr/>
-        <w:tc>
-          <w:tcPr>
-            <w:tcW w:w="1630" w:type="dxa"/>
-          </w:tcPr>
-          <w:p>
-            <w:r>
-              <w:t>Status</w:t>
-            </w:r>
-          </w:p>
-        </w:tc>
-        <w:tc>
-          <w:tcPr>
-            <w:tcW w:w="6108" w:type="dxa"/>
-          </w:tcPr>
-          <w:p>
-            <w:r>
-              <w:t>Berhasil</w:t>
-            </w:r>
-          </w:p>
-        </w:tc>
-      </w:tr>
-      <w:tr>
-        <w:trPr/>
-        <w:tc>
-          <w:tcPr>
-            <w:tcW w:w="1630" w:type="dxa"/>
-          </w:tcPr>
-          <w:p>
-            <w:r>
-              <w:t>Evidence</w:t>
-            </w:r>
-          </w:p>
-        </w:tc>
-        <w:tc>
-          <w:tcPr>
-            <w:tcW w:w="6108" w:type="dxa"/>
-          </w:tcPr>
-          <w:p>
-            <w:pPr>
-              <w:pStyle w:val="DaftarParagraf"/>
-              <w:spacing w:line="360" w:lineRule="auto" w:before="80" w:after="80"/>
-              <w:ind w:left="0"/>
-              <w:jc w:val="center"/>
-              <w:rPr>
-                <w:color w:val="000000"/>
-                <w:szCs w:val="24"/>
-                <w:lang w:val="en-ID"/>
-              </w:rPr>
-            </w:pPr>
-            <w:r/>
-            <w:r>
-              <w:drawing>
-                <wp:inline xmlns:a="http://schemas.openxmlformats.org/drawingml/2006/main" xmlns:pic="http://schemas.openxmlformats.org/drawingml/2006/picture">
-                  <wp:extent cx="4389120" cy="2265426"/>
-                  <wp:docPr id="2011434119" name="Picture 2011434119"/>
-                  <wp:cNvGraphicFramePr>
-                    <a:graphicFrameLocks noChangeAspect="1"/>
-                  </wp:cNvGraphicFramePr>
-                  <a:graphic>
-                    <a:graphicData uri="http://schemas.openxmlformats.org/drawingml/2006/picture">
-                      <pic:pic>
-                        <pic:nvPicPr>
-                          <pic:cNvPr id="0" name="24_reservasi_janji_temu_1781457133575.png"/>
+                          <pic:cNvPr id="0" name="image.png"/>
                           <pic:cNvPicPr/>
                         </pic:nvPicPr>
                         <pic:blipFill>
@@ -22360,6 +22898,9 @@
             <w:tcW w:w="6108" w:type="dxa"/>
           </w:tcPr>
           <w:p>
+            <w:pPr>
+              <w:jc w:val="left"/>
+            </w:pPr>
             <w:r>
               <w:t>NF-02</w:t>
             </w:r>
@@ -22383,6 +22924,9 @@
             <w:tcW w:w="6108" w:type="dxa"/>
           </w:tcPr>
           <w:p>
+            <w:pPr>
+              <w:jc w:val="left"/>
+            </w:pPr>
             <w:r>
               <w:t>Data Security Validation</w:t>
             </w:r>
@@ -22397,7 +22941,7 @@
           </w:tcPr>
           <w:p>
             <w:r>
-              <w:t>Skenario Pengujian</w:t>
+              <w:t>Data Input</w:t>
             </w:r>
           </w:p>
         </w:tc>
@@ -22406,8 +22950,11 @@
             <w:tcW w:w="6108" w:type="dxa"/>
           </w:tcPr>
           <w:p>
-            <w:r>
-              <w:t>Staf memverifikasi penggunaan HTTPS, memeriksa penyimpanan password pada database, serta melakukan pengujian hak akses dengan mencoba mengakses halaman dokter dan admin menggunakan akun pasien</w:t>
+            <w:pPr>
+              <w:jc w:val="left"/>
+            </w:pPr>
+            <w:r>
+              <w:t>Security Spec: SSL/HTTPS port 443, hashing algorithm: bcrypt</w:t>
             </w:r>
           </w:p>
         </w:tc>
@@ -22420,7 +22967,111 @@
           </w:tcPr>
           <w:p>
             <w:r>
-              <w:t>Data Input</w:t>
+              <w:t>Expected Result</w:t>
+            </w:r>
+          </w:p>
+        </w:tc>
+        <w:tc>
+          <w:tcPr>
+            <w:tcW w:w="6108" w:type="dxa"/>
+          </w:tcPr>
+          <w:p>
+            <w:pPr>
+              <w:jc w:val="left"/>
+            </w:pPr>
+            <w:r>
+              <w:t>Sistem menggunakan HTTPS, data pengguna tersimpan dengan aman, dan akses halaman dibatasi sesuai peran pengguna.</w:t>
+            </w:r>
+          </w:p>
+        </w:tc>
+      </w:tr>
+      <w:tr>
+        <w:trPr/>
+        <w:tc>
+          <w:tcPr>
+            <w:tcW w:w="1630" w:type="dxa"/>
+          </w:tcPr>
+          <w:p>
+            <w:r>
+              <w:t>Actual Result</w:t>
+            </w:r>
+          </w:p>
+        </w:tc>
+        <w:tc>
+          <w:tcPr>
+            <w:tcW w:w="6108" w:type="dxa"/>
+          </w:tcPr>
+          <w:p>
+            <w:pPr>
+              <w:jc w:val="left"/>
+            </w:pPr>
+            <w:r>
+              <w:t>Sistem menggunakan HTTPS dan pembatasan akses berdasarkan peran pengguna berjalan sesuai dengan ketentuan yang telah ditetapkan.</w:t>
+            </w:r>
+          </w:p>
+        </w:tc>
+      </w:tr>
+      <w:tr>
+        <w:trPr/>
+        <w:tc>
+          <w:tcPr>
+            <w:tcW w:w="1630" w:type="dxa"/>
+          </w:tcPr>
+          <w:p>
+            <w:r>
+              <w:t>Status</w:t>
+            </w:r>
+          </w:p>
+        </w:tc>
+        <w:tc>
+          <w:tcPr>
+            <w:tcW w:w="6108" w:type="dxa"/>
+          </w:tcPr>
+          <w:p>
+            <w:pPr>
+              <w:jc w:val="left"/>
+            </w:pPr>
+            <w:r>
+              <w:t>Berhasil</w:t>
+            </w:r>
+          </w:p>
+        </w:tc>
+      </w:tr>
+      <w:tr>
+        <w:trPr/>
+        <w:tc>
+          <w:tcPr>
+            <w:tcW w:w="1630" w:type="dxa"/>
+          </w:tcPr>
+          <w:p>
+            <w:r>
+              <w:t>Skenario 1: Uji Hak Akses &amp; Enkripsi Sesi Pengguna</w:t>
+            </w:r>
+          </w:p>
+        </w:tc>
+        <w:tc>
+          <w:tcPr>
+            <w:tcW w:w="6108" w:type="dxa"/>
+          </w:tcPr>
+          <w:p>
+            <w:pPr>
+              <w:jc w:val="left"/>
+            </w:pPr>
+            <w:r>
+              <w:t>Memverifikasi enkripsi password dan proteksi otentikasi role.</w:t>
+            </w:r>
+          </w:p>
+        </w:tc>
+      </w:tr>
+      <w:tr>
+        <w:trPr/>
+        <w:tc>
+          <w:tcPr>
+            <w:tcW w:w="1630" w:type="dxa"/>
+          </w:tcPr>
+          <w:p>
+            <w:r>
+              <w:t>Evidence (Skenario 1: Uji Hak Akses &amp; Enkripsi Sesi Pengguna)</w:t>
             </w:r>
           </w:p>
         </w:tc>
@@ -22444,8 +23095,8 @@
             <w:r>
               <w:drawing>
                 <wp:inline xmlns:a="http://schemas.openxmlformats.org/drawingml/2006/main" xmlns:pic="http://schemas.openxmlformats.org/drawingml/2006/picture">
-                  <wp:extent cx="4389120" cy="2217420"/>
-                  <wp:docPr id="2011434120" name="Picture 2011434120"/>
+                  <wp:extent cx="4389120" cy="2265426"/>
+                  <wp:docPr id="2011434145" name="Picture 2011434145"/>
                   <wp:cNvGraphicFramePr>
                     <a:graphicFrameLocks noChangeAspect="1"/>
                   </wp:cNvGraphicFramePr>
@@ -22453,142 +23104,7 @@
                     <a:graphicData uri="http://schemas.openxmlformats.org/drawingml/2006/picture">
                       <pic:pic>
                         <pic:nvPicPr>
-                          <pic:cNvPr id="0" name="backend_nf02_1781609880356.png"/>
-                          <pic:cNvPicPr/>
-                        </pic:nvPicPr>
-                        <pic:blipFill>
-                          <a:blip r:embed="rId38"/>
-                          <a:stretch>
-                            <a:fillRect/>
-                          </a:stretch>
-                        </pic:blipFill>
-                        <pic:spPr>
-                          <a:xfrm>
-                            <a:off x="0" y="0"/>
-                            <a:ext cx="4389120" cy="2217420"/>
-                          </a:xfrm>
-                          <a:prstGeom prst="rect"/>
-                        </pic:spPr>
-                      </pic:pic>
-                    </a:graphicData>
-                  </a:graphic>
-                </wp:inline>
-              </w:drawing>
-            </w:r>
-          </w:p>
-        </w:tc>
-      </w:tr>
-      <w:tr>
-        <w:trPr/>
-        <w:tc>
-          <w:tcPr>
-            <w:tcW w:w="1630" w:type="dxa"/>
-          </w:tcPr>
-          <w:p>
-            <w:r>
-              <w:t>Expected Result</w:t>
-            </w:r>
-          </w:p>
-        </w:tc>
-        <w:tc>
-          <w:tcPr>
-            <w:tcW w:w="6108" w:type="dxa"/>
-          </w:tcPr>
-          <w:p>
-            <w:r>
-              <w:t>Sistem menggunakan HTTPS, data pengguna tersimpan dengan aman, dan akses halaman dibatasi sesuai peran pengguna.</w:t>
-            </w:r>
-          </w:p>
-        </w:tc>
-      </w:tr>
-      <w:tr>
-        <w:trPr/>
-        <w:tc>
-          <w:tcPr>
-            <w:tcW w:w="1630" w:type="dxa"/>
-          </w:tcPr>
-          <w:p>
-            <w:r>
-              <w:t>Actual Result</w:t>
-            </w:r>
-          </w:p>
-        </w:tc>
-        <w:tc>
-          <w:tcPr>
-            <w:tcW w:w="6108" w:type="dxa"/>
-          </w:tcPr>
-          <w:p>
-            <w:r>
-              <w:t>Sistem menggunakan HTTPS dan pembatasan akses berdasarkan peran pengguna berjalan sesuai dengan ketentuan yang telah ditetapkan.</w:t>
-            </w:r>
-          </w:p>
-        </w:tc>
-      </w:tr>
-      <w:tr>
-        <w:trPr/>
-        <w:tc>
-          <w:tcPr>
-            <w:tcW w:w="1630" w:type="dxa"/>
-          </w:tcPr>
-          <w:p>
-            <w:r>
-              <w:t>Status</w:t>
-            </w:r>
-          </w:p>
-        </w:tc>
-        <w:tc>
-          <w:tcPr>
-            <w:tcW w:w="6108" w:type="dxa"/>
-          </w:tcPr>
-          <w:p>
-            <w:r>
-              <w:t>Berhasil</w:t>
-            </w:r>
-          </w:p>
-        </w:tc>
-      </w:tr>
-      <w:tr>
-        <w:trPr/>
-        <w:tc>
-          <w:tcPr>
-            <w:tcW w:w="1630" w:type="dxa"/>
-          </w:tcPr>
-          <w:p>
-            <w:r>
-              <w:t>Evidence</w:t>
-            </w:r>
-          </w:p>
-        </w:tc>
-        <w:tc>
-          <w:tcPr>
-            <w:tcW w:w="6108" w:type="dxa"/>
-          </w:tcPr>
-          <w:p>
-            <w:pPr>
-              <w:pStyle w:val="DaftarParagraf"/>
-              <w:spacing w:line="360" w:lineRule="auto" w:before="80" w:after="80"/>
-              <w:ind w:left="0"/>
-              <w:jc w:val="center"/>
-              <w:rPr>
-                <w:color w:val="000000"/>
-                <w:szCs w:val="24"/>
-                <w:lang w:val="en-ID"/>
-              </w:rPr>
-            </w:pPr>
-            <w:r/>
-            <w:r>
-              <w:drawing>
-                <wp:inline xmlns:a="http://schemas.openxmlformats.org/drawingml/2006/main" xmlns:pic="http://schemas.openxmlformats.org/drawingml/2006/picture">
-                  <wp:extent cx="4389120" cy="2265426"/>
-                  <wp:docPr id="2011434121" name="Picture 2011434121"/>
-                  <wp:cNvGraphicFramePr>
-                    <a:graphicFrameLocks noChangeAspect="1"/>
-                  </wp:cNvGraphicFramePr>
-                  <a:graphic>
-                    <a:graphicData uri="http://schemas.openxmlformats.org/drawingml/2006/picture">
-                      <pic:pic>
-                        <pic:nvPicPr>
-                          <pic:cNvPr id="0" name="01_login_staf_sukses_1781491070641.png"/>
+                          <pic:cNvPr id="0" name="image.png"/>
                           <pic:cNvPicPr/>
                         </pic:nvPicPr>
                         <pic:blipFill>
@@ -22827,6 +23343,9 @@
             <w:tcW w:w="6108" w:type="dxa"/>
           </w:tcPr>
           <w:p>
+            <w:pPr>
+              <w:jc w:val="left"/>
+            </w:pPr>
             <w:r>
               <w:t>NF-03</w:t>
             </w:r>
@@ -22850,6 +23369,9 @@
             <w:tcW w:w="6108" w:type="dxa"/>
           </w:tcPr>
           <w:p>
+            <w:pPr>
+              <w:jc w:val="left"/>
+            </w:pPr>
             <w:r>
               <w:t>Responsive Interface Validation</w:t>
             </w:r>
@@ -22864,7 +23386,7 @@
           </w:tcPr>
           <w:p>
             <w:r>
-              <w:t>Skenario Pengujian</w:t>
+              <w:t>Data Input</w:t>
             </w:r>
           </w:p>
         </w:tc>
@@ -22873,8 +23395,11 @@
             <w:tcW w:w="6108" w:type="dxa"/>
           </w:tcPr>
           <w:p>
-            <w:r>
-              <w:t>Staf membuka aplikasi menggunakan berbagai ukuran layar dan browser yang berbeda untuk memastikan tampilan tetap konsisten</w:t>
+            <w:pPr>
+              <w:jc w:val="left"/>
+            </w:pPr>
+            <w:r>
+              <w:t>Viewport Dimensions: [360x740, 768x1024, 1920x1080]</w:t>
             </w:r>
           </w:p>
         </w:tc>
@@ -22887,7 +23412,111 @@
           </w:tcPr>
           <w:p>
             <w:r>
-              <w:t>Data Input</w:t>
+              <w:t>Expected Result</w:t>
+            </w:r>
+          </w:p>
+        </w:tc>
+        <w:tc>
+          <w:tcPr>
+            <w:tcW w:w="6108" w:type="dxa"/>
+          </w:tcPr>
+          <w:p>
+            <w:pPr>
+              <w:jc w:val="left"/>
+            </w:pPr>
+            <w:r>
+              <w:t>Tampilan aplikasi tetap rapi, elemen UI tidak bertumpuk, dan seluruh fungsi berjalan normal pada seluruh perangkat yang diuji.</w:t>
+            </w:r>
+          </w:p>
+        </w:tc>
+      </w:tr>
+      <w:tr>
+        <w:trPr/>
+        <w:tc>
+          <w:tcPr>
+            <w:tcW w:w="1630" w:type="dxa"/>
+          </w:tcPr>
+          <w:p>
+            <w:r>
+              <w:t>Actual Result</w:t>
+            </w:r>
+          </w:p>
+        </w:tc>
+        <w:tc>
+          <w:tcPr>
+            <w:tcW w:w="6108" w:type="dxa"/>
+          </w:tcPr>
+          <w:p>
+            <w:pPr>
+              <w:jc w:val="left"/>
+            </w:pPr>
+            <w:r>
+              <w:t>Tampilan aplikasi berhasil menyesuaikan ukuran layar dan seluruh fitur dapat digunakan dengan baik pada perangkat yang diuji.</w:t>
+            </w:r>
+          </w:p>
+        </w:tc>
+      </w:tr>
+      <w:tr>
+        <w:trPr/>
+        <w:tc>
+          <w:tcPr>
+            <w:tcW w:w="1630" w:type="dxa"/>
+          </w:tcPr>
+          <w:p>
+            <w:r>
+              <w:t>Status</w:t>
+            </w:r>
+          </w:p>
+        </w:tc>
+        <w:tc>
+          <w:tcPr>
+            <w:tcW w:w="6108" w:type="dxa"/>
+          </w:tcPr>
+          <w:p>
+            <w:pPr>
+              <w:jc w:val="left"/>
+            </w:pPr>
+            <w:r>
+              <w:t>Berhasil</w:t>
+            </w:r>
+          </w:p>
+        </w:tc>
+      </w:tr>
+      <w:tr>
+        <w:trPr/>
+        <w:tc>
+          <w:tcPr>
+            <w:tcW w:w="1630" w:type="dxa"/>
+          </w:tcPr>
+          <w:p>
+            <w:r>
+              <w:t>Skenario 1: Tampilan Mobile Viewport</w:t>
+            </w:r>
+          </w:p>
+        </w:tc>
+        <w:tc>
+          <w:tcPr>
+            <w:tcW w:w="6108" w:type="dxa"/>
+          </w:tcPr>
+          <w:p>
+            <w:pPr>
+              <w:jc w:val="left"/>
+            </w:pPr>
+            <w:r>
+              <w:t>Memverifikasi tata letak elemen tetap rapi pada layar mobile.</w:t>
+            </w:r>
+          </w:p>
+        </w:tc>
+      </w:tr>
+      <w:tr>
+        <w:trPr/>
+        <w:tc>
+          <w:tcPr>
+            <w:tcW w:w="1630" w:type="dxa"/>
+          </w:tcPr>
+          <w:p>
+            <w:r>
+              <w:t>Evidence (Skenario 1: Tampilan Mobile Viewport)</w:t>
             </w:r>
           </w:p>
         </w:tc>
@@ -22911,8 +23540,8 @@
             <w:r>
               <w:drawing>
                 <wp:inline xmlns:a="http://schemas.openxmlformats.org/drawingml/2006/main" xmlns:pic="http://schemas.openxmlformats.org/drawingml/2006/picture">
-                  <wp:extent cx="4389120" cy="2217420"/>
-                  <wp:docPr id="2011434122" name="Picture 2011434122"/>
+                  <wp:extent cx="4389120" cy="6293998"/>
+                  <wp:docPr id="2011434146" name="Picture 2011434146"/>
                   <wp:cNvGraphicFramePr>
                     <a:graphicFrameLocks noChangeAspect="1"/>
                   </wp:cNvGraphicFramePr>
@@ -22920,142 +23549,7 @@
                     <a:graphicData uri="http://schemas.openxmlformats.org/drawingml/2006/picture">
                       <pic:pic>
                         <pic:nvPicPr>
-                          <pic:cNvPr id="0" name="backend_nf03_1781609886910.png"/>
-                          <pic:cNvPicPr/>
-                        </pic:nvPicPr>
-                        <pic:blipFill>
-                          <a:blip r:embed="rId39"/>
-                          <a:stretch>
-                            <a:fillRect/>
-                          </a:stretch>
-                        </pic:blipFill>
-                        <pic:spPr>
-                          <a:xfrm>
-                            <a:off x="0" y="0"/>
-                            <a:ext cx="4389120" cy="2217420"/>
-                          </a:xfrm>
-                          <a:prstGeom prst="rect"/>
-                        </pic:spPr>
-                      </pic:pic>
-                    </a:graphicData>
-                  </a:graphic>
-                </wp:inline>
-              </w:drawing>
-            </w:r>
-          </w:p>
-        </w:tc>
-      </w:tr>
-      <w:tr>
-        <w:trPr/>
-        <w:tc>
-          <w:tcPr>
-            <w:tcW w:w="1630" w:type="dxa"/>
-          </w:tcPr>
-          <w:p>
-            <w:r>
-              <w:t>Expected Result</w:t>
-            </w:r>
-          </w:p>
-        </w:tc>
-        <w:tc>
-          <w:tcPr>
-            <w:tcW w:w="6108" w:type="dxa"/>
-          </w:tcPr>
-          <w:p>
-            <w:r>
-              <w:t>Tampilan aplikasi tetap rapi, elemen UI tidak bertumpuk, dan seluruh fungsi berjalan normal pada seluruh perangkat yang diuji.</w:t>
-            </w:r>
-          </w:p>
-        </w:tc>
-      </w:tr>
-      <w:tr>
-        <w:trPr/>
-        <w:tc>
-          <w:tcPr>
-            <w:tcW w:w="1630" w:type="dxa"/>
-          </w:tcPr>
-          <w:p>
-            <w:r>
-              <w:t>Actual Result</w:t>
-            </w:r>
-          </w:p>
-        </w:tc>
-        <w:tc>
-          <w:tcPr>
-            <w:tcW w:w="6108" w:type="dxa"/>
-          </w:tcPr>
-          <w:p>
-            <w:r>
-              <w:t>Tampilan aplikasi berhasil menyesuaikan ukuran layar dan seluruh fitur dapat digunakan dengan baik pada perangkat yang diuji.</w:t>
-            </w:r>
-          </w:p>
-        </w:tc>
-      </w:tr>
-      <w:tr>
-        <w:trPr/>
-        <w:tc>
-          <w:tcPr>
-            <w:tcW w:w="1630" w:type="dxa"/>
-          </w:tcPr>
-          <w:p>
-            <w:r>
-              <w:t>Status</w:t>
-            </w:r>
-          </w:p>
-        </w:tc>
-        <w:tc>
-          <w:tcPr>
-            <w:tcW w:w="6108" w:type="dxa"/>
-          </w:tcPr>
-          <w:p>
-            <w:r>
-              <w:t>Berhasil</w:t>
-            </w:r>
-          </w:p>
-        </w:tc>
-      </w:tr>
-      <w:tr>
-        <w:trPr/>
-        <w:tc>
-          <w:tcPr>
-            <w:tcW w:w="1630" w:type="dxa"/>
-          </w:tcPr>
-          <w:p>
-            <w:r>
-              <w:t>Evidence</w:t>
-            </w:r>
-          </w:p>
-        </w:tc>
-        <w:tc>
-          <w:tcPr>
-            <w:tcW w:w="6108" w:type="dxa"/>
-          </w:tcPr>
-          <w:p>
-            <w:pPr>
-              <w:pStyle w:val="DaftarParagraf"/>
-              <w:spacing w:line="360" w:lineRule="auto" w:before="80" w:after="80"/>
-              <w:ind w:left="0"/>
-              <w:jc w:val="center"/>
-              <w:rPr>
-                <w:color w:val="000000"/>
-                <w:szCs w:val="24"/>
-                <w:lang w:val="en-ID"/>
-              </w:rPr>
-            </w:pPr>
-            <w:r/>
-            <w:r>
-              <w:drawing>
-                <wp:inline xmlns:a="http://schemas.openxmlformats.org/drawingml/2006/main" xmlns:pic="http://schemas.openxmlformats.org/drawingml/2006/picture">
-                  <wp:extent cx="4389120" cy="6293998"/>
-                  <wp:docPr id="2011434123" name="Picture 2011434123"/>
-                  <wp:cNvGraphicFramePr>
-                    <a:graphicFrameLocks noChangeAspect="1"/>
-                  </wp:cNvGraphicFramePr>
-                  <a:graphic>
-                    <a:graphicData uri="http://schemas.openxmlformats.org/drawingml/2006/picture">
-                      <pic:pic>
-                        <pic:nvPicPr>
-                          <pic:cNvPr id="0" name="mobile_login_view_1781025189516.png"/>
+                          <pic:cNvPr id="0" name="image.png"/>
                           <pic:cNvPicPr/>
                         </pic:nvPicPr>
                         <pic:blipFill>
@@ -23080,6 +23574,98 @@
           </w:p>
         </w:tc>
       </w:tr>
+      <w:tr>
+        <w:trPr/>
+        <w:tc>
+          <w:tcPr>
+            <w:tcW w:w="1630" w:type="dxa"/>
+          </w:tcPr>
+          <w:p>
+            <w:r>
+              <w:t>Skenario 2: Tampilan Tablet Viewport</w:t>
+            </w:r>
+          </w:p>
+        </w:tc>
+        <w:tc>
+          <w:tcPr>
+            <w:tcW w:w="6108" w:type="dxa"/>
+          </w:tcPr>
+          <w:p>
+            <w:pPr>
+              <w:jc w:val="left"/>
+            </w:pPr>
+            <w:r>
+              <w:t>Memverifikasi responsivitas antarmuka pada ukuran layar tablet.</w:t>
+            </w:r>
+          </w:p>
+        </w:tc>
+      </w:tr>
+      <w:tr>
+        <w:trPr/>
+        <w:tc>
+          <w:tcPr>
+            <w:tcW w:w="1630" w:type="dxa"/>
+          </w:tcPr>
+          <w:p>
+            <w:r>
+              <w:t>Evidence (Skenario 2: Tampilan Tablet Viewport)</w:t>
+            </w:r>
+          </w:p>
+        </w:tc>
+        <w:tc>
+          <w:tcPr>
+            <w:tcW w:w="6108" w:type="dxa"/>
+          </w:tcPr>
+          <w:p>
+            <w:pPr>
+              <w:pStyle w:val="DaftarParagraf"/>
+              <w:spacing w:line="360" w:lineRule="auto" w:before="80" w:after="80"/>
+              <w:ind w:left="0"/>
+              <w:jc w:val="center"/>
+              <w:rPr>
+                <w:color w:val="000000"/>
+                <w:szCs w:val="24"/>
+                <w:lang w:val="en-ID"/>
+              </w:rPr>
+            </w:pPr>
+            <w:r/>
+            <w:r>
+              <w:drawing>
+                <wp:inline xmlns:a="http://schemas.openxmlformats.org/drawingml/2006/main" xmlns:pic="http://schemas.openxmlformats.org/drawingml/2006/picture">
+                  <wp:extent cx="4389120" cy="5422197"/>
+                  <wp:docPr id="2011434147" name="Picture 2011434147"/>
+                  <wp:cNvGraphicFramePr>
+                    <a:graphicFrameLocks noChangeAspect="1"/>
+                  </wp:cNvGraphicFramePr>
+                  <a:graphic>
+                    <a:graphicData uri="http://schemas.openxmlformats.org/drawingml/2006/picture">
+                      <pic:pic>
+                        <pic:nvPicPr>
+                          <pic:cNvPr id="0" name="tablet_login_view_1781025206134.png"/>
+                          <pic:cNvPicPr/>
+                        </pic:nvPicPr>
+                        <pic:blipFill>
+                          <a:blip r:embed="rId51"/>
+                          <a:stretch>
+                            <a:fillRect/>
+                          </a:stretch>
+                        </pic:blipFill>
+                        <pic:spPr>
+                          <a:xfrm>
+                            <a:off x="0" y="0"/>
+                            <a:ext cx="4389120" cy="5422197"/>
+                          </a:xfrm>
+                          <a:prstGeom prst="rect"/>
+                        </pic:spPr>
+                      </pic:pic>
+                    </a:graphicData>
+                  </a:graphic>
+                </wp:inline>
+              </w:drawing>
+            </w:r>
+          </w:p>
+        </w:tc>
+      </w:tr>
     </w:tbl>
     <w:p>
       <w:pPr>
@@ -23285,6 +23871,9 @@
             <w:tcW w:w="6108" w:type="dxa"/>
           </w:tcPr>
           <w:p>
+            <w:pPr>
+              <w:jc w:val="left"/>
+            </w:pPr>
             <w:r>
               <w:t>NF-04</w:t>
             </w:r>
@@ -23308,6 +23897,9 @@
             <w:tcW w:w="6108" w:type="dxa"/>
           </w:tcPr>
           <w:p>
+            <w:pPr>
+              <w:jc w:val="left"/>
+            </w:pPr>
             <w:r>
               <w:t>User Interaction Efficiency</w:t>
             </w:r>
@@ -23322,7 +23914,7 @@
           </w:tcPr>
           <w:p>
             <w:r>
-              <w:t>Skenario Pengujian</w:t>
+              <w:t>Data Input</w:t>
             </w:r>
           </w:p>
         </w:tc>
@@ -23331,8 +23923,11 @@
             <w:tcW w:w="6108" w:type="dxa"/>
           </w:tcPr>
           <w:p>
-            <w:r>
-              <w:t>Pasien, dokter, dan admin diminta mencoba fitur utama aplikasi sesuai perannya tanpa diberikan instruksi tambahan.</w:t>
+            <w:pPr>
+              <w:jc w:val="left"/>
+            </w:pPr>
+            <w:r>
+              <w:t>Action triggers: onClick(), onChange(), onSubmit()</w:t>
             </w:r>
           </w:p>
         </w:tc>
@@ -23345,7 +23940,111 @@
           </w:tcPr>
           <w:p>
             <w:r>
-              <w:t>Data Input</w:t>
+              <w:t>Expected Result</w:t>
+            </w:r>
+          </w:p>
+        </w:tc>
+        <w:tc>
+          <w:tcPr>
+            <w:tcW w:w="6108" w:type="dxa"/>
+          </w:tcPr>
+          <w:p>
+            <w:pPr>
+              <w:jc w:val="left"/>
+            </w:pPr>
+            <w:r>
+              <w:t>Pengguna dapat menyelesaikan tugas utama sesuai perannya tanpa memerlukan bantuan tambahan.</w:t>
+            </w:r>
+          </w:p>
+        </w:tc>
+      </w:tr>
+      <w:tr>
+        <w:trPr/>
+        <w:tc>
+          <w:tcPr>
+            <w:tcW w:w="1630" w:type="dxa"/>
+          </w:tcPr>
+          <w:p>
+            <w:r>
+              <w:t>Actual Result</w:t>
+            </w:r>
+          </w:p>
+        </w:tc>
+        <w:tc>
+          <w:tcPr>
+            <w:tcW w:w="6108" w:type="dxa"/>
+          </w:tcPr>
+          <w:p>
+            <w:pPr>
+              <w:jc w:val="left"/>
+            </w:pPr>
+            <w:r>
+              <w:t>Pengguna berhasil menyelesaikan seluruh tugas utama sesuai perannya masing-masing tanpa mengalami kesulitan yang signifikan</w:t>
+            </w:r>
+          </w:p>
+        </w:tc>
+      </w:tr>
+      <w:tr>
+        <w:trPr/>
+        <w:tc>
+          <w:tcPr>
+            <w:tcW w:w="1630" w:type="dxa"/>
+          </w:tcPr>
+          <w:p>
+            <w:r>
+              <w:t>Status</w:t>
+            </w:r>
+          </w:p>
+        </w:tc>
+        <w:tc>
+          <w:tcPr>
+            <w:tcW w:w="6108" w:type="dxa"/>
+          </w:tcPr>
+          <w:p>
+            <w:pPr>
+              <w:jc w:val="left"/>
+            </w:pPr>
+            <w:r>
+              <w:t>Berhasil</w:t>
+            </w:r>
+          </w:p>
+        </w:tc>
+      </w:tr>
+      <w:tr>
+        <w:trPr/>
+        <w:tc>
+          <w:tcPr>
+            <w:tcW w:w="1630" w:type="dxa"/>
+          </w:tcPr>
+          <w:p>
+            <w:r>
+              <w:t>Skenario 1: Validasi Navigasi &amp; Efisiensi Interaksi Pengguna</w:t>
+            </w:r>
+          </w:p>
+        </w:tc>
+        <w:tc>
+          <w:tcPr>
+            <w:tcW w:w="6108" w:type="dxa"/>
+          </w:tcPr>
+          <w:p>
+            <w:pPr>
+              <w:jc w:val="left"/>
+            </w:pPr>
+            <w:r>
+              <w:t>Memastikan transisi antar halaman mulus tanpa delay yang mengganggu.</w:t>
+            </w:r>
+          </w:p>
+        </w:tc>
+      </w:tr>
+      <w:tr>
+        <w:trPr/>
+        <w:tc>
+          <w:tcPr>
+            <w:tcW w:w="1630" w:type="dxa"/>
+          </w:tcPr>
+          <w:p>
+            <w:r>
+              <w:t>Evidence (Skenario 1: Validasi Navigasi &amp; Efisiensi Interaksi Pengguna)</w:t>
             </w:r>
           </w:p>
         </w:tc>
@@ -23369,8 +24068,8 @@
             <w:r>
               <w:drawing>
                 <wp:inline xmlns:a="http://schemas.openxmlformats.org/drawingml/2006/main" xmlns:pic="http://schemas.openxmlformats.org/drawingml/2006/picture">
-                  <wp:extent cx="4389120" cy="2217420"/>
-                  <wp:docPr id="2011434124" name="Picture 2011434124"/>
+                  <wp:extent cx="4389120" cy="2265426"/>
+                  <wp:docPr id="2011434148" name="Picture 2011434148"/>
                   <wp:cNvGraphicFramePr>
                     <a:graphicFrameLocks noChangeAspect="1"/>
                   </wp:cNvGraphicFramePr>
@@ -23378,142 +24077,7 @@
                     <a:graphicData uri="http://schemas.openxmlformats.org/drawingml/2006/picture">
                       <pic:pic>
                         <pic:nvPicPr>
-                          <pic:cNvPr id="0" name="backend_nf04_1781609902152.png"/>
-                          <pic:cNvPicPr/>
-                        </pic:nvPicPr>
-                        <pic:blipFill>
-                          <a:blip r:embed="rId41"/>
-                          <a:stretch>
-                            <a:fillRect/>
-                          </a:stretch>
-                        </pic:blipFill>
-                        <pic:spPr>
-                          <a:xfrm>
-                            <a:off x="0" y="0"/>
-                            <a:ext cx="4389120" cy="2217420"/>
-                          </a:xfrm>
-                          <a:prstGeom prst="rect"/>
-                        </pic:spPr>
-                      </pic:pic>
-                    </a:graphicData>
-                  </a:graphic>
-                </wp:inline>
-              </w:drawing>
-            </w:r>
-          </w:p>
-        </w:tc>
-      </w:tr>
-      <w:tr>
-        <w:trPr/>
-        <w:tc>
-          <w:tcPr>
-            <w:tcW w:w="1630" w:type="dxa"/>
-          </w:tcPr>
-          <w:p>
-            <w:r>
-              <w:t>Expected Result</w:t>
-            </w:r>
-          </w:p>
-        </w:tc>
-        <w:tc>
-          <w:tcPr>
-            <w:tcW w:w="6108" w:type="dxa"/>
-          </w:tcPr>
-          <w:p>
-            <w:r>
-              <w:t>Pengguna dapat menyelesaikan tugas utama sesuai perannya tanpa memerlukan bantuan tambahan.</w:t>
-            </w:r>
-          </w:p>
-        </w:tc>
-      </w:tr>
-      <w:tr>
-        <w:trPr/>
-        <w:tc>
-          <w:tcPr>
-            <w:tcW w:w="1630" w:type="dxa"/>
-          </w:tcPr>
-          <w:p>
-            <w:r>
-              <w:t>Actual Result</w:t>
-            </w:r>
-          </w:p>
-        </w:tc>
-        <w:tc>
-          <w:tcPr>
-            <w:tcW w:w="6108" w:type="dxa"/>
-          </w:tcPr>
-          <w:p>
-            <w:r>
-              <w:t>Pengguna berhasil menyelesaikan seluruh tugas utama sesuai perannya masing-masing tanpa mengalami kesulitan yang signifikan</w:t>
-            </w:r>
-          </w:p>
-        </w:tc>
-      </w:tr>
-      <w:tr>
-        <w:trPr/>
-        <w:tc>
-          <w:tcPr>
-            <w:tcW w:w="1630" w:type="dxa"/>
-          </w:tcPr>
-          <w:p>
-            <w:r>
-              <w:t>Status</w:t>
-            </w:r>
-          </w:p>
-        </w:tc>
-        <w:tc>
-          <w:tcPr>
-            <w:tcW w:w="6108" w:type="dxa"/>
-          </w:tcPr>
-          <w:p>
-            <w:r>
-              <w:t>Berhasil</w:t>
-            </w:r>
-          </w:p>
-        </w:tc>
-      </w:tr>
-      <w:tr>
-        <w:trPr/>
-        <w:tc>
-          <w:tcPr>
-            <w:tcW w:w="1630" w:type="dxa"/>
-          </w:tcPr>
-          <w:p>
-            <w:r>
-              <w:t>Evidence</w:t>
-            </w:r>
-          </w:p>
-        </w:tc>
-        <w:tc>
-          <w:tcPr>
-            <w:tcW w:w="6108" w:type="dxa"/>
-          </w:tcPr>
-          <w:p>
-            <w:pPr>
-              <w:pStyle w:val="DaftarParagraf"/>
-              <w:spacing w:line="360" w:lineRule="auto" w:before="80" w:after="80"/>
-              <w:ind w:left="0"/>
-              <w:jc w:val="center"/>
-              <w:rPr>
-                <w:color w:val="000000"/>
-                <w:szCs w:val="24"/>
-                <w:lang w:val="en-ID"/>
-              </w:rPr>
-            </w:pPr>
-            <w:r/>
-            <w:r>
-              <w:drawing>
-                <wp:inline xmlns:a="http://schemas.openxmlformats.org/drawingml/2006/main" xmlns:pic="http://schemas.openxmlformats.org/drawingml/2006/picture">
-                  <wp:extent cx="4389120" cy="2265426"/>
-                  <wp:docPr id="2011434125" name="Picture 2011434125"/>
-                  <wp:cNvGraphicFramePr>
-                    <a:graphicFrameLocks noChangeAspect="1"/>
-                  </wp:cNvGraphicFramePr>
-                  <a:graphic>
-                    <a:graphicData uri="http://schemas.openxmlformats.org/drawingml/2006/picture">
-                      <pic:pic>
-                        <pic:nvPicPr>
-                          <pic:cNvPr id="0" name="53_dashboard_summary_cards_1781491979654.png"/>
+                          <pic:cNvPr id="0" name="image.png"/>
                           <pic:cNvPicPr/>
                         </pic:nvPicPr>
                         <pic:blipFill>
@@ -23733,6 +24297,9 @@
             <w:tcW w:w="6108" w:type="dxa"/>
           </w:tcPr>
           <w:p>
+            <w:pPr>
+              <w:jc w:val="left"/>
+            </w:pPr>
             <w:r>
               <w:t>NF-05</w:t>
             </w:r>
@@ -23756,6 +24323,9 @@
             <w:tcW w:w="6108" w:type="dxa"/>
           </w:tcPr>
           <w:p>
+            <w:pPr>
+              <w:jc w:val="left"/>
+            </w:pPr>
             <w:r>
               <w:t>Page Load Time Measurement</w:t>
             </w:r>
@@ -23770,7 +24340,7 @@
           </w:tcPr>
           <w:p>
             <w:r>
-              <w:t>Skenario Pengujian</w:t>
+              <w:t>Data Input</w:t>
             </w:r>
           </w:p>
         </w:tc>
@@ -23779,8 +24349,11 @@
             <w:tcW w:w="6108" w:type="dxa"/>
           </w:tcPr>
           <w:p>
-            <w:r>
-              <w:t>Staf membuka halaman utama, halaman booking, dan dashboard kemudian memantau waktu muat halaman menggunakan Browser Developer Tools.</w:t>
+            <w:pPr>
+              <w:jc w:val="left"/>
+            </w:pPr>
+            <w:r>
+              <w:t>Network performance logs: [DNS Lookup, TCP Handshake, TTFB, DOM Content Loaded]</w:t>
             </w:r>
           </w:p>
         </w:tc>
@@ -23793,7 +24366,137 @@
           </w:tcPr>
           <w:p>
             <w:r>
-              <w:t>Data Input</w:t>
+              <w:t>Response Time</w:t>
+            </w:r>
+          </w:p>
+        </w:tc>
+        <w:tc>
+          <w:tcPr>
+            <w:tcW w:w="6108" w:type="dxa"/>
+          </w:tcPr>
+          <w:p>
+            <w:pPr>
+              <w:jc w:val="left"/>
+            </w:pPr>
+            <w:r>
+              <w:t>85 ms (API appointments) / 415 ms (Page Load)</w:t>
+            </w:r>
+          </w:p>
+        </w:tc>
+      </w:tr>
+      <w:tr>
+        <w:trPr/>
+        <w:tc>
+          <w:tcPr>
+            <w:tcW w:w="1630" w:type="dxa"/>
+          </w:tcPr>
+          <w:p>
+            <w:r>
+              <w:t>Expected Result</w:t>
+            </w:r>
+          </w:p>
+        </w:tc>
+        <w:tc>
+          <w:tcPr>
+            <w:tcW w:w="6108" w:type="dxa"/>
+          </w:tcPr>
+          <w:p>
+            <w:pPr>
+              <w:jc w:val="left"/>
+            </w:pPr>
+            <w:r>
+              <w:t>Waktu muat setiap halaman berada di bawah 5 detik.</w:t>
+            </w:r>
+          </w:p>
+        </w:tc>
+      </w:tr>
+      <w:tr>
+        <w:trPr/>
+        <w:tc>
+          <w:tcPr>
+            <w:tcW w:w="1630" w:type="dxa"/>
+          </w:tcPr>
+          <w:p>
+            <w:r>
+              <w:t>Actual Result</w:t>
+            </w:r>
+          </w:p>
+        </w:tc>
+        <w:tc>
+          <w:tcPr>
+            <w:tcW w:w="6108" w:type="dxa"/>
+          </w:tcPr>
+          <w:p>
+            <w:pPr>
+              <w:jc w:val="left"/>
+            </w:pPr>
+            <w:r>
+              <w:t>Seluruh halaman yang diuji berhasil dimuat sesuai dengan spesifikasi waktu yang telah ditentukan.</w:t>
+            </w:r>
+          </w:p>
+        </w:tc>
+      </w:tr>
+      <w:tr>
+        <w:trPr/>
+        <w:tc>
+          <w:tcPr>
+            <w:tcW w:w="1630" w:type="dxa"/>
+          </w:tcPr>
+          <w:p>
+            <w:r>
+              <w:t>Status</w:t>
+            </w:r>
+          </w:p>
+        </w:tc>
+        <w:tc>
+          <w:tcPr>
+            <w:tcW w:w="6108" w:type="dxa"/>
+          </w:tcPr>
+          <w:p>
+            <w:pPr>
+              <w:jc w:val="left"/>
+            </w:pPr>
+            <w:r>
+              <w:t>Berhasil</w:t>
+            </w:r>
+          </w:p>
+        </w:tc>
+      </w:tr>
+      <w:tr>
+        <w:trPr/>
+        <w:tc>
+          <w:tcPr>
+            <w:tcW w:w="1630" w:type="dxa"/>
+          </w:tcPr>
+          <w:p>
+            <w:r>
+              <w:t>Skenario 1: Pengukuran Waktu Respons API &amp; Page Load (Chrome DevTools)</w:t>
+            </w:r>
+          </w:p>
+        </w:tc>
+        <w:tc>
+          <w:tcPr>
+            <w:tcW w:w="6108" w:type="dxa"/>
+          </w:tcPr>
+          <w:p>
+            <w:pPr>
+              <w:jc w:val="left"/>
+            </w:pPr>
+            <w:r>
+              <w:t>Memverifikasi waktu muat API berada di bawah batas toleransi.</w:t>
+            </w:r>
+          </w:p>
+        </w:tc>
+      </w:tr>
+      <w:tr>
+        <w:trPr/>
+        <w:tc>
+          <w:tcPr>
+            <w:tcW w:w="1630" w:type="dxa"/>
+          </w:tcPr>
+          <w:p>
+            <w:r>
+              <w:t>Evidence (Skenario 1: Pengukuran Waktu Respons API &amp; Page Load (Chrome DevTools))</w:t>
             </w:r>
           </w:p>
         </w:tc>
@@ -23818,7 +24521,7 @@
               <w:drawing>
                 <wp:inline xmlns:a="http://schemas.openxmlformats.org/drawingml/2006/main" xmlns:pic="http://schemas.openxmlformats.org/drawingml/2006/picture">
                   <wp:extent cx="4389120" cy="2217420"/>
-                  <wp:docPr id="2011434126" name="Picture 2011434126"/>
+                  <wp:docPr id="2011434149" name="Picture 2011434149"/>
                   <wp:cNvGraphicFramePr>
                     <a:graphicFrameLocks noChangeAspect="1"/>
                   </wp:cNvGraphicFramePr>
@@ -23826,11 +24529,11 @@
                     <a:graphicData uri="http://schemas.openxmlformats.org/drawingml/2006/picture">
                       <pic:pic>
                         <pic:nvPicPr>
-                          <pic:cNvPr id="0" name="backend_nf05_1781609910206.png"/>
+                          <pic:cNvPr id="0" name="devtools_nf05.png"/>
                           <pic:cNvPicPr/>
                         </pic:nvPicPr>
                         <pic:blipFill>
-                          <a:blip r:embed="rId43"/>
+                          <a:blip r:embed="rId52"/>
                           <a:stretch>
                             <a:fillRect/>
                           </a:stretch>
@@ -23839,141 +24542,6 @@
                           <a:xfrm>
                             <a:off x="0" y="0"/>
                             <a:ext cx="4389120" cy="2217420"/>
-                          </a:xfrm>
-                          <a:prstGeom prst="rect"/>
-                        </pic:spPr>
-                      </pic:pic>
-                    </a:graphicData>
-                  </a:graphic>
-                </wp:inline>
-              </w:drawing>
-            </w:r>
-          </w:p>
-        </w:tc>
-      </w:tr>
-      <w:tr>
-        <w:trPr/>
-        <w:tc>
-          <w:tcPr>
-            <w:tcW w:w="1630" w:type="dxa"/>
-          </w:tcPr>
-          <w:p>
-            <w:r>
-              <w:t>Expected Result</w:t>
-            </w:r>
-          </w:p>
-        </w:tc>
-        <w:tc>
-          <w:tcPr>
-            <w:tcW w:w="6108" w:type="dxa"/>
-          </w:tcPr>
-          <w:p>
-            <w:r>
-              <w:t>Waktu muat setiap halaman berada di bawah 5 detik.</w:t>
-            </w:r>
-          </w:p>
-        </w:tc>
-      </w:tr>
-      <w:tr>
-        <w:trPr/>
-        <w:tc>
-          <w:tcPr>
-            <w:tcW w:w="1630" w:type="dxa"/>
-          </w:tcPr>
-          <w:p>
-            <w:r>
-              <w:t>Actual Result</w:t>
-            </w:r>
-          </w:p>
-        </w:tc>
-        <w:tc>
-          <w:tcPr>
-            <w:tcW w:w="6108" w:type="dxa"/>
-          </w:tcPr>
-          <w:p>
-            <w:r>
-              <w:t>Seluruh halaman yang diuji berhasil dimuat sesuai dengan spesifikasi waktu yang telah ditentukan.</w:t>
-            </w:r>
-          </w:p>
-        </w:tc>
-      </w:tr>
-      <w:tr>
-        <w:trPr/>
-        <w:tc>
-          <w:tcPr>
-            <w:tcW w:w="1630" w:type="dxa"/>
-          </w:tcPr>
-          <w:p>
-            <w:r>
-              <w:t>Status</w:t>
-            </w:r>
-          </w:p>
-        </w:tc>
-        <w:tc>
-          <w:tcPr>
-            <w:tcW w:w="6108" w:type="dxa"/>
-          </w:tcPr>
-          <w:p>
-            <w:r>
-              <w:t>Berhasil</w:t>
-            </w:r>
-          </w:p>
-        </w:tc>
-      </w:tr>
-      <w:tr>
-        <w:trPr/>
-        <w:tc>
-          <w:tcPr>
-            <w:tcW w:w="1630" w:type="dxa"/>
-          </w:tcPr>
-          <w:p>
-            <w:r>
-              <w:t>Evidence</w:t>
-            </w:r>
-          </w:p>
-        </w:tc>
-        <w:tc>
-          <w:tcPr>
-            <w:tcW w:w="6108" w:type="dxa"/>
-          </w:tcPr>
-          <w:p>
-            <w:pPr>
-              <w:pStyle w:val="DaftarParagraf"/>
-              <w:spacing w:line="360" w:lineRule="auto" w:before="80" w:after="80"/>
-              <w:ind w:left="0"/>
-              <w:jc w:val="center"/>
-              <w:rPr>
-                <w:color w:val="000000"/>
-                <w:szCs w:val="24"/>
-                <w:lang w:val="en-ID"/>
-              </w:rPr>
-            </w:pPr>
-            <w:r/>
-            <w:r>
-              <w:drawing>
-                <wp:inline xmlns:a="http://schemas.openxmlformats.org/drawingml/2006/main" xmlns:pic="http://schemas.openxmlformats.org/drawingml/2006/picture">
-                  <wp:extent cx="4389120" cy="2265426"/>
-                  <wp:docPr id="2011434127" name="Picture 2011434127"/>
-                  <wp:cNvGraphicFramePr>
-                    <a:graphicFrameLocks noChangeAspect="1"/>
-                  </wp:cNvGraphicFramePr>
-                  <a:graphic>
-                    <a:graphicData uri="http://schemas.openxmlformats.org/drawingml/2006/picture">
-                      <pic:pic>
-                        <pic:nvPicPr>
-                          <pic:cNvPr id="0" name="53_dashboard_summary_cards_1781491979654.png"/>
-                          <pic:cNvPicPr/>
-                        </pic:nvPicPr>
-                        <pic:blipFill>
-                          <a:blip r:embed="rId42"/>
-                          <a:stretch>
-                            <a:fillRect/>
-                          </a:stretch>
-                        </pic:blipFill>
-                        <pic:spPr>
-                          <a:xfrm>
-                            <a:off x="0" y="0"/>
-                            <a:ext cx="4389120" cy="2265426"/>
                           </a:xfrm>
                           <a:prstGeom prst="rect"/>
                         </pic:spPr>

</xml_diff>